<commit_message>
Make all report outputs consistent: Inter + Volve palette
</commit_message>
<xml_diff>
--- a/docs/report-prototype/AI-Business-Audit-Premium-Report-Prototype.docx
+++ b/docs/report-prototype/AI-Business-Audit-Premium-Report-Prototype.docx
@@ -10,11 +10,11 @@
       </w:pPr>
       <w:r>
         <w:rPr>
-          <w:rFonts w:ascii="Aptos" w:hAnsi="Aptos"/>
+          <w:rFonts w:ascii="Inter" w:hAnsi="Inter"/>
           <w:b/>
           <w:i w:val="0"/>
           <w:caps/>
-          <w:color w:val="0B6655"/>
+          <w:color w:val="7A4F1E"/>
           <w:sz w:val="18"/>
         </w:rPr>
         <w:t>AI BUSINESS AUDIT</w:t>
@@ -28,11 +28,11 @@
       </w:pPr>
       <w:r>
         <w:rPr>
-          <w:rFonts w:ascii="Aptos" w:hAnsi="Aptos"/>
+          <w:rFonts w:ascii="Inter" w:hAnsi="Inter"/>
           <w:b/>
           <w:i w:val="0"/>
           <w:caps w:val="0"/>
-          <w:color w:val="08483D"/>
+          <w:color w:val="1C1410"/>
           <w:sz w:val="62"/>
         </w:rPr>
         <w:t>Revenue &amp; Operations</w:t>
@@ -48,11 +48,11 @@
       </w:pPr>
       <w:r>
         <w:rPr>
-          <w:rFonts w:ascii="Aptos" w:hAnsi="Aptos"/>
+          <w:rFonts w:ascii="Inter" w:hAnsi="Inter"/>
           <w:b w:val="0"/>
           <w:i w:val="0"/>
           <w:caps w:val="0"/>
-          <w:color w:val="5F6C68"/>
+          <w:color w:val="6B5E52"/>
           <w:sz w:val="28"/>
         </w:rPr>
         <w:t>A practical diagnosis of where leads, follow-up and operational capacity are leaking revenue.</w:t>
@@ -63,7 +63,7 @@
         <w:keepNext w:val="0"/>
         <w:spacing w:before="0" w:after="440" w:line="240" w:lineRule="auto"/>
         <w:pBdr>
-          <w:bottom w:val="single" w:sz="18" w:space="1" w:color="0B6655"/>
+          <w:bottom w:val="single" w:sz="18" w:space="1" w:color="7A4F1E"/>
         </w:pBdr>
       </w:pPr>
     </w:p>
@@ -75,11 +75,11 @@
       </w:pPr>
       <w:r>
         <w:rPr>
-          <w:rFonts w:ascii="Aptos" w:hAnsi="Aptos"/>
+          <w:rFonts w:ascii="Inter" w:hAnsi="Inter"/>
           <w:b/>
           <w:i w:val="0"/>
           <w:caps/>
-          <w:color w:val="5F6C68"/>
+          <w:color w:val="6B5E52"/>
           <w:sz w:val="16"/>
         </w:rPr>
         <w:t>PREPARED FOR</w:t>
@@ -93,11 +93,11 @@
       </w:pPr>
       <w:r>
         <w:rPr>
-          <w:rFonts w:ascii="Aptos" w:hAnsi="Aptos"/>
+          <w:rFonts w:ascii="Inter" w:hAnsi="Inter"/>
           <w:b/>
           <w:i w:val="0"/>
           <w:caps w:val="0"/>
-          <w:color w:val="18211F"/>
+          <w:color w:val="1C1410"/>
           <w:sz w:val="38"/>
         </w:rPr>
         <w:t>BrightSpark Electrical</w:t>
@@ -111,11 +111,11 @@
       </w:pPr>
       <w:r>
         <w:rPr>
-          <w:rFonts w:ascii="Aptos" w:hAnsi="Aptos"/>
+          <w:rFonts w:ascii="Inter" w:hAnsi="Inter"/>
           <w:b w:val="0"/>
           <w:i w:val="0"/>
           <w:caps w:val="0"/>
-          <w:color w:val="5F6C68"/>
+          <w:color w:val="6B5E52"/>
           <w:sz w:val="21"/>
         </w:rPr>
         <w:t>Electricians &amp; Small Electrical Contractors</w:t>
@@ -137,7 +137,7 @@
         <w:tc>
           <w:tcPr>
             <w:tcW w:type="dxa" w:w="3120"/>
-            <w:shd w:fill="08483D"/>
+            <w:shd w:fill="1C1410"/>
             <w:tcMar>
               <w:top w:w="150" w:type="dxa"/>
               <w:start w:w="130" w:type="dxa"/>
@@ -145,10 +145,10 @@
               <w:end w:w="130" w:type="dxa"/>
             </w:tcMar>
             <w:tcBorders>
-              <w:top w:val="single" w:sz="6" w:color="CBD5D1"/>
-              <w:left w:val="single" w:sz="6" w:color="CBD5D1"/>
-              <w:bottom w:val="single" w:sz="6" w:color="CBD5D1"/>
-              <w:right w:val="single" w:sz="6" w:color="CBD5D1"/>
+              <w:top w:val="single" w:sz="6" w:color="DDD5C8"/>
+              <w:left w:val="single" w:sz="6" w:color="DDD5C8"/>
+              <w:bottom w:val="single" w:sz="6" w:color="DDD5C8"/>
+              <w:right w:val="single" w:sz="6" w:color="DDD5C8"/>
             </w:tcBorders>
             <w:vAlign w:val="center"/>
           </w:tcPr>
@@ -160,11 +160,11 @@
             </w:pPr>
             <w:r>
               <w:rPr>
-                <w:rFonts w:ascii="Aptos" w:hAnsi="Aptos"/>
+                <w:rFonts w:ascii="Inter" w:hAnsi="Inter"/>
                 <w:b/>
                 <w:i w:val="0"/>
                 <w:caps w:val="0"/>
-                <w:color w:val="FFFFFF"/>
+                <w:color w:val="F9F6F1"/>
                 <w:sz w:val="38"/>
               </w:rPr>
               <w:t>6.2</w:t>
@@ -178,11 +178,11 @@
             </w:pPr>
             <w:r>
               <w:rPr>
-                <w:rFonts w:ascii="Aptos" w:hAnsi="Aptos"/>
+                <w:rFonts w:ascii="Inter" w:hAnsi="Inter"/>
                 <w:b/>
                 <w:i w:val="0"/>
                 <w:caps/>
-                <w:color w:val="FFFFFF"/>
+                <w:color w:val="F9F6F1"/>
                 <w:sz w:val="15"/>
               </w:rPr>
               <w:t>READINESS SCORE</w:t>
@@ -192,7 +192,7 @@
         <w:tc>
           <w:tcPr>
             <w:tcW w:type="dxa" w:w="3120"/>
-            <w:shd w:fill="F5F7F6"/>
+            <w:shd w:fill="F2EDE5"/>
             <w:tcMar>
               <w:top w:w="150" w:type="dxa"/>
               <w:start w:w="130" w:type="dxa"/>
@@ -200,10 +200,10 @@
               <w:end w:w="130" w:type="dxa"/>
             </w:tcMar>
             <w:tcBorders>
-              <w:top w:val="single" w:sz="6" w:color="CBD5D1"/>
-              <w:left w:val="single" w:sz="6" w:color="CBD5D1"/>
-              <w:bottom w:val="single" w:sz="6" w:color="CBD5D1"/>
-              <w:right w:val="single" w:sz="6" w:color="CBD5D1"/>
+              <w:top w:val="single" w:sz="6" w:color="DDD5C8"/>
+              <w:left w:val="single" w:sz="6" w:color="DDD5C8"/>
+              <w:bottom w:val="single" w:sz="6" w:color="DDD5C8"/>
+              <w:right w:val="single" w:sz="6" w:color="DDD5C8"/>
             </w:tcBorders>
             <w:vAlign w:val="center"/>
           </w:tcPr>
@@ -215,11 +215,11 @@
             </w:pPr>
             <w:r>
               <w:rPr>
-                <w:rFonts w:ascii="Aptos" w:hAnsi="Aptos"/>
+                <w:rFonts w:ascii="Inter" w:hAnsi="Inter"/>
                 <w:b/>
                 <w:i w:val="0"/>
                 <w:caps w:val="0"/>
-                <w:color w:val="08483D"/>
+                <w:color w:val="1C1410"/>
                 <w:sz w:val="38"/>
               </w:rPr>
               <w:t>3</w:t>
@@ -233,11 +233,11 @@
             </w:pPr>
             <w:r>
               <w:rPr>
-                <w:rFonts w:ascii="Aptos" w:hAnsi="Aptos"/>
+                <w:rFonts w:ascii="Inter" w:hAnsi="Inter"/>
                 <w:b/>
                 <w:i w:val="0"/>
                 <w:caps/>
-                <w:color w:val="5F6C68"/>
+                <w:color w:val="6B5E52"/>
                 <w:sz w:val="15"/>
               </w:rPr>
               <w:t>PRIORITY LEAKS</w:t>
@@ -247,7 +247,7 @@
         <w:tc>
           <w:tcPr>
             <w:tcW w:type="dxa" w:w="3120"/>
-            <w:shd w:fill="F5F7F6"/>
+            <w:shd w:fill="F2EDE5"/>
             <w:tcMar>
               <w:top w:w="150" w:type="dxa"/>
               <w:start w:w="130" w:type="dxa"/>
@@ -255,10 +255,10 @@
               <w:end w:w="130" w:type="dxa"/>
             </w:tcMar>
             <w:tcBorders>
-              <w:top w:val="single" w:sz="6" w:color="CBD5D1"/>
-              <w:left w:val="single" w:sz="6" w:color="CBD5D1"/>
-              <w:bottom w:val="single" w:sz="6" w:color="CBD5D1"/>
-              <w:right w:val="single" w:sz="6" w:color="CBD5D1"/>
+              <w:top w:val="single" w:sz="6" w:color="DDD5C8"/>
+              <w:left w:val="single" w:sz="6" w:color="DDD5C8"/>
+              <w:bottom w:val="single" w:sz="6" w:color="DDD5C8"/>
+              <w:right w:val="single" w:sz="6" w:color="DDD5C8"/>
             </w:tcBorders>
             <w:vAlign w:val="center"/>
           </w:tcPr>
@@ -270,11 +270,11 @@
             </w:pPr>
             <w:r>
               <w:rPr>
-                <w:rFonts w:ascii="Aptos" w:hAnsi="Aptos"/>
+                <w:rFonts w:ascii="Inter" w:hAnsi="Inter"/>
                 <w:b/>
                 <w:i w:val="0"/>
                 <w:caps w:val="0"/>
-                <w:color w:val="08483D"/>
+                <w:color w:val="1C1410"/>
                 <w:sz w:val="38"/>
               </w:rPr>
               <w:t>30 days</w:t>
@@ -288,11 +288,11 @@
             </w:pPr>
             <w:r>
               <w:rPr>
-                <w:rFonts w:ascii="Aptos" w:hAnsi="Aptos"/>
+                <w:rFonts w:ascii="Inter" w:hAnsi="Inter"/>
                 <w:b/>
                 <w:i w:val="0"/>
                 <w:caps/>
-                <w:color w:val="5F6C68"/>
+                <w:color w:val="6B5E52"/>
                 <w:sz w:val="15"/>
               </w:rPr>
               <w:t>FIRST ACTION HORIZON</w:t>
@@ -309,11 +309,11 @@
       </w:pPr>
       <w:r>
         <w:rPr>
-          <w:rFonts w:ascii="Aptos" w:hAnsi="Aptos"/>
+          <w:rFonts w:ascii="Inter" w:hAnsi="Inter"/>
           <w:b/>
           <w:i w:val="0"/>
           <w:caps/>
-          <w:color w:val="A46411"/>
+          <w:color w:val="C47B2E"/>
           <w:sz w:val="16"/>
         </w:rPr>
         <w:t>DESIGN PROTOTYPE</w:t>
@@ -327,11 +327,11 @@
       </w:pPr>
       <w:r>
         <w:rPr>
-          <w:rFonts w:ascii="Aptos" w:hAnsi="Aptos"/>
+          <w:rFonts w:ascii="Inter" w:hAnsi="Inter"/>
           <w:b w:val="0"/>
           <w:i/>
           <w:caps w:val="0"/>
-          <w:color w:val="5F6C68"/>
+          <w:color w:val="6B5E52"/>
           <w:sz w:val="17"/>
         </w:rPr>
         <w:t>Illustrative content only. Final reports are generated from the customer’s assessment evidence.</w:t>
@@ -350,11 +350,11 @@
       </w:pPr>
       <w:r>
         <w:rPr>
-          <w:rFonts w:ascii="Aptos" w:hAnsi="Aptos"/>
+          <w:rFonts w:ascii="Inter" w:hAnsi="Inter"/>
           <w:b/>
           <w:i w:val="0"/>
           <w:caps/>
-          <w:color w:val="0B6655"/>
+          <w:color w:val="7A4F1E"/>
           <w:sz w:val="17"/>
         </w:rPr>
         <w:t>01 | EXECUTIVE DIAGNOSIS</w:t>
@@ -368,11 +368,11 @@
       </w:pPr>
       <w:r>
         <w:rPr>
-          <w:rFonts w:ascii="Aptos" w:hAnsi="Aptos"/>
+          <w:rFonts w:ascii="Inter" w:hAnsi="Inter"/>
           <w:b/>
           <w:i w:val="0"/>
           <w:caps w:val="0"/>
-          <w:color w:val="08483D"/>
+          <w:color w:val="1C1410"/>
           <w:sz w:val="36"/>
         </w:rPr>
         <w:t>The business has demand. The leakage is happening after the enquiry arrives.</w:t>
@@ -386,11 +386,11 @@
       </w:pPr>
       <w:r>
         <w:rPr>
-          <w:rFonts w:ascii="Aptos" w:hAnsi="Aptos"/>
+          <w:rFonts w:ascii="Inter" w:hAnsi="Inter"/>
           <w:b w:val="0"/>
           <w:i w:val="0"/>
           <w:caps w:val="0"/>
-          <w:color w:val="18211F"/>
+          <w:color w:val="1C1410"/>
           <w:sz w:val="21"/>
         </w:rPr>
         <w:t>BrightSpark Electrical appears to have a healthy flow of referral and Google enquiries, but the current response and quote-follow-up process depends too heavily on whoever is available at the time. The result is not a lack of leads; it is inconsistent conversion of the leads already being paid for.</w:t>
@@ -410,7 +410,7 @@
         <w:tc>
           <w:tcPr>
             <w:tcW w:type="dxa" w:w="9360"/>
-            <w:shd w:fill="E8F2EF"/>
+            <w:shd w:fill="FDF4E7"/>
             <w:tcMar>
               <w:top w:w="200" w:type="dxa"/>
               <w:start w:w="220" w:type="dxa"/>
@@ -418,7 +418,7 @@
               <w:end w:w="220" w:type="dxa"/>
             </w:tcMar>
             <w:tcBorders>
-              <w:left w:val="single" w:sz="24" w:color="0B6655"/>
+              <w:left w:val="single" w:sz="24" w:color="7A4F1E"/>
             </w:tcBorders>
           </w:tcPr>
           <w:p>
@@ -428,11 +428,11 @@
             </w:pPr>
             <w:r>
               <w:rPr>
-                <w:rFonts w:ascii="Aptos" w:hAnsi="Aptos"/>
+                <w:rFonts w:ascii="Inter" w:hAnsi="Inter"/>
                 <w:b/>
                 <w:i w:val="0"/>
                 <w:caps/>
-                <w:color w:val="0B6655"/>
+                <w:color w:val="7A4F1E"/>
                 <w:sz w:val="16"/>
               </w:rPr>
               <w:t>HIGHEST-IMPACT ISSUE</w:t>
@@ -445,11 +445,11 @@
             </w:pPr>
             <w:r>
               <w:rPr>
-                <w:rFonts w:ascii="Aptos" w:hAnsi="Aptos"/>
+                <w:rFonts w:ascii="Inter" w:hAnsi="Inter"/>
                 <w:b/>
                 <w:i w:val="0"/>
                 <w:caps w:val="0"/>
-                <w:color w:val="18211F"/>
+                <w:color w:val="1C1410"/>
                 <w:sz w:val="28"/>
               </w:rPr>
               <w:t>Warm enquiries and issued quotes are not being followed through consistently.</w:t>
@@ -462,11 +462,11 @@
             </w:pPr>
             <w:r>
               <w:rPr>
-                <w:rFonts w:ascii="Aptos" w:hAnsi="Aptos"/>
+                <w:rFonts w:ascii="Inter" w:hAnsi="Inter"/>
                 <w:b w:val="0"/>
                 <w:i w:val="0"/>
                 <w:caps w:val="0"/>
-                <w:color w:val="5F6C68"/>
+                <w:color w:val="6B5E52"/>
                 <w:sz w:val="20"/>
               </w:rPr>
               <w:t>Missed calls are returned manually, quote reminders are not owned by one role, and there is no reliable view of how many opportunities go cold. This creates invisible revenue loss and makes marketing performance look weaker than it may actually be.</w:t>
@@ -483,11 +483,11 @@
       </w:pPr>
       <w:r>
         <w:rPr>
-          <w:rFonts w:ascii="Aptos" w:hAnsi="Aptos"/>
+          <w:rFonts w:ascii="Inter" w:hAnsi="Inter"/>
           <w:b/>
           <w:i w:val="0"/>
           <w:caps w:val="0"/>
-          <w:color w:val="0B6655"/>
+          <w:color w:val="7A4F1E"/>
           <w:sz w:val="27"/>
         </w:rPr>
         <w:t>What matters most now</w:t>
@@ -508,7 +508,7 @@
         <w:tc>
           <w:tcPr>
             <w:tcW w:type="dxa" w:w="720"/>
-            <w:shd w:fill="0B6655"/>
+            <w:shd w:fill="7A4F1E"/>
             <w:tcMar>
               <w:top w:w="120" w:type="dxa"/>
               <w:start w:w="150" w:type="dxa"/>
@@ -516,7 +516,7 @@
               <w:end w:w="150" w:type="dxa"/>
             </w:tcMar>
             <w:tcBorders>
-              <w:bottom w:val="single" w:sz="6" w:color="CBD5D1"/>
+              <w:bottom w:val="single" w:sz="6" w:color="DDD5C8"/>
             </w:tcBorders>
             <w:vAlign w:val="center"/>
           </w:tcPr>
@@ -528,11 +528,11 @@
             </w:pPr>
             <w:r>
               <w:rPr>
-                <w:rFonts w:ascii="Aptos" w:hAnsi="Aptos"/>
+                <w:rFonts w:ascii="Inter" w:hAnsi="Inter"/>
                 <w:b/>
                 <w:i w:val="0"/>
                 <w:caps w:val="0"/>
-                <w:color w:val="FFFFFF"/>
+                <w:color w:val="F9F6F1"/>
                 <w:sz w:val="28"/>
               </w:rPr>
               <w:t>1</w:t>
@@ -542,7 +542,7 @@
         <w:tc>
           <w:tcPr>
             <w:tcW w:type="dxa" w:w="8640"/>
-            <w:shd w:fill="F5F7F6"/>
+            <w:shd w:fill="F2EDE5"/>
             <w:tcMar>
               <w:top w:w="120" w:type="dxa"/>
               <w:start w:w="150" w:type="dxa"/>
@@ -550,7 +550,7 @@
               <w:end w:w="150" w:type="dxa"/>
             </w:tcMar>
             <w:tcBorders>
-              <w:bottom w:val="single" w:sz="6" w:color="CBD5D1"/>
+              <w:bottom w:val="single" w:sz="6" w:color="DDD5C8"/>
             </w:tcBorders>
             <w:vAlign w:val="center"/>
           </w:tcPr>
@@ -561,11 +561,11 @@
             </w:pPr>
             <w:r>
               <w:rPr>
-                <w:rFonts w:ascii="Aptos" w:hAnsi="Aptos"/>
+                <w:rFonts w:ascii="Inter" w:hAnsi="Inter"/>
                 <w:b/>
                 <w:i w:val="0"/>
                 <w:caps w:val="0"/>
-                <w:color w:val="18211F"/>
+                <w:color w:val="1C1410"/>
                 <w:sz w:val="21"/>
               </w:rPr>
               <w:t>Recover missed enquiries quickly</w:t>
@@ -578,11 +578,11 @@
             </w:pPr>
             <w:r>
               <w:rPr>
-                <w:rFonts w:ascii="Aptos" w:hAnsi="Aptos"/>
+                <w:rFonts w:ascii="Inter" w:hAnsi="Inter"/>
                 <w:b w:val="0"/>
                 <w:i w:val="0"/>
                 <w:caps w:val="0"/>
-                <w:color w:val="5F6C68"/>
+                <w:color w:val="6B5E52"/>
                 <w:sz w:val="19"/>
               </w:rPr>
               <w:t>Create an immediate text-back and clear callback ownership for calls that are not answered.</w:t>
@@ -611,7 +611,7 @@
         <w:tc>
           <w:tcPr>
             <w:tcW w:type="dxa" w:w="720"/>
-            <w:shd w:fill="0B6655"/>
+            <w:shd w:fill="7A4F1E"/>
             <w:tcMar>
               <w:top w:w="120" w:type="dxa"/>
               <w:start w:w="150" w:type="dxa"/>
@@ -619,7 +619,7 @@
               <w:end w:w="150" w:type="dxa"/>
             </w:tcMar>
             <w:tcBorders>
-              <w:bottom w:val="single" w:sz="6" w:color="CBD5D1"/>
+              <w:bottom w:val="single" w:sz="6" w:color="DDD5C8"/>
             </w:tcBorders>
             <w:vAlign w:val="center"/>
           </w:tcPr>
@@ -631,11 +631,11 @@
             </w:pPr>
             <w:r>
               <w:rPr>
-                <w:rFonts w:ascii="Aptos" w:hAnsi="Aptos"/>
+                <w:rFonts w:ascii="Inter" w:hAnsi="Inter"/>
                 <w:b/>
                 <w:i w:val="0"/>
                 <w:caps w:val="0"/>
-                <w:color w:val="FFFFFF"/>
+                <w:color w:val="F9F6F1"/>
                 <w:sz w:val="28"/>
               </w:rPr>
               <w:t>2</w:t>
@@ -645,7 +645,7 @@
         <w:tc>
           <w:tcPr>
             <w:tcW w:type="dxa" w:w="8640"/>
-            <w:shd w:fill="F5F7F6"/>
+            <w:shd w:fill="F2EDE5"/>
             <w:tcMar>
               <w:top w:w="120" w:type="dxa"/>
               <w:start w:w="150" w:type="dxa"/>
@@ -653,7 +653,7 @@
               <w:end w:w="150" w:type="dxa"/>
             </w:tcMar>
             <w:tcBorders>
-              <w:bottom w:val="single" w:sz="6" w:color="CBD5D1"/>
+              <w:bottom w:val="single" w:sz="6" w:color="DDD5C8"/>
             </w:tcBorders>
             <w:vAlign w:val="center"/>
           </w:tcPr>
@@ -664,11 +664,11 @@
             </w:pPr>
             <w:r>
               <w:rPr>
-                <w:rFonts w:ascii="Aptos" w:hAnsi="Aptos"/>
+                <w:rFonts w:ascii="Inter" w:hAnsi="Inter"/>
                 <w:b/>
                 <w:i w:val="0"/>
                 <w:caps w:val="0"/>
-                <w:color w:val="18211F"/>
+                <w:color w:val="1C1410"/>
                 <w:sz w:val="21"/>
               </w:rPr>
               <w:t>Make quote follow-up systematic</w:t>
@@ -681,11 +681,11 @@
             </w:pPr>
             <w:r>
               <w:rPr>
-                <w:rFonts w:ascii="Aptos" w:hAnsi="Aptos"/>
+                <w:rFonts w:ascii="Inter" w:hAnsi="Inter"/>
                 <w:b w:val="0"/>
                 <w:i w:val="0"/>
                 <w:caps w:val="0"/>
-                <w:color w:val="5F6C68"/>
+                <w:color w:val="6B5E52"/>
                 <w:sz w:val="19"/>
               </w:rPr>
               <w:t>Use a simple two-step follow-up sequence with visible status and a named owner.</w:t>
@@ -714,7 +714,7 @@
         <w:tc>
           <w:tcPr>
             <w:tcW w:type="dxa" w:w="720"/>
-            <w:shd w:fill="0B6655"/>
+            <w:shd w:fill="7A4F1E"/>
             <w:tcMar>
               <w:top w:w="120" w:type="dxa"/>
               <w:start w:w="150" w:type="dxa"/>
@@ -722,7 +722,7 @@
               <w:end w:w="150" w:type="dxa"/>
             </w:tcMar>
             <w:tcBorders>
-              <w:bottom w:val="single" w:sz="6" w:color="CBD5D1"/>
+              <w:bottom w:val="single" w:sz="6" w:color="DDD5C8"/>
             </w:tcBorders>
             <w:vAlign w:val="center"/>
           </w:tcPr>
@@ -734,11 +734,11 @@
             </w:pPr>
             <w:r>
               <w:rPr>
-                <w:rFonts w:ascii="Aptos" w:hAnsi="Aptos"/>
+                <w:rFonts w:ascii="Inter" w:hAnsi="Inter"/>
                 <w:b/>
                 <w:i w:val="0"/>
                 <w:caps w:val="0"/>
-                <w:color w:val="FFFFFF"/>
+                <w:color w:val="F9F6F1"/>
                 <w:sz w:val="28"/>
               </w:rPr>
               <w:t>3</w:t>
@@ -748,7 +748,7 @@
         <w:tc>
           <w:tcPr>
             <w:tcW w:type="dxa" w:w="8640"/>
-            <w:shd w:fill="F5F7F6"/>
+            <w:shd w:fill="F2EDE5"/>
             <w:tcMar>
               <w:top w:w="120" w:type="dxa"/>
               <w:start w:w="150" w:type="dxa"/>
@@ -756,7 +756,7 @@
               <w:end w:w="150" w:type="dxa"/>
             </w:tcMar>
             <w:tcBorders>
-              <w:bottom w:val="single" w:sz="6" w:color="CBD5D1"/>
+              <w:bottom w:val="single" w:sz="6" w:color="DDD5C8"/>
             </w:tcBorders>
             <w:vAlign w:val="center"/>
           </w:tcPr>
@@ -767,11 +767,11 @@
             </w:pPr>
             <w:r>
               <w:rPr>
-                <w:rFonts w:ascii="Aptos" w:hAnsi="Aptos"/>
+                <w:rFonts w:ascii="Inter" w:hAnsi="Inter"/>
                 <w:b/>
                 <w:i w:val="0"/>
                 <w:caps w:val="0"/>
-                <w:color w:val="18211F"/>
+                <w:color w:val="1C1410"/>
                 <w:sz w:val="21"/>
               </w:rPr>
               <w:t>Close the loop after completed work</w:t>
@@ -784,11 +784,11 @@
             </w:pPr>
             <w:r>
               <w:rPr>
-                <w:rFonts w:ascii="Aptos" w:hAnsi="Aptos"/>
+                <w:rFonts w:ascii="Inter" w:hAnsi="Inter"/>
                 <w:b w:val="0"/>
                 <w:i w:val="0"/>
                 <w:caps w:val="0"/>
-                <w:color w:val="5F6C68"/>
+                <w:color w:val="6B5E52"/>
                 <w:sz w:val="19"/>
               </w:rPr>
               <w:t>Trigger review requests and next-step prompts while customer satisfaction is highest.</w:t>
@@ -810,11 +810,11 @@
       </w:pPr>
       <w:r>
         <w:rPr>
-          <w:rFonts w:ascii="Aptos" w:hAnsi="Aptos"/>
+          <w:rFonts w:ascii="Inter" w:hAnsi="Inter"/>
           <w:b/>
           <w:i w:val="0"/>
           <w:caps w:val="0"/>
-          <w:color w:val="0B6655"/>
+          <w:color w:val="7A4F1E"/>
           <w:sz w:val="27"/>
         </w:rPr>
         <w:t>Assessment confidence</w:t>
@@ -828,11 +828,11 @@
       </w:pPr>
       <w:r>
         <w:rPr>
-          <w:rFonts w:ascii="Aptos" w:hAnsi="Aptos"/>
+          <w:rFonts w:ascii="Inter" w:hAnsi="Inter"/>
           <w:b w:val="0"/>
           <w:i w:val="0"/>
           <w:caps w:val="0"/>
-          <w:color w:val="18211F"/>
+          <w:color w:val="1C1410"/>
           <w:sz w:val="21"/>
         </w:rPr>
         <w:t>High. The priority issues are specific, commercially relevant, and can be improved without replacing the entire software stack.</w:t>
@@ -851,11 +851,11 @@
       </w:pPr>
       <w:r>
         <w:rPr>
-          <w:rFonts w:ascii="Aptos" w:hAnsi="Aptos"/>
+          <w:rFonts w:ascii="Inter" w:hAnsi="Inter"/>
           <w:b/>
           <w:i w:val="0"/>
           <w:caps/>
-          <w:color w:val="0B6655"/>
+          <w:color w:val="7A4F1E"/>
           <w:sz w:val="17"/>
         </w:rPr>
         <w:t>02 | READINESS PROFILE</w:t>
@@ -869,11 +869,11 @@
       </w:pPr>
       <w:r>
         <w:rPr>
-          <w:rFonts w:ascii="Aptos" w:hAnsi="Aptos"/>
+          <w:rFonts w:ascii="Inter" w:hAnsi="Inter"/>
           <w:b/>
           <w:i w:val="0"/>
           <w:caps w:val="0"/>
-          <w:color w:val="08483D"/>
+          <w:color w:val="1C1410"/>
           <w:sz w:val="36"/>
         </w:rPr>
         <w:t>A capable business with inconsistent commercial follow-through</w:t>
@@ -897,7 +897,7 @@
         <w:tc>
           <w:tcPr>
             <w:tcW w:type="dxa" w:w="1872"/>
-            <w:shd w:fill="08483D"/>
+            <w:shd w:fill="1C1410"/>
             <w:tcMar>
               <w:top w:w="150" w:type="dxa"/>
               <w:start w:w="130" w:type="dxa"/>
@@ -905,10 +905,10 @@
               <w:end w:w="130" w:type="dxa"/>
             </w:tcMar>
             <w:tcBorders>
-              <w:top w:val="single" w:sz="6" w:color="CBD5D1"/>
-              <w:left w:val="single" w:sz="6" w:color="CBD5D1"/>
-              <w:bottom w:val="single" w:sz="6" w:color="CBD5D1"/>
-              <w:right w:val="single" w:sz="6" w:color="CBD5D1"/>
+              <w:top w:val="single" w:sz="6" w:color="DDD5C8"/>
+              <w:left w:val="single" w:sz="6" w:color="DDD5C8"/>
+              <w:bottom w:val="single" w:sz="6" w:color="DDD5C8"/>
+              <w:right w:val="single" w:sz="6" w:color="DDD5C8"/>
             </w:tcBorders>
             <w:vAlign w:val="center"/>
           </w:tcPr>
@@ -920,11 +920,11 @@
             </w:pPr>
             <w:r>
               <w:rPr>
-                <w:rFonts w:ascii="Aptos" w:hAnsi="Aptos"/>
+                <w:rFonts w:ascii="Inter" w:hAnsi="Inter"/>
                 <w:b/>
                 <w:i w:val="0"/>
                 <w:caps w:val="0"/>
-                <w:color w:val="FFFFFF"/>
+                <w:color w:val="F9F6F1"/>
                 <w:sz w:val="38"/>
               </w:rPr>
               <w:t>6.2</w:t>
@@ -938,11 +938,11 @@
             </w:pPr>
             <w:r>
               <w:rPr>
-                <w:rFonts w:ascii="Aptos" w:hAnsi="Aptos"/>
+                <w:rFonts w:ascii="Inter" w:hAnsi="Inter"/>
                 <w:b/>
                 <w:i w:val="0"/>
                 <w:caps/>
-                <w:color w:val="FFFFFF"/>
+                <w:color w:val="F9F6F1"/>
                 <w:sz w:val="15"/>
               </w:rPr>
               <w:t>OVERALL</w:t>
@@ -952,7 +952,7 @@
         <w:tc>
           <w:tcPr>
             <w:tcW w:type="dxa" w:w="1872"/>
-            <w:shd w:fill="F5F7F6"/>
+            <w:shd w:fill="F2EDE5"/>
             <w:tcMar>
               <w:top w:w="150" w:type="dxa"/>
               <w:start w:w="130" w:type="dxa"/>
@@ -960,10 +960,10 @@
               <w:end w:w="130" w:type="dxa"/>
             </w:tcMar>
             <w:tcBorders>
-              <w:top w:val="single" w:sz="6" w:color="CBD5D1"/>
-              <w:left w:val="single" w:sz="6" w:color="CBD5D1"/>
-              <w:bottom w:val="single" w:sz="6" w:color="CBD5D1"/>
-              <w:right w:val="single" w:sz="6" w:color="CBD5D1"/>
+              <w:top w:val="single" w:sz="6" w:color="DDD5C8"/>
+              <w:left w:val="single" w:sz="6" w:color="DDD5C8"/>
+              <w:bottom w:val="single" w:sz="6" w:color="DDD5C8"/>
+              <w:right w:val="single" w:sz="6" w:color="DDD5C8"/>
             </w:tcBorders>
             <w:vAlign w:val="center"/>
           </w:tcPr>
@@ -975,11 +975,11 @@
             </w:pPr>
             <w:r>
               <w:rPr>
-                <w:rFonts w:ascii="Aptos" w:hAnsi="Aptos"/>
+                <w:rFonts w:ascii="Inter" w:hAnsi="Inter"/>
                 <w:b/>
                 <w:i w:val="0"/>
                 <w:caps w:val="0"/>
-                <w:color w:val="08483D"/>
+                <w:color w:val="1C1410"/>
                 <w:sz w:val="38"/>
               </w:rPr>
               <w:t>5</w:t>
@@ -993,11 +993,11 @@
             </w:pPr>
             <w:r>
               <w:rPr>
-                <w:rFonts w:ascii="Aptos" w:hAnsi="Aptos"/>
+                <w:rFonts w:ascii="Inter" w:hAnsi="Inter"/>
                 <w:b/>
                 <w:i w:val="0"/>
                 <w:caps/>
-                <w:color w:val="5F6C68"/>
+                <w:color w:val="6B5E52"/>
                 <w:sz w:val="15"/>
               </w:rPr>
               <w:t>LEAD RESPONSE</w:t>
@@ -1007,7 +1007,7 @@
         <w:tc>
           <w:tcPr>
             <w:tcW w:type="dxa" w:w="1872"/>
-            <w:shd w:fill="F5F7F6"/>
+            <w:shd w:fill="F2EDE5"/>
             <w:tcMar>
               <w:top w:w="150" w:type="dxa"/>
               <w:start w:w="130" w:type="dxa"/>
@@ -1015,10 +1015,10 @@
               <w:end w:w="130" w:type="dxa"/>
             </w:tcMar>
             <w:tcBorders>
-              <w:top w:val="single" w:sz="6" w:color="CBD5D1"/>
-              <w:left w:val="single" w:sz="6" w:color="CBD5D1"/>
-              <w:bottom w:val="single" w:sz="6" w:color="CBD5D1"/>
-              <w:right w:val="single" w:sz="6" w:color="CBD5D1"/>
+              <w:top w:val="single" w:sz="6" w:color="DDD5C8"/>
+              <w:left w:val="single" w:sz="6" w:color="DDD5C8"/>
+              <w:bottom w:val="single" w:sz="6" w:color="DDD5C8"/>
+              <w:right w:val="single" w:sz="6" w:color="DDD5C8"/>
             </w:tcBorders>
             <w:vAlign w:val="center"/>
           </w:tcPr>
@@ -1030,11 +1030,11 @@
             </w:pPr>
             <w:r>
               <w:rPr>
-                <w:rFonts w:ascii="Aptos" w:hAnsi="Aptos"/>
+                <w:rFonts w:ascii="Inter" w:hAnsi="Inter"/>
                 <w:b/>
                 <w:i w:val="0"/>
                 <w:caps w:val="0"/>
-                <w:color w:val="08483D"/>
+                <w:color w:val="1C1410"/>
                 <w:sz w:val="38"/>
               </w:rPr>
               <w:t>4</w:t>
@@ -1048,11 +1048,11 @@
             </w:pPr>
             <w:r>
               <w:rPr>
-                <w:rFonts w:ascii="Aptos" w:hAnsi="Aptos"/>
+                <w:rFonts w:ascii="Inter" w:hAnsi="Inter"/>
                 <w:b/>
                 <w:i w:val="0"/>
                 <w:caps/>
-                <w:color w:val="5F6C68"/>
+                <w:color w:val="6B5E52"/>
                 <w:sz w:val="15"/>
               </w:rPr>
               <w:t>FOLLOW-UP</w:t>
@@ -1062,7 +1062,7 @@
         <w:tc>
           <w:tcPr>
             <w:tcW w:type="dxa" w:w="1872"/>
-            <w:shd w:fill="F5F7F6"/>
+            <w:shd w:fill="F2EDE5"/>
             <w:tcMar>
               <w:top w:w="150" w:type="dxa"/>
               <w:start w:w="130" w:type="dxa"/>
@@ -1070,10 +1070,10 @@
               <w:end w:w="130" w:type="dxa"/>
             </w:tcMar>
             <w:tcBorders>
-              <w:top w:val="single" w:sz="6" w:color="CBD5D1"/>
-              <w:left w:val="single" w:sz="6" w:color="CBD5D1"/>
-              <w:bottom w:val="single" w:sz="6" w:color="CBD5D1"/>
-              <w:right w:val="single" w:sz="6" w:color="CBD5D1"/>
+              <w:top w:val="single" w:sz="6" w:color="DDD5C8"/>
+              <w:left w:val="single" w:sz="6" w:color="DDD5C8"/>
+              <w:bottom w:val="single" w:sz="6" w:color="DDD5C8"/>
+              <w:right w:val="single" w:sz="6" w:color="DDD5C8"/>
             </w:tcBorders>
             <w:vAlign w:val="center"/>
           </w:tcPr>
@@ -1085,11 +1085,11 @@
             </w:pPr>
             <w:r>
               <w:rPr>
-                <w:rFonts w:ascii="Aptos" w:hAnsi="Aptos"/>
+                <w:rFonts w:ascii="Inter" w:hAnsi="Inter"/>
                 <w:b/>
                 <w:i w:val="0"/>
                 <w:caps w:val="0"/>
-                <w:color w:val="08483D"/>
+                <w:color w:val="1C1410"/>
                 <w:sz w:val="38"/>
               </w:rPr>
               <w:t>7</w:t>
@@ -1103,11 +1103,11 @@
             </w:pPr>
             <w:r>
               <w:rPr>
-                <w:rFonts w:ascii="Aptos" w:hAnsi="Aptos"/>
+                <w:rFonts w:ascii="Inter" w:hAnsi="Inter"/>
                 <w:b/>
                 <w:i w:val="0"/>
                 <w:caps/>
-                <w:color w:val="5F6C68"/>
+                <w:color w:val="6B5E52"/>
                 <w:sz w:val="15"/>
               </w:rPr>
               <w:t>PROCESS CLARITY</w:t>
@@ -1117,7 +1117,7 @@
         <w:tc>
           <w:tcPr>
             <w:tcW w:type="dxa" w:w="1872"/>
-            <w:shd w:fill="F5F7F6"/>
+            <w:shd w:fill="F2EDE5"/>
             <w:tcMar>
               <w:top w:w="150" w:type="dxa"/>
               <w:start w:w="130" w:type="dxa"/>
@@ -1125,10 +1125,10 @@
               <w:end w:w="130" w:type="dxa"/>
             </w:tcMar>
             <w:tcBorders>
-              <w:top w:val="single" w:sz="6" w:color="CBD5D1"/>
-              <w:left w:val="single" w:sz="6" w:color="CBD5D1"/>
-              <w:bottom w:val="single" w:sz="6" w:color="CBD5D1"/>
-              <w:right w:val="single" w:sz="6" w:color="CBD5D1"/>
+              <w:top w:val="single" w:sz="6" w:color="DDD5C8"/>
+              <w:left w:val="single" w:sz="6" w:color="DDD5C8"/>
+              <w:bottom w:val="single" w:sz="6" w:color="DDD5C8"/>
+              <w:right w:val="single" w:sz="6" w:color="DDD5C8"/>
             </w:tcBorders>
             <w:vAlign w:val="center"/>
           </w:tcPr>
@@ -1140,11 +1140,11 @@
             </w:pPr>
             <w:r>
               <w:rPr>
-                <w:rFonts w:ascii="Aptos" w:hAnsi="Aptos"/>
+                <w:rFonts w:ascii="Inter" w:hAnsi="Inter"/>
                 <w:b/>
                 <w:i w:val="0"/>
                 <w:caps w:val="0"/>
-                <w:color w:val="08483D"/>
+                <w:color w:val="1C1410"/>
                 <w:sz w:val="38"/>
               </w:rPr>
               <w:t>7</w:t>
@@ -1158,11 +1158,11 @@
             </w:pPr>
             <w:r>
               <w:rPr>
-                <w:rFonts w:ascii="Aptos" w:hAnsi="Aptos"/>
+                <w:rFonts w:ascii="Inter" w:hAnsi="Inter"/>
                 <w:b/>
                 <w:i w:val="0"/>
                 <w:caps/>
-                <w:color w:val="5F6C68"/>
+                <w:color w:val="6B5E52"/>
                 <w:sz w:val="15"/>
               </w:rPr>
               <w:t>CUSTOMER EXPERIENCE</w:t>
@@ -1179,11 +1179,11 @@
       </w:pPr>
       <w:r>
         <w:rPr>
-          <w:rFonts w:ascii="Aptos" w:hAnsi="Aptos"/>
+          <w:rFonts w:ascii="Inter" w:hAnsi="Inter"/>
           <w:b/>
           <w:i w:val="0"/>
           <w:caps w:val="0"/>
-          <w:color w:val="0B6655"/>
+          <w:color w:val="7A4F1E"/>
           <w:sz w:val="27"/>
         </w:rPr>
         <w:t>Where the business is already strong</w:t>
@@ -1198,11 +1198,11 @@
       </w:pPr>
       <w:r>
         <w:rPr>
-          <w:rFonts w:ascii="Aptos" w:hAnsi="Aptos"/>
+          <w:rFonts w:ascii="Inter" w:hAnsi="Inter"/>
           <w:b w:val="0"/>
           <w:i w:val="0"/>
           <w:caps w:val="0"/>
-          <w:color w:val="18211F"/>
+          <w:color w:val="1C1410"/>
           <w:sz w:val="20"/>
         </w:rPr>
         <w:t>A clear service offer and strong local reputation create genuine enquiry demand.</w:t>
@@ -1217,11 +1217,11 @@
       </w:pPr>
       <w:r>
         <w:rPr>
-          <w:rFonts w:ascii="Aptos" w:hAnsi="Aptos"/>
+          <w:rFonts w:ascii="Inter" w:hAnsi="Inter"/>
           <w:b w:val="0"/>
           <w:i w:val="0"/>
           <w:caps w:val="0"/>
-          <w:color w:val="18211F"/>
+          <w:color w:val="1C1410"/>
           <w:sz w:val="20"/>
         </w:rPr>
         <w:t>The team uses established job-management and accounting tools rather than relying entirely on paper.</w:t>
@@ -1236,11 +1236,11 @@
       </w:pPr>
       <w:r>
         <w:rPr>
-          <w:rFonts w:ascii="Aptos" w:hAnsi="Aptos"/>
+          <w:rFonts w:ascii="Inter" w:hAnsi="Inter"/>
           <w:b w:val="0"/>
           <w:i w:val="0"/>
           <w:caps w:val="0"/>
-          <w:color w:val="18211F"/>
+          <w:color w:val="1C1410"/>
           <w:sz w:val="20"/>
         </w:rPr>
         <w:t>Customers receive competent service once a job is booked and allocated.</w:t>
@@ -1254,11 +1254,11 @@
       </w:pPr>
       <w:r>
         <w:rPr>
-          <w:rFonts w:ascii="Aptos" w:hAnsi="Aptos"/>
+          <w:rFonts w:ascii="Inter" w:hAnsi="Inter"/>
           <w:b/>
           <w:i w:val="0"/>
           <w:caps w:val="0"/>
-          <w:color w:val="0B6655"/>
+          <w:color w:val="7A4F1E"/>
           <w:sz w:val="27"/>
         </w:rPr>
         <w:t>Where revenue is most exposed</w:t>
@@ -1273,11 +1273,11 @@
       </w:pPr>
       <w:r>
         <w:rPr>
-          <w:rFonts w:ascii="Aptos" w:hAnsi="Aptos"/>
+          <w:rFonts w:ascii="Inter" w:hAnsi="Inter"/>
           <w:b w:val="0"/>
           <w:i w:val="0"/>
           <w:caps w:val="0"/>
-          <w:color w:val="18211F"/>
+          <w:color w:val="1C1410"/>
           <w:sz w:val="20"/>
         </w:rPr>
         <w:t>After-hours and busy-period calls rely on manual callbacks, with no immediate acknowledgement to the customer.</w:t>
@@ -1292,11 +1292,11 @@
       </w:pPr>
       <w:r>
         <w:rPr>
-          <w:rFonts w:ascii="Aptos" w:hAnsi="Aptos"/>
+          <w:rFonts w:ascii="Inter" w:hAnsi="Inter"/>
           <w:b w:val="0"/>
           <w:i w:val="0"/>
           <w:caps w:val="0"/>
-          <w:color w:val="18211F"/>
+          <w:color w:val="1C1410"/>
           <w:sz w:val="20"/>
         </w:rPr>
         <w:t>Quote follow-up varies by staff member and is not measured as a conversion stage.</w:t>
@@ -1311,11 +1311,11 @@
       </w:pPr>
       <w:r>
         <w:rPr>
-          <w:rFonts w:ascii="Aptos" w:hAnsi="Aptos"/>
+          <w:rFonts w:ascii="Inter" w:hAnsi="Inter"/>
           <w:b w:val="0"/>
           <w:i w:val="0"/>
           <w:caps w:val="0"/>
-          <w:color w:val="18211F"/>
+          <w:color w:val="1C1410"/>
           <w:sz w:val="20"/>
         </w:rPr>
         <w:t>Review requests and future-work prompts happen inconsistently after completed jobs.</w:t>
@@ -1335,7 +1335,7 @@
         <w:tc>
           <w:tcPr>
             <w:tcW w:type="dxa" w:w="9360"/>
-            <w:shd w:fill="F7EEDF"/>
+            <w:shd w:fill="FDF4E7"/>
             <w:tcMar>
               <w:top w:w="200" w:type="dxa"/>
               <w:start w:w="220" w:type="dxa"/>
@@ -1343,7 +1343,7 @@
               <w:end w:w="220" w:type="dxa"/>
             </w:tcMar>
             <w:tcBorders>
-              <w:left w:val="single" w:sz="24" w:color="A46411"/>
+              <w:left w:val="single" w:sz="24" w:color="C47B2E"/>
             </w:tcBorders>
           </w:tcPr>
           <w:p>
@@ -1353,11 +1353,11 @@
             </w:pPr>
             <w:r>
               <w:rPr>
-                <w:rFonts w:ascii="Aptos" w:hAnsi="Aptos"/>
+                <w:rFonts w:ascii="Inter" w:hAnsi="Inter"/>
                 <w:b/>
                 <w:i w:val="0"/>
                 <w:caps/>
-                <w:color w:val="A46411"/>
+                <w:color w:val="C47B2E"/>
                 <w:sz w:val="16"/>
               </w:rPr>
               <w:t>COMMERCIAL INTERPRETATION</w:t>
@@ -1370,11 +1370,11 @@
             </w:pPr>
             <w:r>
               <w:rPr>
-                <w:rFonts w:ascii="Aptos" w:hAnsi="Aptos"/>
+                <w:rFonts w:ascii="Inter" w:hAnsi="Inter"/>
                 <w:b/>
                 <w:i w:val="0"/>
                 <w:caps w:val="0"/>
-                <w:color w:val="18211F"/>
+                <w:color w:val="1C1410"/>
                 <w:sz w:val="28"/>
               </w:rPr>
               <w:t>The first investment should improve conversion, not generate more traffic.</w:t>
@@ -1387,11 +1387,11 @@
             </w:pPr>
             <w:r>
               <w:rPr>
-                <w:rFonts w:ascii="Aptos" w:hAnsi="Aptos"/>
+                <w:rFonts w:ascii="Inter" w:hAnsi="Inter"/>
                 <w:b w:val="0"/>
                 <w:i w:val="0"/>
                 <w:caps w:val="0"/>
-                <w:color w:val="5F6C68"/>
+                <w:color w:val="6B5E52"/>
                 <w:sz w:val="20"/>
               </w:rPr>
               <w:t>Until missed calls and quotes are followed through consistently, increasing ad spend risks feeding more opportunities into the same leakage points.</w:t>
@@ -1413,11 +1413,11 @@
       </w:pPr>
       <w:r>
         <w:rPr>
-          <w:rFonts w:ascii="Aptos" w:hAnsi="Aptos"/>
+          <w:rFonts w:ascii="Inter" w:hAnsi="Inter"/>
           <w:b/>
           <w:i w:val="0"/>
           <w:caps/>
-          <w:color w:val="0B6655"/>
+          <w:color w:val="7A4F1E"/>
           <w:sz w:val="17"/>
         </w:rPr>
         <w:t>03 | DIAGNOSTIC FINDINGS</w:t>
@@ -1431,11 +1431,11 @@
       </w:pPr>
       <w:r>
         <w:rPr>
-          <w:rFonts w:ascii="Aptos" w:hAnsi="Aptos"/>
+          <w:rFonts w:ascii="Inter" w:hAnsi="Inter"/>
           <w:b/>
           <w:i w:val="0"/>
           <w:caps w:val="0"/>
-          <w:color w:val="08483D"/>
+          <w:color w:val="1C1410"/>
           <w:sz w:val="36"/>
         </w:rPr>
         <w:t>Evidence-backed issues, ordered by commercial impact</w:t>
@@ -1456,7 +1456,7 @@
         <w:tc>
           <w:tcPr>
             <w:tcW w:type="dxa" w:w="1540"/>
-            <w:shd w:fill="9C3630"/>
+            <w:shd w:fill="A43B35"/>
             <w:tcMar>
               <w:top w:w="150" w:type="dxa"/>
               <w:start w:w="160" w:type="dxa"/>
@@ -1464,7 +1464,7 @@
               <w:end w:w="160" w:type="dxa"/>
             </w:tcMar>
             <w:tcBorders>
-              <w:bottom w:val="single" w:sz="6" w:color="CBD5D1"/>
+              <w:bottom w:val="single" w:sz="6" w:color="DDD5C8"/>
             </w:tcBorders>
             <w:vAlign w:val="center"/>
           </w:tcPr>
@@ -1476,11 +1476,11 @@
             </w:pPr>
             <w:r>
               <w:rPr>
-                <w:rFonts w:ascii="Aptos" w:hAnsi="Aptos"/>
+                <w:rFonts w:ascii="Inter" w:hAnsi="Inter"/>
                 <w:b/>
                 <w:i w:val="0"/>
                 <w:caps/>
-                <w:color w:val="FFFFFF"/>
+                <w:color w:val="F9F6F1"/>
                 <w:sz w:val="18"/>
               </w:rPr>
               <w:t>RED</w:t>
@@ -1490,7 +1490,7 @@
         <w:tc>
           <w:tcPr>
             <w:tcW w:type="dxa" w:w="7820"/>
-            <w:shd w:fill="F8E8E6"/>
+            <w:shd w:fill="F9E8E6"/>
             <w:tcMar>
               <w:top w:w="150" w:type="dxa"/>
               <w:start w:w="160" w:type="dxa"/>
@@ -1498,7 +1498,7 @@
               <w:end w:w="160" w:type="dxa"/>
             </w:tcMar>
             <w:tcBorders>
-              <w:bottom w:val="single" w:sz="6" w:color="CBD5D1"/>
+              <w:bottom w:val="single" w:sz="6" w:color="DDD5C8"/>
             </w:tcBorders>
             <w:vAlign w:val="center"/>
           </w:tcPr>
@@ -1509,11 +1509,11 @@
             </w:pPr>
             <w:r>
               <w:rPr>
-                <w:rFonts w:ascii="Aptos" w:hAnsi="Aptos"/>
+                <w:rFonts w:ascii="Inter" w:hAnsi="Inter"/>
                 <w:b/>
                 <w:i w:val="0"/>
                 <w:caps w:val="0"/>
-                <w:color w:val="18211F"/>
+                <w:color w:val="1C1410"/>
                 <w:sz w:val="23"/>
               </w:rPr>
               <w:t>Lead response</w:t>
@@ -1526,22 +1526,22 @@
             </w:pPr>
             <w:r>
               <w:rPr>
-                <w:rFonts w:ascii="Aptos" w:hAnsi="Aptos"/>
+                <w:rFonts w:ascii="Inter" w:hAnsi="Inter"/>
                 <w:b/>
                 <w:i w:val="0"/>
                 <w:caps w:val="0"/>
-                <w:color w:val="18211F"/>
+                <w:color w:val="1C1410"/>
                 <w:sz w:val="19"/>
               </w:rPr>
               <w:t xml:space="preserve">Current state: </w:t>
             </w:r>
             <w:r>
               <w:rPr>
-                <w:rFonts w:ascii="Aptos" w:hAnsi="Aptos"/>
+                <w:rFonts w:ascii="Inter" w:hAnsi="Inter"/>
                 <w:b w:val="0"/>
                 <w:i w:val="0"/>
                 <w:caps w:val="0"/>
-                <w:color w:val="5F6C68"/>
+                <w:color w:val="6B5E52"/>
                 <w:sz w:val="19"/>
               </w:rPr>
               <w:t>After-hours and overflow handling is reactive. The owner or office team returns calls when capacity allows.</w:t>
@@ -1554,22 +1554,22 @@
             </w:pPr>
             <w:r>
               <w:rPr>
-                <w:rFonts w:ascii="Aptos" w:hAnsi="Aptos"/>
+                <w:rFonts w:ascii="Inter" w:hAnsi="Inter"/>
                 <w:b/>
                 <w:i w:val="0"/>
                 <w:caps w:val="0"/>
-                <w:color w:val="18211F"/>
+                <w:color w:val="1C1410"/>
                 <w:sz w:val="19"/>
               </w:rPr>
               <w:t xml:space="preserve">Likely impact: </w:t>
             </w:r>
             <w:r>
               <w:rPr>
-                <w:rFonts w:ascii="Aptos" w:hAnsi="Aptos"/>
+                <w:rFonts w:ascii="Inter" w:hAnsi="Inter"/>
                 <w:b w:val="0"/>
                 <w:i w:val="0"/>
                 <w:caps w:val="0"/>
-                <w:color w:val="5F6C68"/>
+                <w:color w:val="6B5E52"/>
                 <w:sz w:val="19"/>
               </w:rPr>
               <w:t>Urgent customers often call the next electrician quickly. Even a modest number of unrecovered calls can represent significant lost job value.</w:t>
@@ -1582,22 +1582,22 @@
             </w:pPr>
             <w:r>
               <w:rPr>
-                <w:rFonts w:ascii="Aptos" w:hAnsi="Aptos"/>
+                <w:rFonts w:ascii="Inter" w:hAnsi="Inter"/>
                 <w:b/>
                 <w:i w:val="0"/>
                 <w:caps w:val="0"/>
-                <w:color w:val="18211F"/>
+                <w:color w:val="1C1410"/>
                 <w:sz w:val="19"/>
               </w:rPr>
               <w:t xml:space="preserve">Fastest win: </w:t>
             </w:r>
             <w:r>
               <w:rPr>
-                <w:rFonts w:ascii="Aptos" w:hAnsi="Aptos"/>
+                <w:rFonts w:ascii="Inter" w:hAnsi="Inter"/>
                 <w:b w:val="0"/>
                 <w:i w:val="0"/>
                 <w:caps w:val="0"/>
-                <w:color w:val="5F6C68"/>
+                <w:color w:val="6B5E52"/>
                 <w:sz w:val="19"/>
               </w:rPr>
               <w:t>Send an immediate branded text acknowledgement and assign callback ownership.</w:t>
@@ -1626,7 +1626,7 @@
         <w:tc>
           <w:tcPr>
             <w:tcW w:type="dxa" w:w="1540"/>
-            <w:shd w:fill="9C3630"/>
+            <w:shd w:fill="A43B35"/>
             <w:tcMar>
               <w:top w:w="150" w:type="dxa"/>
               <w:start w:w="160" w:type="dxa"/>
@@ -1634,7 +1634,7 @@
               <w:end w:w="160" w:type="dxa"/>
             </w:tcMar>
             <w:tcBorders>
-              <w:bottom w:val="single" w:sz="6" w:color="CBD5D1"/>
+              <w:bottom w:val="single" w:sz="6" w:color="DDD5C8"/>
             </w:tcBorders>
             <w:vAlign w:val="center"/>
           </w:tcPr>
@@ -1646,11 +1646,11 @@
             </w:pPr>
             <w:r>
               <w:rPr>
-                <w:rFonts w:ascii="Aptos" w:hAnsi="Aptos"/>
+                <w:rFonts w:ascii="Inter" w:hAnsi="Inter"/>
                 <w:b/>
                 <w:i w:val="0"/>
                 <w:caps/>
-                <w:color w:val="FFFFFF"/>
+                <w:color w:val="F9F6F1"/>
                 <w:sz w:val="18"/>
               </w:rPr>
               <w:t>RED</w:t>
@@ -1660,7 +1660,7 @@
         <w:tc>
           <w:tcPr>
             <w:tcW w:type="dxa" w:w="7820"/>
-            <w:shd w:fill="F8E8E6"/>
+            <w:shd w:fill="F9E8E6"/>
             <w:tcMar>
               <w:top w:w="150" w:type="dxa"/>
               <w:start w:w="160" w:type="dxa"/>
@@ -1668,7 +1668,7 @@
               <w:end w:w="160" w:type="dxa"/>
             </w:tcMar>
             <w:tcBorders>
-              <w:bottom w:val="single" w:sz="6" w:color="CBD5D1"/>
+              <w:bottom w:val="single" w:sz="6" w:color="DDD5C8"/>
             </w:tcBorders>
             <w:vAlign w:val="center"/>
           </w:tcPr>
@@ -1679,11 +1679,11 @@
             </w:pPr>
             <w:r>
               <w:rPr>
-                <w:rFonts w:ascii="Aptos" w:hAnsi="Aptos"/>
+                <w:rFonts w:ascii="Inter" w:hAnsi="Inter"/>
                 <w:b/>
                 <w:i w:val="0"/>
                 <w:caps w:val="0"/>
-                <w:color w:val="18211F"/>
+                <w:color w:val="1C1410"/>
                 <w:sz w:val="23"/>
               </w:rPr>
               <w:t>Quote follow-up</w:t>
@@ -1696,22 +1696,22 @@
             </w:pPr>
             <w:r>
               <w:rPr>
-                <w:rFonts w:ascii="Aptos" w:hAnsi="Aptos"/>
+                <w:rFonts w:ascii="Inter" w:hAnsi="Inter"/>
                 <w:b/>
                 <w:i w:val="0"/>
                 <w:caps w:val="0"/>
-                <w:color w:val="18211F"/>
+                <w:color w:val="1C1410"/>
                 <w:sz w:val="19"/>
               </w:rPr>
               <w:t xml:space="preserve">Current state: </w:t>
             </w:r>
             <w:r>
               <w:rPr>
-                <w:rFonts w:ascii="Aptos" w:hAnsi="Aptos"/>
+                <w:rFonts w:ascii="Inter" w:hAnsi="Inter"/>
                 <w:b w:val="0"/>
                 <w:i w:val="0"/>
                 <w:caps w:val="0"/>
-                <w:color w:val="5F6C68"/>
+                <w:color w:val="6B5E52"/>
                 <w:sz w:val="19"/>
               </w:rPr>
               <w:t>Quotes are sent, but follow-up timing and ownership are inconsistent. Conversion is not visible in one place.</w:t>
@@ -1724,22 +1724,22 @@
             </w:pPr>
             <w:r>
               <w:rPr>
-                <w:rFonts w:ascii="Aptos" w:hAnsi="Aptos"/>
+                <w:rFonts w:ascii="Inter" w:hAnsi="Inter"/>
                 <w:b/>
                 <w:i w:val="0"/>
                 <w:caps w:val="0"/>
-                <w:color w:val="18211F"/>
+                <w:color w:val="1C1410"/>
                 <w:sz w:val="19"/>
               </w:rPr>
               <w:t xml:space="preserve">Likely impact: </w:t>
             </w:r>
             <w:r>
               <w:rPr>
-                <w:rFonts w:ascii="Aptos" w:hAnsi="Aptos"/>
+                <w:rFonts w:ascii="Inter" w:hAnsi="Inter"/>
                 <w:b w:val="0"/>
                 <w:i w:val="0"/>
                 <w:caps w:val="0"/>
-                <w:color w:val="5F6C68"/>
+                <w:color w:val="6B5E52"/>
                 <w:sz w:val="19"/>
               </w:rPr>
               <w:t>Warm prospects can drift to competitors, while the business cannot distinguish price objections from simple lack of follow-up.</w:t>
@@ -1752,22 +1752,22 @@
             </w:pPr>
             <w:r>
               <w:rPr>
-                <w:rFonts w:ascii="Aptos" w:hAnsi="Aptos"/>
+                <w:rFonts w:ascii="Inter" w:hAnsi="Inter"/>
                 <w:b/>
                 <w:i w:val="0"/>
                 <w:caps w:val="0"/>
-                <w:color w:val="18211F"/>
+                <w:color w:val="1C1410"/>
                 <w:sz w:val="19"/>
               </w:rPr>
               <w:t xml:space="preserve">Fastest win: </w:t>
             </w:r>
             <w:r>
               <w:rPr>
-                <w:rFonts w:ascii="Aptos" w:hAnsi="Aptos"/>
+                <w:rFonts w:ascii="Inter" w:hAnsi="Inter"/>
                 <w:b w:val="0"/>
                 <w:i w:val="0"/>
                 <w:caps w:val="0"/>
-                <w:color w:val="5F6C68"/>
+                <w:color w:val="6B5E52"/>
                 <w:sz w:val="19"/>
               </w:rPr>
               <w:t>Introduce two scheduled follow-ups and a clear won/lost outcome.</w:t>
@@ -1796,7 +1796,7 @@
         <w:tc>
           <w:tcPr>
             <w:tcW w:type="dxa" w:w="1540"/>
-            <w:shd w:fill="A46411"/>
+            <w:shd w:fill="C47B2E"/>
             <w:tcMar>
               <w:top w:w="150" w:type="dxa"/>
               <w:start w:w="160" w:type="dxa"/>
@@ -1804,7 +1804,7 @@
               <w:end w:w="160" w:type="dxa"/>
             </w:tcMar>
             <w:tcBorders>
-              <w:bottom w:val="single" w:sz="6" w:color="CBD5D1"/>
+              <w:bottom w:val="single" w:sz="6" w:color="DDD5C8"/>
             </w:tcBorders>
             <w:vAlign w:val="center"/>
           </w:tcPr>
@@ -1816,11 +1816,11 @@
             </w:pPr>
             <w:r>
               <w:rPr>
-                <w:rFonts w:ascii="Aptos" w:hAnsi="Aptos"/>
+                <w:rFonts w:ascii="Inter" w:hAnsi="Inter"/>
                 <w:b/>
                 <w:i w:val="0"/>
                 <w:caps/>
-                <w:color w:val="FFFFFF"/>
+                <w:color w:val="F9F6F1"/>
                 <w:sz w:val="18"/>
               </w:rPr>
               <w:t>YELLOW</w:t>
@@ -1830,7 +1830,7 @@
         <w:tc>
           <w:tcPr>
             <w:tcW w:type="dxa" w:w="7820"/>
-            <w:shd w:fill="F7EEDF"/>
+            <w:shd w:fill="FDF4E7"/>
             <w:tcMar>
               <w:top w:w="150" w:type="dxa"/>
               <w:start w:w="160" w:type="dxa"/>
@@ -1838,7 +1838,7 @@
               <w:end w:w="160" w:type="dxa"/>
             </w:tcMar>
             <w:tcBorders>
-              <w:bottom w:val="single" w:sz="6" w:color="CBD5D1"/>
+              <w:bottom w:val="single" w:sz="6" w:color="DDD5C8"/>
             </w:tcBorders>
             <w:vAlign w:val="center"/>
           </w:tcPr>
@@ -1849,11 +1849,11 @@
             </w:pPr>
             <w:r>
               <w:rPr>
-                <w:rFonts w:ascii="Aptos" w:hAnsi="Aptos"/>
+                <w:rFonts w:ascii="Inter" w:hAnsi="Inter"/>
                 <w:b/>
                 <w:i w:val="0"/>
                 <w:caps w:val="0"/>
-                <w:color w:val="18211F"/>
+                <w:color w:val="1C1410"/>
                 <w:sz w:val="23"/>
               </w:rPr>
               <w:t>Workflow visibility</w:t>
@@ -1866,22 +1866,22 @@
             </w:pPr>
             <w:r>
               <w:rPr>
-                <w:rFonts w:ascii="Aptos" w:hAnsi="Aptos"/>
+                <w:rFonts w:ascii="Inter" w:hAnsi="Inter"/>
                 <w:b/>
                 <w:i w:val="0"/>
                 <w:caps w:val="0"/>
-                <w:color w:val="18211F"/>
+                <w:color w:val="1C1410"/>
                 <w:sz w:val="19"/>
               </w:rPr>
               <w:t xml:space="preserve">Current state: </w:t>
             </w:r>
             <w:r>
               <w:rPr>
-                <w:rFonts w:ascii="Aptos" w:hAnsi="Aptos"/>
+                <w:rFonts w:ascii="Inter" w:hAnsi="Inter"/>
                 <w:b w:val="0"/>
                 <w:i w:val="0"/>
                 <w:caps w:val="0"/>
-                <w:color w:val="5F6C68"/>
+                <w:color w:val="6B5E52"/>
                 <w:sz w:val="19"/>
               </w:rPr>
               <w:t>Core tools are in place, but staff still rely on memory and manual checking to know what needs attention.</w:t>
@@ -1894,22 +1894,22 @@
             </w:pPr>
             <w:r>
               <w:rPr>
-                <w:rFonts w:ascii="Aptos" w:hAnsi="Aptos"/>
+                <w:rFonts w:ascii="Inter" w:hAnsi="Inter"/>
                 <w:b/>
                 <w:i w:val="0"/>
                 <w:caps w:val="0"/>
-                <w:color w:val="18211F"/>
+                <w:color w:val="1C1410"/>
                 <w:sz w:val="19"/>
               </w:rPr>
               <w:t xml:space="preserve">Likely impact: </w:t>
             </w:r>
             <w:r>
               <w:rPr>
-                <w:rFonts w:ascii="Aptos" w:hAnsi="Aptos"/>
+                <w:rFonts w:ascii="Inter" w:hAnsi="Inter"/>
                 <w:b w:val="0"/>
                 <w:i w:val="0"/>
                 <w:caps w:val="0"/>
-                <w:color w:val="5F6C68"/>
+                <w:color w:val="6B5E52"/>
                 <w:sz w:val="19"/>
               </w:rPr>
               <w:t>The system works while key people are present, but tasks can stall during busy periods or absences.</w:t>
@@ -1922,22 +1922,22 @@
             </w:pPr>
             <w:r>
               <w:rPr>
-                <w:rFonts w:ascii="Aptos" w:hAnsi="Aptos"/>
+                <w:rFonts w:ascii="Inter" w:hAnsi="Inter"/>
                 <w:b/>
                 <w:i w:val="0"/>
                 <w:caps w:val="0"/>
-                <w:color w:val="18211F"/>
+                <w:color w:val="1C1410"/>
                 <w:sz w:val="19"/>
               </w:rPr>
               <w:t xml:space="preserve">Fastest win: </w:t>
             </w:r>
             <w:r>
               <w:rPr>
-                <w:rFonts w:ascii="Aptos" w:hAnsi="Aptos"/>
+                <w:rFonts w:ascii="Inter" w:hAnsi="Inter"/>
                 <w:b w:val="0"/>
                 <w:i w:val="0"/>
                 <w:caps w:val="0"/>
-                <w:color w:val="5F6C68"/>
+                <w:color w:val="6B5E52"/>
                 <w:sz w:val="19"/>
               </w:rPr>
               <w:t>Create one daily view of uncontacted leads, open quotes and jobs awaiting customer action.</w:t>
@@ -1966,7 +1966,7 @@
         <w:tc>
           <w:tcPr>
             <w:tcW w:type="dxa" w:w="1540"/>
-            <w:shd w:fill="A46411"/>
+            <w:shd w:fill="C47B2E"/>
             <w:tcMar>
               <w:top w:w="150" w:type="dxa"/>
               <w:start w:w="160" w:type="dxa"/>
@@ -1974,7 +1974,7 @@
               <w:end w:w="160" w:type="dxa"/>
             </w:tcMar>
             <w:tcBorders>
-              <w:bottom w:val="single" w:sz="6" w:color="CBD5D1"/>
+              <w:bottom w:val="single" w:sz="6" w:color="DDD5C8"/>
             </w:tcBorders>
             <w:vAlign w:val="center"/>
           </w:tcPr>
@@ -1986,11 +1986,11 @@
             </w:pPr>
             <w:r>
               <w:rPr>
-                <w:rFonts w:ascii="Aptos" w:hAnsi="Aptos"/>
+                <w:rFonts w:ascii="Inter" w:hAnsi="Inter"/>
                 <w:b/>
                 <w:i w:val="0"/>
                 <w:caps/>
-                <w:color w:val="FFFFFF"/>
+                <w:color w:val="F9F6F1"/>
                 <w:sz w:val="18"/>
               </w:rPr>
               <w:t>YELLOW</w:t>
@@ -2000,7 +2000,7 @@
         <w:tc>
           <w:tcPr>
             <w:tcW w:type="dxa" w:w="7820"/>
-            <w:shd w:fill="F7EEDF"/>
+            <w:shd w:fill="FDF4E7"/>
             <w:tcMar>
               <w:top w:w="150" w:type="dxa"/>
               <w:start w:w="160" w:type="dxa"/>
@@ -2008,7 +2008,7 @@
               <w:end w:w="160" w:type="dxa"/>
             </w:tcMar>
             <w:tcBorders>
-              <w:bottom w:val="single" w:sz="6" w:color="CBD5D1"/>
+              <w:bottom w:val="single" w:sz="6" w:color="DDD5C8"/>
             </w:tcBorders>
             <w:vAlign w:val="center"/>
           </w:tcPr>
@@ -2019,11 +2019,11 @@
             </w:pPr>
             <w:r>
               <w:rPr>
-                <w:rFonts w:ascii="Aptos" w:hAnsi="Aptos"/>
+                <w:rFonts w:ascii="Inter" w:hAnsi="Inter"/>
                 <w:b/>
                 <w:i w:val="0"/>
                 <w:caps w:val="0"/>
-                <w:color w:val="18211F"/>
+                <w:color w:val="1C1410"/>
                 <w:sz w:val="23"/>
               </w:rPr>
               <w:t>Reviews and repeat work</w:t>
@@ -2036,22 +2036,22 @@
             </w:pPr>
             <w:r>
               <w:rPr>
-                <w:rFonts w:ascii="Aptos" w:hAnsi="Aptos"/>
+                <w:rFonts w:ascii="Inter" w:hAnsi="Inter"/>
                 <w:b/>
                 <w:i w:val="0"/>
                 <w:caps w:val="0"/>
-                <w:color w:val="18211F"/>
+                <w:color w:val="1C1410"/>
                 <w:sz w:val="19"/>
               </w:rPr>
               <w:t xml:space="preserve">Current state: </w:t>
             </w:r>
             <w:r>
               <w:rPr>
-                <w:rFonts w:ascii="Aptos" w:hAnsi="Aptos"/>
+                <w:rFonts w:ascii="Inter" w:hAnsi="Inter"/>
                 <w:b w:val="0"/>
                 <w:i w:val="0"/>
                 <w:caps w:val="0"/>
-                <w:color w:val="5F6C68"/>
+                <w:color w:val="6B5E52"/>
                 <w:sz w:val="19"/>
               </w:rPr>
               <w:t>Happy customers are not consistently prompted for a review or relevant future service.</w:t>
@@ -2064,22 +2064,22 @@
             </w:pPr>
             <w:r>
               <w:rPr>
-                <w:rFonts w:ascii="Aptos" w:hAnsi="Aptos"/>
+                <w:rFonts w:ascii="Inter" w:hAnsi="Inter"/>
                 <w:b/>
                 <w:i w:val="0"/>
                 <w:caps w:val="0"/>
-                <w:color w:val="18211F"/>
+                <w:color w:val="1C1410"/>
                 <w:sz w:val="19"/>
               </w:rPr>
               <w:t xml:space="preserve">Likely impact: </w:t>
             </w:r>
             <w:r>
               <w:rPr>
-                <w:rFonts w:ascii="Aptos" w:hAnsi="Aptos"/>
+                <w:rFonts w:ascii="Inter" w:hAnsi="Inter"/>
                 <w:b w:val="0"/>
                 <w:i w:val="0"/>
                 <w:caps w:val="0"/>
-                <w:color w:val="5F6C68"/>
+                <w:color w:val="6B5E52"/>
                 <w:sz w:val="19"/>
               </w:rPr>
               <w:t>The business misses low-cost reputation growth and repeat-work opportunities after successful jobs.</w:t>
@@ -2092,22 +2092,22 @@
             </w:pPr>
             <w:r>
               <w:rPr>
-                <w:rFonts w:ascii="Aptos" w:hAnsi="Aptos"/>
+                <w:rFonts w:ascii="Inter" w:hAnsi="Inter"/>
                 <w:b/>
                 <w:i w:val="0"/>
                 <w:caps w:val="0"/>
-                <w:color w:val="18211F"/>
+                <w:color w:val="1C1410"/>
                 <w:sz w:val="19"/>
               </w:rPr>
               <w:t xml:space="preserve">Fastest win: </w:t>
             </w:r>
             <w:r>
               <w:rPr>
-                <w:rFonts w:ascii="Aptos" w:hAnsi="Aptos"/>
+                <w:rFonts w:ascii="Inter" w:hAnsi="Inter"/>
                 <w:b w:val="0"/>
                 <w:i w:val="0"/>
                 <w:caps w:val="0"/>
-                <w:color w:val="5F6C68"/>
+                <w:color w:val="6B5E52"/>
                 <w:sz w:val="19"/>
               </w:rPr>
               <w:t>Trigger a review request after job completion and add one relevant next-step prompt.</w:t>
@@ -2134,11 +2134,11 @@
       </w:pPr>
       <w:r>
         <w:rPr>
-          <w:rFonts w:ascii="Aptos" w:hAnsi="Aptos"/>
+          <w:rFonts w:ascii="Inter" w:hAnsi="Inter"/>
           <w:b/>
           <w:i w:val="0"/>
           <w:caps/>
-          <w:color w:val="0B6655"/>
+          <w:color w:val="7A4F1E"/>
           <w:sz w:val="17"/>
         </w:rPr>
         <w:t>04 | 30-DAY ACTION PLAN</w:t>
@@ -2152,11 +2152,11 @@
       </w:pPr>
       <w:r>
         <w:rPr>
-          <w:rFonts w:ascii="Aptos" w:hAnsi="Aptos"/>
+          <w:rFonts w:ascii="Inter" w:hAnsi="Inter"/>
           <w:b/>
           <w:i w:val="0"/>
           <w:caps w:val="0"/>
-          <w:color w:val="08483D"/>
+          <w:color w:val="1C1410"/>
           <w:sz w:val="36"/>
         </w:rPr>
         <w:t>Fix the fastest revenue leaks before adding complexity</w:t>
@@ -2177,7 +2177,7 @@
         <w:tc>
           <w:tcPr>
             <w:tcW w:type="dxa" w:w="720"/>
-            <w:shd w:fill="0B6655"/>
+            <w:shd w:fill="7A4F1E"/>
             <w:tcMar>
               <w:top w:w="120" w:type="dxa"/>
               <w:start w:w="150" w:type="dxa"/>
@@ -2185,7 +2185,7 @@
               <w:end w:w="150" w:type="dxa"/>
             </w:tcMar>
             <w:tcBorders>
-              <w:bottom w:val="single" w:sz="6" w:color="CBD5D1"/>
+              <w:bottom w:val="single" w:sz="6" w:color="DDD5C8"/>
             </w:tcBorders>
             <w:vAlign w:val="center"/>
           </w:tcPr>
@@ -2197,11 +2197,11 @@
             </w:pPr>
             <w:r>
               <w:rPr>
-                <w:rFonts w:ascii="Aptos" w:hAnsi="Aptos"/>
+                <w:rFonts w:ascii="Inter" w:hAnsi="Inter"/>
                 <w:b/>
                 <w:i w:val="0"/>
                 <w:caps w:val="0"/>
-                <w:color w:val="FFFFFF"/>
+                <w:color w:val="F9F6F1"/>
                 <w:sz w:val="28"/>
               </w:rPr>
               <w:t>1</w:t>
@@ -2211,7 +2211,7 @@
         <w:tc>
           <w:tcPr>
             <w:tcW w:type="dxa" w:w="8640"/>
-            <w:shd w:fill="F5F7F6"/>
+            <w:shd w:fill="F2EDE5"/>
             <w:tcMar>
               <w:top w:w="120" w:type="dxa"/>
               <w:start w:w="150" w:type="dxa"/>
@@ -2219,7 +2219,7 @@
               <w:end w:w="150" w:type="dxa"/>
             </w:tcMar>
             <w:tcBorders>
-              <w:bottom w:val="single" w:sz="6" w:color="CBD5D1"/>
+              <w:bottom w:val="single" w:sz="6" w:color="DDD5C8"/>
             </w:tcBorders>
             <w:vAlign w:val="center"/>
           </w:tcPr>
@@ -2230,11 +2230,11 @@
             </w:pPr>
             <w:r>
               <w:rPr>
-                <w:rFonts w:ascii="Aptos" w:hAnsi="Aptos"/>
+                <w:rFonts w:ascii="Inter" w:hAnsi="Inter"/>
                 <w:b/>
                 <w:i w:val="0"/>
                 <w:caps w:val="0"/>
-                <w:color w:val="18211F"/>
+                <w:color w:val="1C1410"/>
                 <w:sz w:val="21"/>
               </w:rPr>
               <w:t>Days 1–7 | Missed-call recovery</w:t>
@@ -2247,11 +2247,11 @@
             </w:pPr>
             <w:r>
               <w:rPr>
-                <w:rFonts w:ascii="Aptos" w:hAnsi="Aptos"/>
+                <w:rFonts w:ascii="Inter" w:hAnsi="Inter"/>
                 <w:b w:val="0"/>
                 <w:i w:val="0"/>
                 <w:caps w:val="0"/>
-                <w:color w:val="5F6C68"/>
+                <w:color w:val="6B5E52"/>
                 <w:sz w:val="19"/>
               </w:rPr>
               <w:t>Map the current call path, assign callback ownership, and launch an immediate text acknowledgement for unanswered calls. Track response time and recovered bookings.</w:t>
@@ -2280,7 +2280,7 @@
         <w:tc>
           <w:tcPr>
             <w:tcW w:type="dxa" w:w="720"/>
-            <w:shd w:fill="0B6655"/>
+            <w:shd w:fill="7A4F1E"/>
             <w:tcMar>
               <w:top w:w="120" w:type="dxa"/>
               <w:start w:w="150" w:type="dxa"/>
@@ -2288,7 +2288,7 @@
               <w:end w:w="150" w:type="dxa"/>
             </w:tcMar>
             <w:tcBorders>
-              <w:bottom w:val="single" w:sz="6" w:color="CBD5D1"/>
+              <w:bottom w:val="single" w:sz="6" w:color="DDD5C8"/>
             </w:tcBorders>
             <w:vAlign w:val="center"/>
           </w:tcPr>
@@ -2300,11 +2300,11 @@
             </w:pPr>
             <w:r>
               <w:rPr>
-                <w:rFonts w:ascii="Aptos" w:hAnsi="Aptos"/>
+                <w:rFonts w:ascii="Inter" w:hAnsi="Inter"/>
                 <w:b/>
                 <w:i w:val="0"/>
                 <w:caps w:val="0"/>
-                <w:color w:val="FFFFFF"/>
+                <w:color w:val="F9F6F1"/>
                 <w:sz w:val="28"/>
               </w:rPr>
               <w:t>2</w:t>
@@ -2314,7 +2314,7 @@
         <w:tc>
           <w:tcPr>
             <w:tcW w:type="dxa" w:w="8640"/>
-            <w:shd w:fill="F5F7F6"/>
+            <w:shd w:fill="F2EDE5"/>
             <w:tcMar>
               <w:top w:w="120" w:type="dxa"/>
               <w:start w:w="150" w:type="dxa"/>
@@ -2322,7 +2322,7 @@
               <w:end w:w="150" w:type="dxa"/>
             </w:tcMar>
             <w:tcBorders>
-              <w:bottom w:val="single" w:sz="6" w:color="CBD5D1"/>
+              <w:bottom w:val="single" w:sz="6" w:color="DDD5C8"/>
             </w:tcBorders>
             <w:vAlign w:val="center"/>
           </w:tcPr>
@@ -2333,11 +2333,11 @@
             </w:pPr>
             <w:r>
               <w:rPr>
-                <w:rFonts w:ascii="Aptos" w:hAnsi="Aptos"/>
+                <w:rFonts w:ascii="Inter" w:hAnsi="Inter"/>
                 <w:b/>
                 <w:i w:val="0"/>
                 <w:caps w:val="0"/>
-                <w:color w:val="18211F"/>
+                <w:color w:val="1C1410"/>
                 <w:sz w:val="21"/>
               </w:rPr>
               <w:t>Days 8–14 | Quote follow-up</w:t>
@@ -2350,11 +2350,11 @@
             </w:pPr>
             <w:r>
               <w:rPr>
-                <w:rFonts w:ascii="Aptos" w:hAnsi="Aptos"/>
+                <w:rFonts w:ascii="Inter" w:hAnsi="Inter"/>
                 <w:b w:val="0"/>
                 <w:i w:val="0"/>
                 <w:caps w:val="0"/>
-                <w:color w:val="5F6C68"/>
+                <w:color w:val="6B5E52"/>
                 <w:sz w:val="19"/>
               </w:rPr>
               <w:t>Standardise follow-up at two agreed intervals, capture a simple status for every quote, and make open quotes visible to the responsible person.</w:t>
@@ -2383,7 +2383,7 @@
         <w:tc>
           <w:tcPr>
             <w:tcW w:type="dxa" w:w="720"/>
-            <w:shd w:fill="0B6655"/>
+            <w:shd w:fill="7A4F1E"/>
             <w:tcMar>
               <w:top w:w="120" w:type="dxa"/>
               <w:start w:w="150" w:type="dxa"/>
@@ -2391,7 +2391,7 @@
               <w:end w:w="150" w:type="dxa"/>
             </w:tcMar>
             <w:tcBorders>
-              <w:bottom w:val="single" w:sz="6" w:color="CBD5D1"/>
+              <w:bottom w:val="single" w:sz="6" w:color="DDD5C8"/>
             </w:tcBorders>
             <w:vAlign w:val="center"/>
           </w:tcPr>
@@ -2403,11 +2403,11 @@
             </w:pPr>
             <w:r>
               <w:rPr>
-                <w:rFonts w:ascii="Aptos" w:hAnsi="Aptos"/>
+                <w:rFonts w:ascii="Inter" w:hAnsi="Inter"/>
                 <w:b/>
                 <w:i w:val="0"/>
                 <w:caps w:val="0"/>
-                <w:color w:val="FFFFFF"/>
+                <w:color w:val="F9F6F1"/>
                 <w:sz w:val="28"/>
               </w:rPr>
               <w:t>3</w:t>
@@ -2417,7 +2417,7 @@
         <w:tc>
           <w:tcPr>
             <w:tcW w:type="dxa" w:w="8640"/>
-            <w:shd w:fill="F5F7F6"/>
+            <w:shd w:fill="F2EDE5"/>
             <w:tcMar>
               <w:top w:w="120" w:type="dxa"/>
               <w:start w:w="150" w:type="dxa"/>
@@ -2425,7 +2425,7 @@
               <w:end w:w="150" w:type="dxa"/>
             </w:tcMar>
             <w:tcBorders>
-              <w:bottom w:val="single" w:sz="6" w:color="CBD5D1"/>
+              <w:bottom w:val="single" w:sz="6" w:color="DDD5C8"/>
             </w:tcBorders>
             <w:vAlign w:val="center"/>
           </w:tcPr>
@@ -2436,11 +2436,11 @@
             </w:pPr>
             <w:r>
               <w:rPr>
-                <w:rFonts w:ascii="Aptos" w:hAnsi="Aptos"/>
+                <w:rFonts w:ascii="Inter" w:hAnsi="Inter"/>
                 <w:b/>
                 <w:i w:val="0"/>
                 <w:caps w:val="0"/>
-                <w:color w:val="18211F"/>
+                <w:color w:val="1C1410"/>
                 <w:sz w:val="21"/>
               </w:rPr>
               <w:t>Days 15–21 | Review capture</w:t>
@@ -2453,11 +2453,11 @@
             </w:pPr>
             <w:r>
               <w:rPr>
-                <w:rFonts w:ascii="Aptos" w:hAnsi="Aptos"/>
+                <w:rFonts w:ascii="Inter" w:hAnsi="Inter"/>
                 <w:b w:val="0"/>
                 <w:i w:val="0"/>
                 <w:caps w:val="0"/>
-                <w:color w:val="5F6C68"/>
+                <w:color w:val="6B5E52"/>
                 <w:sz w:val="19"/>
               </w:rPr>
               <w:t>Send a short review request after completed jobs, with a direct link and one reminder when appropriate.</w:t>
@@ -2486,7 +2486,7 @@
         <w:tc>
           <w:tcPr>
             <w:tcW w:type="dxa" w:w="720"/>
-            <w:shd w:fill="0B6655"/>
+            <w:shd w:fill="7A4F1E"/>
             <w:tcMar>
               <w:top w:w="120" w:type="dxa"/>
               <w:start w:w="150" w:type="dxa"/>
@@ -2494,7 +2494,7 @@
               <w:end w:w="150" w:type="dxa"/>
             </w:tcMar>
             <w:tcBorders>
-              <w:bottom w:val="single" w:sz="6" w:color="CBD5D1"/>
+              <w:bottom w:val="single" w:sz="6" w:color="DDD5C8"/>
             </w:tcBorders>
             <w:vAlign w:val="center"/>
           </w:tcPr>
@@ -2506,11 +2506,11 @@
             </w:pPr>
             <w:r>
               <w:rPr>
-                <w:rFonts w:ascii="Aptos" w:hAnsi="Aptos"/>
+                <w:rFonts w:ascii="Inter" w:hAnsi="Inter"/>
                 <w:b/>
                 <w:i w:val="0"/>
                 <w:caps w:val="0"/>
-                <w:color w:val="FFFFFF"/>
+                <w:color w:val="F9F6F1"/>
                 <w:sz w:val="28"/>
               </w:rPr>
               <w:t>4</w:t>
@@ -2520,7 +2520,7 @@
         <w:tc>
           <w:tcPr>
             <w:tcW w:type="dxa" w:w="8640"/>
-            <w:shd w:fill="F5F7F6"/>
+            <w:shd w:fill="F2EDE5"/>
             <w:tcMar>
               <w:top w:w="120" w:type="dxa"/>
               <w:start w:w="150" w:type="dxa"/>
@@ -2528,7 +2528,7 @@
               <w:end w:w="150" w:type="dxa"/>
             </w:tcMar>
             <w:tcBorders>
-              <w:bottom w:val="single" w:sz="6" w:color="CBD5D1"/>
+              <w:bottom w:val="single" w:sz="6" w:color="DDD5C8"/>
             </w:tcBorders>
             <w:vAlign w:val="center"/>
           </w:tcPr>
@@ -2539,11 +2539,11 @@
             </w:pPr>
             <w:r>
               <w:rPr>
-                <w:rFonts w:ascii="Aptos" w:hAnsi="Aptos"/>
+                <w:rFonts w:ascii="Inter" w:hAnsi="Inter"/>
                 <w:b/>
                 <w:i w:val="0"/>
                 <w:caps w:val="0"/>
-                <w:color w:val="18211F"/>
+                <w:color w:val="1C1410"/>
                 <w:sz w:val="21"/>
               </w:rPr>
               <w:t>Days 22–30 | Operating visibility</w:t>
@@ -2556,11 +2556,11 @@
             </w:pPr>
             <w:r>
               <w:rPr>
-                <w:rFonts w:ascii="Aptos" w:hAnsi="Aptos"/>
+                <w:rFonts w:ascii="Inter" w:hAnsi="Inter"/>
                 <w:b w:val="0"/>
                 <w:i w:val="0"/>
                 <w:caps w:val="0"/>
-                <w:color w:val="5F6C68"/>
+                <w:color w:val="6B5E52"/>
                 <w:sz w:val="19"/>
               </w:rPr>
               <w:t>Review the first month of missed calls, quote outcomes and review requests. Keep what works, remove friction, and decide whether deeper automation is justified.</w:t>
@@ -2582,11 +2582,11 @@
       </w:pPr>
       <w:r>
         <w:rPr>
-          <w:rFonts w:ascii="Aptos" w:hAnsi="Aptos"/>
+          <w:rFonts w:ascii="Inter" w:hAnsi="Inter"/>
           <w:b/>
           <w:i w:val="0"/>
           <w:caps w:val="0"/>
-          <w:color w:val="0B6655"/>
+          <w:color w:val="7A4F1E"/>
           <w:sz w:val="27"/>
         </w:rPr>
         <w:t>Measures to track</w:t>
@@ -2610,7 +2610,7 @@
         <w:tc>
           <w:tcPr>
             <w:tcW w:type="dxa" w:w="4680"/>
-            <w:shd w:fill="08483D"/>
+            <w:shd w:fill="1C1410"/>
             <w:tcMar>
               <w:top w:w="120" w:type="dxa"/>
               <w:start w:w="140" w:type="dxa"/>
@@ -2618,7 +2618,7 @@
               <w:end w:w="140" w:type="dxa"/>
             </w:tcMar>
             <w:tcBorders>
-              <w:bottom w:val="single" w:sz="6" w:color="CBD5D1"/>
+              <w:bottom w:val="single" w:sz="6" w:color="DDD5C8"/>
             </w:tcBorders>
           </w:tcPr>
           <w:p>
@@ -2628,11 +2628,11 @@
             </w:pPr>
             <w:r>
               <w:rPr>
-                <w:rFonts w:ascii="Aptos" w:hAnsi="Aptos"/>
+                <w:rFonts w:ascii="Inter" w:hAnsi="Inter"/>
                 <w:b/>
                 <w:i w:val="0"/>
                 <w:caps w:val="0"/>
-                <w:color w:val="FFFFFF"/>
+                <w:color w:val="F9F6F1"/>
                 <w:sz w:val="18"/>
               </w:rPr>
               <w:t>Measure</w:t>
@@ -2642,7 +2642,7 @@
         <w:tc>
           <w:tcPr>
             <w:tcW w:type="dxa" w:w="4680"/>
-            <w:shd w:fill="08483D"/>
+            <w:shd w:fill="1C1410"/>
             <w:tcMar>
               <w:top w:w="120" w:type="dxa"/>
               <w:start w:w="140" w:type="dxa"/>
@@ -2650,7 +2650,7 @@
               <w:end w:w="140" w:type="dxa"/>
             </w:tcMar>
             <w:tcBorders>
-              <w:bottom w:val="single" w:sz="6" w:color="CBD5D1"/>
+              <w:bottom w:val="single" w:sz="6" w:color="DDD5C8"/>
             </w:tcBorders>
           </w:tcPr>
           <w:p>
@@ -2660,11 +2660,11 @@
             </w:pPr>
             <w:r>
               <w:rPr>
-                <w:rFonts w:ascii="Aptos" w:hAnsi="Aptos"/>
+                <w:rFonts w:ascii="Inter" w:hAnsi="Inter"/>
                 <w:b/>
                 <w:i w:val="0"/>
                 <w:caps w:val="0"/>
-                <w:color w:val="FFFFFF"/>
+                <w:color w:val="F9F6F1"/>
                 <w:sz w:val="18"/>
               </w:rPr>
               <w:t>Initial standard</w:t>
@@ -2676,7 +2676,7 @@
         <w:tc>
           <w:tcPr>
             <w:tcW w:type="dxa" w:w="4680"/>
-            <w:shd w:fill="F5F7F6"/>
+            <w:shd w:fill="F2EDE5"/>
             <w:tcMar>
               <w:top w:w="120" w:type="dxa"/>
               <w:start w:w="140" w:type="dxa"/>
@@ -2684,7 +2684,7 @@
               <w:end w:w="140" w:type="dxa"/>
             </w:tcMar>
             <w:tcBorders>
-              <w:bottom w:val="single" w:sz="5" w:color="CBD5D1"/>
+              <w:bottom w:val="single" w:sz="5" w:color="DDD5C8"/>
             </w:tcBorders>
           </w:tcPr>
           <w:p>
@@ -2694,11 +2694,11 @@
             </w:pPr>
             <w:r>
               <w:rPr>
-                <w:rFonts w:ascii="Aptos" w:hAnsi="Aptos"/>
+                <w:rFonts w:ascii="Inter" w:hAnsi="Inter"/>
                 <w:b/>
                 <w:i w:val="0"/>
                 <w:caps w:val="0"/>
-                <w:color w:val="18211F"/>
+                <w:color w:val="1C1410"/>
                 <w:sz w:val="18"/>
               </w:rPr>
               <w:t>Missed calls acknowledged</w:t>
@@ -2708,7 +2708,7 @@
         <w:tc>
           <w:tcPr>
             <w:tcW w:type="dxa" w:w="4680"/>
-            <w:shd w:fill="F5F7F6"/>
+            <w:shd w:fill="F2EDE5"/>
             <w:tcMar>
               <w:top w:w="120" w:type="dxa"/>
               <w:start w:w="140" w:type="dxa"/>
@@ -2716,7 +2716,7 @@
               <w:end w:w="140" w:type="dxa"/>
             </w:tcMar>
             <w:tcBorders>
-              <w:bottom w:val="single" w:sz="5" w:color="CBD5D1"/>
+              <w:bottom w:val="single" w:sz="5" w:color="DDD5C8"/>
             </w:tcBorders>
           </w:tcPr>
           <w:p>
@@ -2726,11 +2726,11 @@
             </w:pPr>
             <w:r>
               <w:rPr>
-                <w:rFonts w:ascii="Aptos" w:hAnsi="Aptos"/>
+                <w:rFonts w:ascii="Inter" w:hAnsi="Inter"/>
                 <w:b w:val="0"/>
                 <w:i w:val="0"/>
                 <w:caps w:val="0"/>
-                <w:color w:val="5F6C68"/>
+                <w:color w:val="6B5E52"/>
                 <w:sz w:val="18"/>
               </w:rPr>
               <w:t>Target: within 1 minute</w:t>
@@ -2742,7 +2742,7 @@
         <w:tc>
           <w:tcPr>
             <w:tcW w:type="dxa" w:w="4680"/>
-            <w:shd w:fill="FFFFFF"/>
+            <w:shd w:fill="F9F6F1"/>
             <w:tcMar>
               <w:top w:w="120" w:type="dxa"/>
               <w:start w:w="140" w:type="dxa"/>
@@ -2750,7 +2750,7 @@
               <w:end w:w="140" w:type="dxa"/>
             </w:tcMar>
             <w:tcBorders>
-              <w:bottom w:val="single" w:sz="5" w:color="CBD5D1"/>
+              <w:bottom w:val="single" w:sz="5" w:color="DDD5C8"/>
             </w:tcBorders>
           </w:tcPr>
           <w:p>
@@ -2760,11 +2760,11 @@
             </w:pPr>
             <w:r>
               <w:rPr>
-                <w:rFonts w:ascii="Aptos" w:hAnsi="Aptos"/>
+                <w:rFonts w:ascii="Inter" w:hAnsi="Inter"/>
                 <w:b/>
                 <w:i w:val="0"/>
                 <w:caps w:val="0"/>
-                <w:color w:val="18211F"/>
+                <w:color w:val="1C1410"/>
                 <w:sz w:val="18"/>
               </w:rPr>
               <w:t>Callback speed</w:t>
@@ -2774,7 +2774,7 @@
         <w:tc>
           <w:tcPr>
             <w:tcW w:type="dxa" w:w="4680"/>
-            <w:shd w:fill="FFFFFF"/>
+            <w:shd w:fill="F9F6F1"/>
             <w:tcMar>
               <w:top w:w="120" w:type="dxa"/>
               <w:start w:w="140" w:type="dxa"/>
@@ -2782,7 +2782,7 @@
               <w:end w:w="140" w:type="dxa"/>
             </w:tcMar>
             <w:tcBorders>
-              <w:bottom w:val="single" w:sz="5" w:color="CBD5D1"/>
+              <w:bottom w:val="single" w:sz="5" w:color="DDD5C8"/>
             </w:tcBorders>
           </w:tcPr>
           <w:p>
@@ -2792,11 +2792,11 @@
             </w:pPr>
             <w:r>
               <w:rPr>
-                <w:rFonts w:ascii="Aptos" w:hAnsi="Aptos"/>
+                <w:rFonts w:ascii="Inter" w:hAnsi="Inter"/>
                 <w:b w:val="0"/>
                 <w:i w:val="0"/>
                 <w:caps w:val="0"/>
-                <w:color w:val="5F6C68"/>
+                <w:color w:val="6B5E52"/>
                 <w:sz w:val="18"/>
               </w:rPr>
               <w:t>Target: within 15 minutes during business hours</w:t>
@@ -2808,7 +2808,7 @@
         <w:tc>
           <w:tcPr>
             <w:tcW w:type="dxa" w:w="4680"/>
-            <w:shd w:fill="F5F7F6"/>
+            <w:shd w:fill="F2EDE5"/>
             <w:tcMar>
               <w:top w:w="120" w:type="dxa"/>
               <w:start w:w="140" w:type="dxa"/>
@@ -2816,7 +2816,7 @@
               <w:end w:w="140" w:type="dxa"/>
             </w:tcMar>
             <w:tcBorders>
-              <w:bottom w:val="single" w:sz="5" w:color="CBD5D1"/>
+              <w:bottom w:val="single" w:sz="5" w:color="DDD5C8"/>
             </w:tcBorders>
           </w:tcPr>
           <w:p>
@@ -2826,11 +2826,11 @@
             </w:pPr>
             <w:r>
               <w:rPr>
-                <w:rFonts w:ascii="Aptos" w:hAnsi="Aptos"/>
+                <w:rFonts w:ascii="Inter" w:hAnsi="Inter"/>
                 <w:b/>
                 <w:i w:val="0"/>
                 <w:caps w:val="0"/>
-                <w:color w:val="18211F"/>
+                <w:color w:val="1C1410"/>
                 <w:sz w:val="18"/>
               </w:rPr>
               <w:t>Quotes followed up</w:t>
@@ -2840,7 +2840,7 @@
         <w:tc>
           <w:tcPr>
             <w:tcW w:type="dxa" w:w="4680"/>
-            <w:shd w:fill="F5F7F6"/>
+            <w:shd w:fill="F2EDE5"/>
             <w:tcMar>
               <w:top w:w="120" w:type="dxa"/>
               <w:start w:w="140" w:type="dxa"/>
@@ -2848,7 +2848,7 @@
               <w:end w:w="140" w:type="dxa"/>
             </w:tcMar>
             <w:tcBorders>
-              <w:bottom w:val="single" w:sz="5" w:color="CBD5D1"/>
+              <w:bottom w:val="single" w:sz="5" w:color="DDD5C8"/>
             </w:tcBorders>
           </w:tcPr>
           <w:p>
@@ -2858,11 +2858,11 @@
             </w:pPr>
             <w:r>
               <w:rPr>
-                <w:rFonts w:ascii="Aptos" w:hAnsi="Aptos"/>
+                <w:rFonts w:ascii="Inter" w:hAnsi="Inter"/>
                 <w:b w:val="0"/>
                 <w:i w:val="0"/>
                 <w:caps w:val="0"/>
-                <w:color w:val="5F6C68"/>
+                <w:color w:val="6B5E52"/>
                 <w:sz w:val="18"/>
               </w:rPr>
               <w:t>Target: 100% receive the agreed sequence</w:t>
@@ -2874,7 +2874,7 @@
         <w:tc>
           <w:tcPr>
             <w:tcW w:type="dxa" w:w="4680"/>
-            <w:shd w:fill="FFFFFF"/>
+            <w:shd w:fill="F9F6F1"/>
             <w:tcMar>
               <w:top w:w="120" w:type="dxa"/>
               <w:start w:w="140" w:type="dxa"/>
@@ -2882,7 +2882,7 @@
               <w:end w:w="140" w:type="dxa"/>
             </w:tcMar>
             <w:tcBorders>
-              <w:bottom w:val="single" w:sz="5" w:color="CBD5D1"/>
+              <w:bottom w:val="single" w:sz="5" w:color="DDD5C8"/>
             </w:tcBorders>
           </w:tcPr>
           <w:p>
@@ -2892,11 +2892,11 @@
             </w:pPr>
             <w:r>
               <w:rPr>
-                <w:rFonts w:ascii="Aptos" w:hAnsi="Aptos"/>
+                <w:rFonts w:ascii="Inter" w:hAnsi="Inter"/>
                 <w:b/>
                 <w:i w:val="0"/>
                 <w:caps w:val="0"/>
-                <w:color w:val="18211F"/>
+                <w:color w:val="1C1410"/>
                 <w:sz w:val="18"/>
               </w:rPr>
               <w:t>Quote outcomes recorded</w:t>
@@ -2906,7 +2906,7 @@
         <w:tc>
           <w:tcPr>
             <w:tcW w:type="dxa" w:w="4680"/>
-            <w:shd w:fill="FFFFFF"/>
+            <w:shd w:fill="F9F6F1"/>
             <w:tcMar>
               <w:top w:w="120" w:type="dxa"/>
               <w:start w:w="140" w:type="dxa"/>
@@ -2914,7 +2914,7 @@
               <w:end w:w="140" w:type="dxa"/>
             </w:tcMar>
             <w:tcBorders>
-              <w:bottom w:val="single" w:sz="5" w:color="CBD5D1"/>
+              <w:bottom w:val="single" w:sz="5" w:color="DDD5C8"/>
             </w:tcBorders>
           </w:tcPr>
           <w:p>
@@ -2924,11 +2924,11 @@
             </w:pPr>
             <w:r>
               <w:rPr>
-                <w:rFonts w:ascii="Aptos" w:hAnsi="Aptos"/>
+                <w:rFonts w:ascii="Inter" w:hAnsi="Inter"/>
                 <w:b w:val="0"/>
                 <w:i w:val="0"/>
                 <w:caps w:val="0"/>
-                <w:color w:val="5F6C68"/>
+                <w:color w:val="6B5E52"/>
                 <w:sz w:val="18"/>
               </w:rPr>
               <w:t>Target: won, lost or pending</w:t>
@@ -2940,7 +2940,7 @@
         <w:tc>
           <w:tcPr>
             <w:tcW w:type="dxa" w:w="4680"/>
-            <w:shd w:fill="F5F7F6"/>
+            <w:shd w:fill="F2EDE5"/>
             <w:tcMar>
               <w:top w:w="120" w:type="dxa"/>
               <w:start w:w="140" w:type="dxa"/>
@@ -2948,7 +2948,7 @@
               <w:end w:w="140" w:type="dxa"/>
             </w:tcMar>
             <w:tcBorders>
-              <w:bottom w:val="single" w:sz="5" w:color="CBD5D1"/>
+              <w:bottom w:val="single" w:sz="5" w:color="DDD5C8"/>
             </w:tcBorders>
           </w:tcPr>
           <w:p>
@@ -2958,11 +2958,11 @@
             </w:pPr>
             <w:r>
               <w:rPr>
-                <w:rFonts w:ascii="Aptos" w:hAnsi="Aptos"/>
+                <w:rFonts w:ascii="Inter" w:hAnsi="Inter"/>
                 <w:b/>
                 <w:i w:val="0"/>
                 <w:caps w:val="0"/>
-                <w:color w:val="18211F"/>
+                <w:color w:val="1C1410"/>
                 <w:sz w:val="18"/>
               </w:rPr>
               <w:t>Review requests sent</w:t>
@@ -2972,7 +2972,7 @@
         <w:tc>
           <w:tcPr>
             <w:tcW w:type="dxa" w:w="4680"/>
-            <w:shd w:fill="F5F7F6"/>
+            <w:shd w:fill="F2EDE5"/>
             <w:tcMar>
               <w:top w:w="120" w:type="dxa"/>
               <w:start w:w="140" w:type="dxa"/>
@@ -2980,7 +2980,7 @@
               <w:end w:w="140" w:type="dxa"/>
             </w:tcMar>
             <w:tcBorders>
-              <w:bottom w:val="single" w:sz="5" w:color="CBD5D1"/>
+              <w:bottom w:val="single" w:sz="5" w:color="DDD5C8"/>
             </w:tcBorders>
           </w:tcPr>
           <w:p>
@@ -2990,11 +2990,11 @@
             </w:pPr>
             <w:r>
               <w:rPr>
-                <w:rFonts w:ascii="Aptos" w:hAnsi="Aptos"/>
+                <w:rFonts w:ascii="Inter" w:hAnsi="Inter"/>
                 <w:b w:val="0"/>
                 <w:i w:val="0"/>
                 <w:caps w:val="0"/>
-                <w:color w:val="5F6C68"/>
+                <w:color w:val="6B5E52"/>
                 <w:sz w:val="18"/>
               </w:rPr>
               <w:t>Target: every eligible completed job</w:t>
@@ -3016,11 +3016,11 @@
       </w:pPr>
       <w:r>
         <w:rPr>
-          <w:rFonts w:ascii="Aptos" w:hAnsi="Aptos"/>
+          <w:rFonts w:ascii="Inter" w:hAnsi="Inter"/>
           <w:b/>
           <w:i w:val="0"/>
           <w:caps/>
-          <w:color w:val="0B6655"/>
+          <w:color w:val="7A4F1E"/>
           <w:sz w:val="17"/>
         </w:rPr>
         <w:t>05 | RECOMMENDED NEXT STEP</w:t>
@@ -3034,11 +3034,11 @@
       </w:pPr>
       <w:r>
         <w:rPr>
-          <w:rFonts w:ascii="Aptos" w:hAnsi="Aptos"/>
+          <w:rFonts w:ascii="Inter" w:hAnsi="Inter"/>
           <w:b/>
           <w:i w:val="0"/>
           <w:caps w:val="0"/>
-          <w:color w:val="08483D"/>
+          <w:color w:val="1C1410"/>
           <w:sz w:val="36"/>
         </w:rPr>
         <w:t>Implement one contained commercial workflow and measure the result</w:t>
@@ -3052,11 +3052,11 @@
       </w:pPr>
       <w:r>
         <w:rPr>
-          <w:rFonts w:ascii="Aptos" w:hAnsi="Aptos"/>
+          <w:rFonts w:ascii="Inter" w:hAnsi="Inter"/>
           <w:b w:val="0"/>
           <w:i w:val="0"/>
           <w:caps w:val="0"/>
-          <w:color w:val="18211F"/>
+          <w:color w:val="1C1410"/>
           <w:sz w:val="21"/>
         </w:rPr>
         <w:t>The recommended first engagement is a focused follow-up sprint: missed-call recovery, quote follow-up and review capture. It should improve the handling of existing demand without requiring a full CRM replacement or a broad transformation program.</w:t>
@@ -3076,7 +3076,7 @@
         <w:tc>
           <w:tcPr>
             <w:tcW w:type="dxa" w:w="9360"/>
-            <w:shd w:fill="E8F2EF"/>
+            <w:shd w:fill="FDF4E7"/>
             <w:tcMar>
               <w:top w:w="200" w:type="dxa"/>
               <w:start w:w="220" w:type="dxa"/>
@@ -3084,7 +3084,7 @@
               <w:end w:w="220" w:type="dxa"/>
             </w:tcMar>
             <w:tcBorders>
-              <w:left w:val="single" w:sz="24" w:color="0B6655"/>
+              <w:left w:val="single" w:sz="24" w:color="7A4F1E"/>
             </w:tcBorders>
           </w:tcPr>
           <w:p>
@@ -3094,11 +3094,11 @@
             </w:pPr>
             <w:r>
               <w:rPr>
-                <w:rFonts w:ascii="Aptos" w:hAnsi="Aptos"/>
+                <w:rFonts w:ascii="Inter" w:hAnsi="Inter"/>
                 <w:b/>
                 <w:i w:val="0"/>
                 <w:caps/>
-                <w:color w:val="0B6655"/>
+                <w:color w:val="7A4F1E"/>
                 <w:sz w:val="16"/>
               </w:rPr>
               <w:t>IMPLEMENTATION PRINCIPLE</w:t>
@@ -3111,11 +3111,11 @@
             </w:pPr>
             <w:r>
               <w:rPr>
-                <w:rFonts w:ascii="Aptos" w:hAnsi="Aptos"/>
+                <w:rFonts w:ascii="Inter" w:hAnsi="Inter"/>
                 <w:b/>
                 <w:i w:val="0"/>
                 <w:caps w:val="0"/>
-                <w:color w:val="18211F"/>
+                <w:color w:val="1C1410"/>
                 <w:sz w:val="28"/>
               </w:rPr>
               <w:t>Automate the hand-off, not the relationship.</w:t>
@@ -3128,11 +3128,11 @@
             </w:pPr>
             <w:r>
               <w:rPr>
-                <w:rFonts w:ascii="Aptos" w:hAnsi="Aptos"/>
+                <w:rFonts w:ascii="Inter" w:hAnsi="Inter"/>
                 <w:b w:val="0"/>
                 <w:i w:val="0"/>
                 <w:caps w:val="0"/>
-                <w:color w:val="5F6C68"/>
+                <w:color w:val="6B5E52"/>
                 <w:sz w:val="20"/>
               </w:rPr>
               <w:t>Customers should still experience a capable local electrical business. Automation should make acknowledgement, reminders and visibility more reliable while people remain responsible for judgement and customer conversations.</w:t>
@@ -3149,11 +3149,11 @@
       </w:pPr>
       <w:r>
         <w:rPr>
-          <w:rFonts w:ascii="Aptos" w:hAnsi="Aptos"/>
+          <w:rFonts w:ascii="Inter" w:hAnsi="Inter"/>
           <w:b/>
           <w:i w:val="0"/>
           <w:caps w:val="0"/>
-          <w:color w:val="0B6655"/>
+          <w:color w:val="7A4F1E"/>
           <w:sz w:val="27"/>
         </w:rPr>
         <w:t>How this audit was prepared</w:t>
@@ -3167,11 +3167,11 @@
       </w:pPr>
       <w:r>
         <w:rPr>
-          <w:rFonts w:ascii="Aptos" w:hAnsi="Aptos"/>
+          <w:rFonts w:ascii="Inter" w:hAnsi="Inter"/>
           <w:b w:val="0"/>
           <w:i w:val="0"/>
           <w:caps w:val="0"/>
-          <w:color w:val="18211F"/>
+          <w:color w:val="1C1410"/>
           <w:sz w:val="21"/>
         </w:rPr>
         <w:t>This report is based on the discovery assessment provided by the business. Findings are limited to the evidence captured during that assessment and are prioritised by likely commercial impact, urgency, implementation effort and speed to visible improvement.</w:t>
@@ -3185,11 +3185,11 @@
       </w:pPr>
       <w:r>
         <w:rPr>
-          <w:rFonts w:ascii="Aptos" w:hAnsi="Aptos"/>
+          <w:rFonts w:ascii="Inter" w:hAnsi="Inter"/>
           <w:b/>
           <w:i w:val="0"/>
           <w:caps w:val="0"/>
-          <w:color w:val="0B6655"/>
+          <w:color w:val="7A4F1E"/>
           <w:sz w:val="27"/>
         </w:rPr>
         <w:t>Important note</w:t>
@@ -3203,11 +3203,11 @@
       </w:pPr>
       <w:r>
         <w:rPr>
-          <w:rFonts w:ascii="Aptos" w:hAnsi="Aptos"/>
+          <w:rFonts w:ascii="Inter" w:hAnsi="Inter"/>
           <w:b w:val="0"/>
           <w:i/>
           <w:caps w:val="0"/>
-          <w:color w:val="5F6C68"/>
+          <w:color w:val="6B5E52"/>
           <w:sz w:val="21"/>
         </w:rPr>
         <w:t>The score is a decision aid, not a financial forecast. Any implementation should be confirmed against the business’s actual call volumes, quote data, software configuration and operating constraints.</w:t>
@@ -3218,7 +3218,7 @@
         <w:keepNext w:val="0"/>
         <w:spacing w:before="0" w:after="240" w:line="240" w:lineRule="auto"/>
         <w:pBdr>
-          <w:bottom w:val="single" w:sz="6" w:space="1" w:color="CBD5D1"/>
+          <w:bottom w:val="single" w:sz="6" w:space="1" w:color="DDD5C8"/>
         </w:pBdr>
       </w:pPr>
     </w:p>
@@ -3230,11 +3230,11 @@
       </w:pPr>
       <w:r>
         <w:rPr>
-          <w:rFonts w:ascii="Aptos" w:hAnsi="Aptos"/>
+          <w:rFonts w:ascii="Inter" w:hAnsi="Inter"/>
           <w:b/>
           <w:i w:val="0"/>
           <w:caps w:val="0"/>
-          <w:color w:val="08483D"/>
+          <w:color w:val="1C1410"/>
           <w:sz w:val="26"/>
         </w:rPr>
         <w:t>AI Business Audit</w:t>
@@ -3248,11 +3248,11 @@
       </w:pPr>
       <w:r>
         <w:rPr>
-          <w:rFonts w:ascii="Aptos" w:hAnsi="Aptos"/>
+          <w:rFonts w:ascii="Inter" w:hAnsi="Inter"/>
           <w:b w:val="0"/>
           <w:i w:val="0"/>
           <w:caps w:val="0"/>
-          <w:color w:val="5F6C68"/>
+          <w:color w:val="6B5E52"/>
           <w:sz w:val="20"/>
         </w:rPr>
         <w:t>Find the revenue leaks. Fix the highest-impact workflow first.</w:t>
@@ -3266,11 +3266,11 @@
       </w:pPr>
       <w:r>
         <w:rPr>
-          <w:rFonts w:ascii="Aptos" w:hAnsi="Aptos"/>
+          <w:rFonts w:ascii="Inter" w:hAnsi="Inter"/>
           <w:b w:val="0"/>
           <w:i/>
           <w:caps w:val="0"/>
-          <w:color w:val="5F6C68"/>
+          <w:color w:val="6B5E52"/>
           <w:sz w:val="18"/>
         </w:rPr>
         <w:t>Prepared for discussion with Hugh.</w:t>
@@ -3317,7 +3317,7 @@
             <w:end w:w="0" w:type="dxa"/>
           </w:tcMar>
           <w:tcBorders>
-            <w:top w:val="single" w:sz="5" w:color="CBD5D1"/>
+            <w:top w:val="single" w:sz="5" w:color="DDD5C8"/>
           </w:tcBorders>
         </w:tcPr>
         <w:p>
@@ -3327,11 +3327,11 @@
           </w:pPr>
           <w:r>
             <w:rPr>
-              <w:rFonts w:ascii="Aptos" w:hAnsi="Aptos"/>
+              <w:rFonts w:ascii="Inter" w:hAnsi="Inter"/>
               <w:b w:val="0"/>
               <w:i w:val="0"/>
               <w:caps w:val="0"/>
-              <w:color w:val="5F6C68"/>
+              <w:color w:val="6B5E52"/>
               <w:sz w:val="15"/>
             </w:rPr>
             <w:t>Confidential | Prepared for BrightSpark Electrical</w:t>
@@ -3348,7 +3348,7 @@
             <w:end w:w="0" w:type="dxa"/>
           </w:tcMar>
           <w:tcBorders>
-            <w:top w:val="single" w:sz="5" w:color="CBD5D1"/>
+            <w:top w:val="single" w:sz="5" w:color="DDD5C8"/>
           </w:tcBorders>
         </w:tcPr>
         <w:p>
@@ -3359,11 +3359,11 @@
           </w:pPr>
           <w:r>
             <w:rPr>
-              <w:rFonts w:ascii="Aptos" w:hAnsi="Aptos"/>
+              <w:rFonts w:ascii="Inter" w:hAnsi="Inter"/>
               <w:b w:val="0"/>
               <w:i w:val="0"/>
               <w:caps w:val="0"/>
-              <w:color w:val="5F6C68"/>
+              <w:color w:val="6B5E52"/>
               <w:sz w:val="15"/>
             </w:rPr>
             <w:t>Design prototype | June 2026</w:t>
@@ -3386,11 +3386,11 @@
     </w:pPr>
     <w:r>
       <w:rPr>
-        <w:rFonts w:ascii="Aptos" w:hAnsi="Aptos"/>
+        <w:rFonts w:ascii="Inter" w:hAnsi="Inter"/>
         <w:b/>
         <w:i w:val="0"/>
         <w:caps/>
-        <w:color w:val="0B6655"/>
+        <w:color w:val="7A4F1E"/>
         <w:sz w:val="16"/>
       </w:rPr>
       <w:t>AI BUSINESS AUDIT</w:t>
@@ -3766,8 +3766,8 @@
       <w:spacing w:after="160" w:line="293" w:lineRule="auto"/>
     </w:pPr>
     <w:rPr>
-      <w:rFonts w:ascii="Aptos" w:hAnsi="Aptos"/>
-      <w:color w:val="18211F"/>
+      <w:rFonts w:ascii="Inter" w:hAnsi="Inter"/>
+      <w:color w:val="1C1410"/>
       <w:sz w:val="21"/>
     </w:rPr>
   </w:style>
@@ -3830,10 +3830,10 @@
       <w:outlineLvl w:val="0"/>
     </w:pPr>
     <w:rPr>
-      <w:rFonts w:asciiTheme="majorHAnsi" w:eastAsiaTheme="majorEastAsia" w:hAnsiTheme="majorHAnsi" w:cstheme="majorBidi" w:ascii="Aptos" w:hAnsi="Aptos"/>
+      <w:rFonts w:asciiTheme="majorHAnsi" w:eastAsiaTheme="majorEastAsia" w:hAnsiTheme="majorHAnsi" w:cstheme="majorBidi" w:ascii="Inter" w:hAnsi="Inter"/>
       <w:b/>
       <w:bCs/>
-      <w:color w:val="08483D"/>
+      <w:color w:val="1C1410"/>
       <w:sz w:val="36"/>
       <w:szCs w:val="28"/>
     </w:rPr>
@@ -3854,11 +3854,11 @@
       <w:outlineLvl w:val="1"/>
     </w:pPr>
     <w:rPr>
-      <w:rFonts w:asciiTheme="majorHAnsi" w:eastAsiaTheme="majorEastAsia" w:hAnsiTheme="majorHAnsi" w:cstheme="majorBidi" w:ascii="Aptos" w:hAnsi="Aptos"/>
+      <w:rFonts w:asciiTheme="majorHAnsi" w:eastAsiaTheme="majorEastAsia" w:hAnsiTheme="majorHAnsi" w:cstheme="majorBidi" w:ascii="Inter" w:hAnsi="Inter"/>
       <w:b/>
       <w:bCs/>
-      <w:color w:val="0B6655"/>
-      <w:sz w:val="27"/>
+      <w:color w:val="7A4F1E"/>
+      <w:sz w:val="30"/>
       <w:szCs w:val="26"/>
     </w:rPr>
   </w:style>
@@ -3878,11 +3878,11 @@
       <w:outlineLvl w:val="2"/>
     </w:pPr>
     <w:rPr>
-      <w:rFonts w:asciiTheme="majorHAnsi" w:eastAsiaTheme="majorEastAsia" w:hAnsiTheme="majorHAnsi" w:cstheme="majorBidi" w:ascii="Aptos" w:hAnsi="Aptos"/>
+      <w:rFonts w:asciiTheme="majorHAnsi" w:eastAsiaTheme="majorEastAsia" w:hAnsiTheme="majorHAnsi" w:cstheme="majorBidi" w:ascii="Inter" w:hAnsi="Inter"/>
       <w:b/>
       <w:bCs/>
-      <w:color w:val="18211F"/>
-      <w:sz w:val="23"/>
+      <w:color w:val="1C1410"/>
+      <w:sz w:val="24"/>
     </w:rPr>
   </w:style>
   <w:style w:type="paragraph" w:styleId="Heading4">
@@ -4303,7 +4303,7 @@
       <w:contextualSpacing/>
     </w:pPr>
     <w:rPr>
-      <w:rFonts w:ascii="Aptos" w:hAnsi="Aptos"/>
+      <w:rFonts w:ascii="Inter" w:hAnsi="Inter"/>
       <w:sz w:val="20"/>
     </w:rPr>
   </w:style>

</xml_diff>

<commit_message>
Report exporter: Volve palette (#7)
* Recolour XLSX report exporter to Volve palette

* Make all report outputs consistent: Inter + Volve palette

---------

Co-authored-by: Hugh Douglas <noreply@example.com>
</commit_message>
<xml_diff>
--- a/docs/report-prototype/AI-Business-Audit-Premium-Report-Prototype.docx
+++ b/docs/report-prototype/AI-Business-Audit-Premium-Report-Prototype.docx
@@ -10,11 +10,11 @@
       </w:pPr>
       <w:r>
         <w:rPr>
-          <w:rFonts w:ascii="Aptos" w:hAnsi="Aptos"/>
+          <w:rFonts w:ascii="Inter" w:hAnsi="Inter"/>
           <w:b/>
           <w:i w:val="0"/>
           <w:caps/>
-          <w:color w:val="0B6655"/>
+          <w:color w:val="7A4F1E"/>
           <w:sz w:val="18"/>
         </w:rPr>
         <w:t>AI BUSINESS AUDIT</w:t>
@@ -28,11 +28,11 @@
       </w:pPr>
       <w:r>
         <w:rPr>
-          <w:rFonts w:ascii="Aptos" w:hAnsi="Aptos"/>
+          <w:rFonts w:ascii="Inter" w:hAnsi="Inter"/>
           <w:b/>
           <w:i w:val="0"/>
           <w:caps w:val="0"/>
-          <w:color w:val="08483D"/>
+          <w:color w:val="1C1410"/>
           <w:sz w:val="62"/>
         </w:rPr>
         <w:t>Revenue &amp; Operations</w:t>
@@ -48,11 +48,11 @@
       </w:pPr>
       <w:r>
         <w:rPr>
-          <w:rFonts w:ascii="Aptos" w:hAnsi="Aptos"/>
+          <w:rFonts w:ascii="Inter" w:hAnsi="Inter"/>
           <w:b w:val="0"/>
           <w:i w:val="0"/>
           <w:caps w:val="0"/>
-          <w:color w:val="5F6C68"/>
+          <w:color w:val="6B5E52"/>
           <w:sz w:val="28"/>
         </w:rPr>
         <w:t>A practical diagnosis of where leads, follow-up and operational capacity are leaking revenue.</w:t>
@@ -63,7 +63,7 @@
         <w:keepNext w:val="0"/>
         <w:spacing w:before="0" w:after="440" w:line="240" w:lineRule="auto"/>
         <w:pBdr>
-          <w:bottom w:val="single" w:sz="18" w:space="1" w:color="0B6655"/>
+          <w:bottom w:val="single" w:sz="18" w:space="1" w:color="7A4F1E"/>
         </w:pBdr>
       </w:pPr>
     </w:p>
@@ -75,11 +75,11 @@
       </w:pPr>
       <w:r>
         <w:rPr>
-          <w:rFonts w:ascii="Aptos" w:hAnsi="Aptos"/>
+          <w:rFonts w:ascii="Inter" w:hAnsi="Inter"/>
           <w:b/>
           <w:i w:val="0"/>
           <w:caps/>
-          <w:color w:val="5F6C68"/>
+          <w:color w:val="6B5E52"/>
           <w:sz w:val="16"/>
         </w:rPr>
         <w:t>PREPARED FOR</w:t>
@@ -93,11 +93,11 @@
       </w:pPr>
       <w:r>
         <w:rPr>
-          <w:rFonts w:ascii="Aptos" w:hAnsi="Aptos"/>
+          <w:rFonts w:ascii="Inter" w:hAnsi="Inter"/>
           <w:b/>
           <w:i w:val="0"/>
           <w:caps w:val="0"/>
-          <w:color w:val="18211F"/>
+          <w:color w:val="1C1410"/>
           <w:sz w:val="38"/>
         </w:rPr>
         <w:t>BrightSpark Electrical</w:t>
@@ -111,11 +111,11 @@
       </w:pPr>
       <w:r>
         <w:rPr>
-          <w:rFonts w:ascii="Aptos" w:hAnsi="Aptos"/>
+          <w:rFonts w:ascii="Inter" w:hAnsi="Inter"/>
           <w:b w:val="0"/>
           <w:i w:val="0"/>
           <w:caps w:val="0"/>
-          <w:color w:val="5F6C68"/>
+          <w:color w:val="6B5E52"/>
           <w:sz w:val="21"/>
         </w:rPr>
         <w:t>Electricians &amp; Small Electrical Contractors</w:t>
@@ -137,7 +137,7 @@
         <w:tc>
           <w:tcPr>
             <w:tcW w:type="dxa" w:w="3120"/>
-            <w:shd w:fill="08483D"/>
+            <w:shd w:fill="1C1410"/>
             <w:tcMar>
               <w:top w:w="150" w:type="dxa"/>
               <w:start w:w="130" w:type="dxa"/>
@@ -145,10 +145,10 @@
               <w:end w:w="130" w:type="dxa"/>
             </w:tcMar>
             <w:tcBorders>
-              <w:top w:val="single" w:sz="6" w:color="CBD5D1"/>
-              <w:left w:val="single" w:sz="6" w:color="CBD5D1"/>
-              <w:bottom w:val="single" w:sz="6" w:color="CBD5D1"/>
-              <w:right w:val="single" w:sz="6" w:color="CBD5D1"/>
+              <w:top w:val="single" w:sz="6" w:color="DDD5C8"/>
+              <w:left w:val="single" w:sz="6" w:color="DDD5C8"/>
+              <w:bottom w:val="single" w:sz="6" w:color="DDD5C8"/>
+              <w:right w:val="single" w:sz="6" w:color="DDD5C8"/>
             </w:tcBorders>
             <w:vAlign w:val="center"/>
           </w:tcPr>
@@ -160,11 +160,11 @@
             </w:pPr>
             <w:r>
               <w:rPr>
-                <w:rFonts w:ascii="Aptos" w:hAnsi="Aptos"/>
+                <w:rFonts w:ascii="Inter" w:hAnsi="Inter"/>
                 <w:b/>
                 <w:i w:val="0"/>
                 <w:caps w:val="0"/>
-                <w:color w:val="FFFFFF"/>
+                <w:color w:val="F9F6F1"/>
                 <w:sz w:val="38"/>
               </w:rPr>
               <w:t>6.2</w:t>
@@ -178,11 +178,11 @@
             </w:pPr>
             <w:r>
               <w:rPr>
-                <w:rFonts w:ascii="Aptos" w:hAnsi="Aptos"/>
+                <w:rFonts w:ascii="Inter" w:hAnsi="Inter"/>
                 <w:b/>
                 <w:i w:val="0"/>
                 <w:caps/>
-                <w:color w:val="FFFFFF"/>
+                <w:color w:val="F9F6F1"/>
                 <w:sz w:val="15"/>
               </w:rPr>
               <w:t>READINESS SCORE</w:t>
@@ -192,7 +192,7 @@
         <w:tc>
           <w:tcPr>
             <w:tcW w:type="dxa" w:w="3120"/>
-            <w:shd w:fill="F5F7F6"/>
+            <w:shd w:fill="F2EDE5"/>
             <w:tcMar>
               <w:top w:w="150" w:type="dxa"/>
               <w:start w:w="130" w:type="dxa"/>
@@ -200,10 +200,10 @@
               <w:end w:w="130" w:type="dxa"/>
             </w:tcMar>
             <w:tcBorders>
-              <w:top w:val="single" w:sz="6" w:color="CBD5D1"/>
-              <w:left w:val="single" w:sz="6" w:color="CBD5D1"/>
-              <w:bottom w:val="single" w:sz="6" w:color="CBD5D1"/>
-              <w:right w:val="single" w:sz="6" w:color="CBD5D1"/>
+              <w:top w:val="single" w:sz="6" w:color="DDD5C8"/>
+              <w:left w:val="single" w:sz="6" w:color="DDD5C8"/>
+              <w:bottom w:val="single" w:sz="6" w:color="DDD5C8"/>
+              <w:right w:val="single" w:sz="6" w:color="DDD5C8"/>
             </w:tcBorders>
             <w:vAlign w:val="center"/>
           </w:tcPr>
@@ -215,11 +215,11 @@
             </w:pPr>
             <w:r>
               <w:rPr>
-                <w:rFonts w:ascii="Aptos" w:hAnsi="Aptos"/>
+                <w:rFonts w:ascii="Inter" w:hAnsi="Inter"/>
                 <w:b/>
                 <w:i w:val="0"/>
                 <w:caps w:val="0"/>
-                <w:color w:val="08483D"/>
+                <w:color w:val="1C1410"/>
                 <w:sz w:val="38"/>
               </w:rPr>
               <w:t>3</w:t>
@@ -233,11 +233,11 @@
             </w:pPr>
             <w:r>
               <w:rPr>
-                <w:rFonts w:ascii="Aptos" w:hAnsi="Aptos"/>
+                <w:rFonts w:ascii="Inter" w:hAnsi="Inter"/>
                 <w:b/>
                 <w:i w:val="0"/>
                 <w:caps/>
-                <w:color w:val="5F6C68"/>
+                <w:color w:val="6B5E52"/>
                 <w:sz w:val="15"/>
               </w:rPr>
               <w:t>PRIORITY LEAKS</w:t>
@@ -247,7 +247,7 @@
         <w:tc>
           <w:tcPr>
             <w:tcW w:type="dxa" w:w="3120"/>
-            <w:shd w:fill="F5F7F6"/>
+            <w:shd w:fill="F2EDE5"/>
             <w:tcMar>
               <w:top w:w="150" w:type="dxa"/>
               <w:start w:w="130" w:type="dxa"/>
@@ -255,10 +255,10 @@
               <w:end w:w="130" w:type="dxa"/>
             </w:tcMar>
             <w:tcBorders>
-              <w:top w:val="single" w:sz="6" w:color="CBD5D1"/>
-              <w:left w:val="single" w:sz="6" w:color="CBD5D1"/>
-              <w:bottom w:val="single" w:sz="6" w:color="CBD5D1"/>
-              <w:right w:val="single" w:sz="6" w:color="CBD5D1"/>
+              <w:top w:val="single" w:sz="6" w:color="DDD5C8"/>
+              <w:left w:val="single" w:sz="6" w:color="DDD5C8"/>
+              <w:bottom w:val="single" w:sz="6" w:color="DDD5C8"/>
+              <w:right w:val="single" w:sz="6" w:color="DDD5C8"/>
             </w:tcBorders>
             <w:vAlign w:val="center"/>
           </w:tcPr>
@@ -270,11 +270,11 @@
             </w:pPr>
             <w:r>
               <w:rPr>
-                <w:rFonts w:ascii="Aptos" w:hAnsi="Aptos"/>
+                <w:rFonts w:ascii="Inter" w:hAnsi="Inter"/>
                 <w:b/>
                 <w:i w:val="0"/>
                 <w:caps w:val="0"/>
-                <w:color w:val="08483D"/>
+                <w:color w:val="1C1410"/>
                 <w:sz w:val="38"/>
               </w:rPr>
               <w:t>30 days</w:t>
@@ -288,11 +288,11 @@
             </w:pPr>
             <w:r>
               <w:rPr>
-                <w:rFonts w:ascii="Aptos" w:hAnsi="Aptos"/>
+                <w:rFonts w:ascii="Inter" w:hAnsi="Inter"/>
                 <w:b/>
                 <w:i w:val="0"/>
                 <w:caps/>
-                <w:color w:val="5F6C68"/>
+                <w:color w:val="6B5E52"/>
                 <w:sz w:val="15"/>
               </w:rPr>
               <w:t>FIRST ACTION HORIZON</w:t>
@@ -309,11 +309,11 @@
       </w:pPr>
       <w:r>
         <w:rPr>
-          <w:rFonts w:ascii="Aptos" w:hAnsi="Aptos"/>
+          <w:rFonts w:ascii="Inter" w:hAnsi="Inter"/>
           <w:b/>
           <w:i w:val="0"/>
           <w:caps/>
-          <w:color w:val="A46411"/>
+          <w:color w:val="C47B2E"/>
           <w:sz w:val="16"/>
         </w:rPr>
         <w:t>DESIGN PROTOTYPE</w:t>
@@ -327,11 +327,11 @@
       </w:pPr>
       <w:r>
         <w:rPr>
-          <w:rFonts w:ascii="Aptos" w:hAnsi="Aptos"/>
+          <w:rFonts w:ascii="Inter" w:hAnsi="Inter"/>
           <w:b w:val="0"/>
           <w:i/>
           <w:caps w:val="0"/>
-          <w:color w:val="5F6C68"/>
+          <w:color w:val="6B5E52"/>
           <w:sz w:val="17"/>
         </w:rPr>
         <w:t>Illustrative content only. Final reports are generated from the customer’s assessment evidence.</w:t>
@@ -350,11 +350,11 @@
       </w:pPr>
       <w:r>
         <w:rPr>
-          <w:rFonts w:ascii="Aptos" w:hAnsi="Aptos"/>
+          <w:rFonts w:ascii="Inter" w:hAnsi="Inter"/>
           <w:b/>
           <w:i w:val="0"/>
           <w:caps/>
-          <w:color w:val="0B6655"/>
+          <w:color w:val="7A4F1E"/>
           <w:sz w:val="17"/>
         </w:rPr>
         <w:t>01 | EXECUTIVE DIAGNOSIS</w:t>
@@ -368,11 +368,11 @@
       </w:pPr>
       <w:r>
         <w:rPr>
-          <w:rFonts w:ascii="Aptos" w:hAnsi="Aptos"/>
+          <w:rFonts w:ascii="Inter" w:hAnsi="Inter"/>
           <w:b/>
           <w:i w:val="0"/>
           <w:caps w:val="0"/>
-          <w:color w:val="08483D"/>
+          <w:color w:val="1C1410"/>
           <w:sz w:val="36"/>
         </w:rPr>
         <w:t>The business has demand. The leakage is happening after the enquiry arrives.</w:t>
@@ -386,11 +386,11 @@
       </w:pPr>
       <w:r>
         <w:rPr>
-          <w:rFonts w:ascii="Aptos" w:hAnsi="Aptos"/>
+          <w:rFonts w:ascii="Inter" w:hAnsi="Inter"/>
           <w:b w:val="0"/>
           <w:i w:val="0"/>
           <w:caps w:val="0"/>
-          <w:color w:val="18211F"/>
+          <w:color w:val="1C1410"/>
           <w:sz w:val="21"/>
         </w:rPr>
         <w:t>BrightSpark Electrical appears to have a healthy flow of referral and Google enquiries, but the current response and quote-follow-up process depends too heavily on whoever is available at the time. The result is not a lack of leads; it is inconsistent conversion of the leads already being paid for.</w:t>
@@ -410,7 +410,7 @@
         <w:tc>
           <w:tcPr>
             <w:tcW w:type="dxa" w:w="9360"/>
-            <w:shd w:fill="E8F2EF"/>
+            <w:shd w:fill="FDF4E7"/>
             <w:tcMar>
               <w:top w:w="200" w:type="dxa"/>
               <w:start w:w="220" w:type="dxa"/>
@@ -418,7 +418,7 @@
               <w:end w:w="220" w:type="dxa"/>
             </w:tcMar>
             <w:tcBorders>
-              <w:left w:val="single" w:sz="24" w:color="0B6655"/>
+              <w:left w:val="single" w:sz="24" w:color="7A4F1E"/>
             </w:tcBorders>
           </w:tcPr>
           <w:p>
@@ -428,11 +428,11 @@
             </w:pPr>
             <w:r>
               <w:rPr>
-                <w:rFonts w:ascii="Aptos" w:hAnsi="Aptos"/>
+                <w:rFonts w:ascii="Inter" w:hAnsi="Inter"/>
                 <w:b/>
                 <w:i w:val="0"/>
                 <w:caps/>
-                <w:color w:val="0B6655"/>
+                <w:color w:val="7A4F1E"/>
                 <w:sz w:val="16"/>
               </w:rPr>
               <w:t>HIGHEST-IMPACT ISSUE</w:t>
@@ -445,11 +445,11 @@
             </w:pPr>
             <w:r>
               <w:rPr>
-                <w:rFonts w:ascii="Aptos" w:hAnsi="Aptos"/>
+                <w:rFonts w:ascii="Inter" w:hAnsi="Inter"/>
                 <w:b/>
                 <w:i w:val="0"/>
                 <w:caps w:val="0"/>
-                <w:color w:val="18211F"/>
+                <w:color w:val="1C1410"/>
                 <w:sz w:val="28"/>
               </w:rPr>
               <w:t>Warm enquiries and issued quotes are not being followed through consistently.</w:t>
@@ -462,11 +462,11 @@
             </w:pPr>
             <w:r>
               <w:rPr>
-                <w:rFonts w:ascii="Aptos" w:hAnsi="Aptos"/>
+                <w:rFonts w:ascii="Inter" w:hAnsi="Inter"/>
                 <w:b w:val="0"/>
                 <w:i w:val="0"/>
                 <w:caps w:val="0"/>
-                <w:color w:val="5F6C68"/>
+                <w:color w:val="6B5E52"/>
                 <w:sz w:val="20"/>
               </w:rPr>
               <w:t>Missed calls are returned manually, quote reminders are not owned by one role, and there is no reliable view of how many opportunities go cold. This creates invisible revenue loss and makes marketing performance look weaker than it may actually be.</w:t>
@@ -483,11 +483,11 @@
       </w:pPr>
       <w:r>
         <w:rPr>
-          <w:rFonts w:ascii="Aptos" w:hAnsi="Aptos"/>
+          <w:rFonts w:ascii="Inter" w:hAnsi="Inter"/>
           <w:b/>
           <w:i w:val="0"/>
           <w:caps w:val="0"/>
-          <w:color w:val="0B6655"/>
+          <w:color w:val="7A4F1E"/>
           <w:sz w:val="27"/>
         </w:rPr>
         <w:t>What matters most now</w:t>
@@ -508,7 +508,7 @@
         <w:tc>
           <w:tcPr>
             <w:tcW w:type="dxa" w:w="720"/>
-            <w:shd w:fill="0B6655"/>
+            <w:shd w:fill="7A4F1E"/>
             <w:tcMar>
               <w:top w:w="120" w:type="dxa"/>
               <w:start w:w="150" w:type="dxa"/>
@@ -516,7 +516,7 @@
               <w:end w:w="150" w:type="dxa"/>
             </w:tcMar>
             <w:tcBorders>
-              <w:bottom w:val="single" w:sz="6" w:color="CBD5D1"/>
+              <w:bottom w:val="single" w:sz="6" w:color="DDD5C8"/>
             </w:tcBorders>
             <w:vAlign w:val="center"/>
           </w:tcPr>
@@ -528,11 +528,11 @@
             </w:pPr>
             <w:r>
               <w:rPr>
-                <w:rFonts w:ascii="Aptos" w:hAnsi="Aptos"/>
+                <w:rFonts w:ascii="Inter" w:hAnsi="Inter"/>
                 <w:b/>
                 <w:i w:val="0"/>
                 <w:caps w:val="0"/>
-                <w:color w:val="FFFFFF"/>
+                <w:color w:val="F9F6F1"/>
                 <w:sz w:val="28"/>
               </w:rPr>
               <w:t>1</w:t>
@@ -542,7 +542,7 @@
         <w:tc>
           <w:tcPr>
             <w:tcW w:type="dxa" w:w="8640"/>
-            <w:shd w:fill="F5F7F6"/>
+            <w:shd w:fill="F2EDE5"/>
             <w:tcMar>
               <w:top w:w="120" w:type="dxa"/>
               <w:start w:w="150" w:type="dxa"/>
@@ -550,7 +550,7 @@
               <w:end w:w="150" w:type="dxa"/>
             </w:tcMar>
             <w:tcBorders>
-              <w:bottom w:val="single" w:sz="6" w:color="CBD5D1"/>
+              <w:bottom w:val="single" w:sz="6" w:color="DDD5C8"/>
             </w:tcBorders>
             <w:vAlign w:val="center"/>
           </w:tcPr>
@@ -561,11 +561,11 @@
             </w:pPr>
             <w:r>
               <w:rPr>
-                <w:rFonts w:ascii="Aptos" w:hAnsi="Aptos"/>
+                <w:rFonts w:ascii="Inter" w:hAnsi="Inter"/>
                 <w:b/>
                 <w:i w:val="0"/>
                 <w:caps w:val="0"/>
-                <w:color w:val="18211F"/>
+                <w:color w:val="1C1410"/>
                 <w:sz w:val="21"/>
               </w:rPr>
               <w:t>Recover missed enquiries quickly</w:t>
@@ -578,11 +578,11 @@
             </w:pPr>
             <w:r>
               <w:rPr>
-                <w:rFonts w:ascii="Aptos" w:hAnsi="Aptos"/>
+                <w:rFonts w:ascii="Inter" w:hAnsi="Inter"/>
                 <w:b w:val="0"/>
                 <w:i w:val="0"/>
                 <w:caps w:val="0"/>
-                <w:color w:val="5F6C68"/>
+                <w:color w:val="6B5E52"/>
                 <w:sz w:val="19"/>
               </w:rPr>
               <w:t>Create an immediate text-back and clear callback ownership for calls that are not answered.</w:t>
@@ -611,7 +611,7 @@
         <w:tc>
           <w:tcPr>
             <w:tcW w:type="dxa" w:w="720"/>
-            <w:shd w:fill="0B6655"/>
+            <w:shd w:fill="7A4F1E"/>
             <w:tcMar>
               <w:top w:w="120" w:type="dxa"/>
               <w:start w:w="150" w:type="dxa"/>
@@ -619,7 +619,7 @@
               <w:end w:w="150" w:type="dxa"/>
             </w:tcMar>
             <w:tcBorders>
-              <w:bottom w:val="single" w:sz="6" w:color="CBD5D1"/>
+              <w:bottom w:val="single" w:sz="6" w:color="DDD5C8"/>
             </w:tcBorders>
             <w:vAlign w:val="center"/>
           </w:tcPr>
@@ -631,11 +631,11 @@
             </w:pPr>
             <w:r>
               <w:rPr>
-                <w:rFonts w:ascii="Aptos" w:hAnsi="Aptos"/>
+                <w:rFonts w:ascii="Inter" w:hAnsi="Inter"/>
                 <w:b/>
                 <w:i w:val="0"/>
                 <w:caps w:val="0"/>
-                <w:color w:val="FFFFFF"/>
+                <w:color w:val="F9F6F1"/>
                 <w:sz w:val="28"/>
               </w:rPr>
               <w:t>2</w:t>
@@ -645,7 +645,7 @@
         <w:tc>
           <w:tcPr>
             <w:tcW w:type="dxa" w:w="8640"/>
-            <w:shd w:fill="F5F7F6"/>
+            <w:shd w:fill="F2EDE5"/>
             <w:tcMar>
               <w:top w:w="120" w:type="dxa"/>
               <w:start w:w="150" w:type="dxa"/>
@@ -653,7 +653,7 @@
               <w:end w:w="150" w:type="dxa"/>
             </w:tcMar>
             <w:tcBorders>
-              <w:bottom w:val="single" w:sz="6" w:color="CBD5D1"/>
+              <w:bottom w:val="single" w:sz="6" w:color="DDD5C8"/>
             </w:tcBorders>
             <w:vAlign w:val="center"/>
           </w:tcPr>
@@ -664,11 +664,11 @@
             </w:pPr>
             <w:r>
               <w:rPr>
-                <w:rFonts w:ascii="Aptos" w:hAnsi="Aptos"/>
+                <w:rFonts w:ascii="Inter" w:hAnsi="Inter"/>
                 <w:b/>
                 <w:i w:val="0"/>
                 <w:caps w:val="0"/>
-                <w:color w:val="18211F"/>
+                <w:color w:val="1C1410"/>
                 <w:sz w:val="21"/>
               </w:rPr>
               <w:t>Make quote follow-up systematic</w:t>
@@ -681,11 +681,11 @@
             </w:pPr>
             <w:r>
               <w:rPr>
-                <w:rFonts w:ascii="Aptos" w:hAnsi="Aptos"/>
+                <w:rFonts w:ascii="Inter" w:hAnsi="Inter"/>
                 <w:b w:val="0"/>
                 <w:i w:val="0"/>
                 <w:caps w:val="0"/>
-                <w:color w:val="5F6C68"/>
+                <w:color w:val="6B5E52"/>
                 <w:sz w:val="19"/>
               </w:rPr>
               <w:t>Use a simple two-step follow-up sequence with visible status and a named owner.</w:t>
@@ -714,7 +714,7 @@
         <w:tc>
           <w:tcPr>
             <w:tcW w:type="dxa" w:w="720"/>
-            <w:shd w:fill="0B6655"/>
+            <w:shd w:fill="7A4F1E"/>
             <w:tcMar>
               <w:top w:w="120" w:type="dxa"/>
               <w:start w:w="150" w:type="dxa"/>
@@ -722,7 +722,7 @@
               <w:end w:w="150" w:type="dxa"/>
             </w:tcMar>
             <w:tcBorders>
-              <w:bottom w:val="single" w:sz="6" w:color="CBD5D1"/>
+              <w:bottom w:val="single" w:sz="6" w:color="DDD5C8"/>
             </w:tcBorders>
             <w:vAlign w:val="center"/>
           </w:tcPr>
@@ -734,11 +734,11 @@
             </w:pPr>
             <w:r>
               <w:rPr>
-                <w:rFonts w:ascii="Aptos" w:hAnsi="Aptos"/>
+                <w:rFonts w:ascii="Inter" w:hAnsi="Inter"/>
                 <w:b/>
                 <w:i w:val="0"/>
                 <w:caps w:val="0"/>
-                <w:color w:val="FFFFFF"/>
+                <w:color w:val="F9F6F1"/>
                 <w:sz w:val="28"/>
               </w:rPr>
               <w:t>3</w:t>
@@ -748,7 +748,7 @@
         <w:tc>
           <w:tcPr>
             <w:tcW w:type="dxa" w:w="8640"/>
-            <w:shd w:fill="F5F7F6"/>
+            <w:shd w:fill="F2EDE5"/>
             <w:tcMar>
               <w:top w:w="120" w:type="dxa"/>
               <w:start w:w="150" w:type="dxa"/>
@@ -756,7 +756,7 @@
               <w:end w:w="150" w:type="dxa"/>
             </w:tcMar>
             <w:tcBorders>
-              <w:bottom w:val="single" w:sz="6" w:color="CBD5D1"/>
+              <w:bottom w:val="single" w:sz="6" w:color="DDD5C8"/>
             </w:tcBorders>
             <w:vAlign w:val="center"/>
           </w:tcPr>
@@ -767,11 +767,11 @@
             </w:pPr>
             <w:r>
               <w:rPr>
-                <w:rFonts w:ascii="Aptos" w:hAnsi="Aptos"/>
+                <w:rFonts w:ascii="Inter" w:hAnsi="Inter"/>
                 <w:b/>
                 <w:i w:val="0"/>
                 <w:caps w:val="0"/>
-                <w:color w:val="18211F"/>
+                <w:color w:val="1C1410"/>
                 <w:sz w:val="21"/>
               </w:rPr>
               <w:t>Close the loop after completed work</w:t>
@@ -784,11 +784,11 @@
             </w:pPr>
             <w:r>
               <w:rPr>
-                <w:rFonts w:ascii="Aptos" w:hAnsi="Aptos"/>
+                <w:rFonts w:ascii="Inter" w:hAnsi="Inter"/>
                 <w:b w:val="0"/>
                 <w:i w:val="0"/>
                 <w:caps w:val="0"/>
-                <w:color w:val="5F6C68"/>
+                <w:color w:val="6B5E52"/>
                 <w:sz w:val="19"/>
               </w:rPr>
               <w:t>Trigger review requests and next-step prompts while customer satisfaction is highest.</w:t>
@@ -810,11 +810,11 @@
       </w:pPr>
       <w:r>
         <w:rPr>
-          <w:rFonts w:ascii="Aptos" w:hAnsi="Aptos"/>
+          <w:rFonts w:ascii="Inter" w:hAnsi="Inter"/>
           <w:b/>
           <w:i w:val="0"/>
           <w:caps w:val="0"/>
-          <w:color w:val="0B6655"/>
+          <w:color w:val="7A4F1E"/>
           <w:sz w:val="27"/>
         </w:rPr>
         <w:t>Assessment confidence</w:t>
@@ -828,11 +828,11 @@
       </w:pPr>
       <w:r>
         <w:rPr>
-          <w:rFonts w:ascii="Aptos" w:hAnsi="Aptos"/>
+          <w:rFonts w:ascii="Inter" w:hAnsi="Inter"/>
           <w:b w:val="0"/>
           <w:i w:val="0"/>
           <w:caps w:val="0"/>
-          <w:color w:val="18211F"/>
+          <w:color w:val="1C1410"/>
           <w:sz w:val="21"/>
         </w:rPr>
         <w:t>High. The priority issues are specific, commercially relevant, and can be improved without replacing the entire software stack.</w:t>
@@ -851,11 +851,11 @@
       </w:pPr>
       <w:r>
         <w:rPr>
-          <w:rFonts w:ascii="Aptos" w:hAnsi="Aptos"/>
+          <w:rFonts w:ascii="Inter" w:hAnsi="Inter"/>
           <w:b/>
           <w:i w:val="0"/>
           <w:caps/>
-          <w:color w:val="0B6655"/>
+          <w:color w:val="7A4F1E"/>
           <w:sz w:val="17"/>
         </w:rPr>
         <w:t>02 | READINESS PROFILE</w:t>
@@ -869,11 +869,11 @@
       </w:pPr>
       <w:r>
         <w:rPr>
-          <w:rFonts w:ascii="Aptos" w:hAnsi="Aptos"/>
+          <w:rFonts w:ascii="Inter" w:hAnsi="Inter"/>
           <w:b/>
           <w:i w:val="0"/>
           <w:caps w:val="0"/>
-          <w:color w:val="08483D"/>
+          <w:color w:val="1C1410"/>
           <w:sz w:val="36"/>
         </w:rPr>
         <w:t>A capable business with inconsistent commercial follow-through</w:t>
@@ -897,7 +897,7 @@
         <w:tc>
           <w:tcPr>
             <w:tcW w:type="dxa" w:w="1872"/>
-            <w:shd w:fill="08483D"/>
+            <w:shd w:fill="1C1410"/>
             <w:tcMar>
               <w:top w:w="150" w:type="dxa"/>
               <w:start w:w="130" w:type="dxa"/>
@@ -905,10 +905,10 @@
               <w:end w:w="130" w:type="dxa"/>
             </w:tcMar>
             <w:tcBorders>
-              <w:top w:val="single" w:sz="6" w:color="CBD5D1"/>
-              <w:left w:val="single" w:sz="6" w:color="CBD5D1"/>
-              <w:bottom w:val="single" w:sz="6" w:color="CBD5D1"/>
-              <w:right w:val="single" w:sz="6" w:color="CBD5D1"/>
+              <w:top w:val="single" w:sz="6" w:color="DDD5C8"/>
+              <w:left w:val="single" w:sz="6" w:color="DDD5C8"/>
+              <w:bottom w:val="single" w:sz="6" w:color="DDD5C8"/>
+              <w:right w:val="single" w:sz="6" w:color="DDD5C8"/>
             </w:tcBorders>
             <w:vAlign w:val="center"/>
           </w:tcPr>
@@ -920,11 +920,11 @@
             </w:pPr>
             <w:r>
               <w:rPr>
-                <w:rFonts w:ascii="Aptos" w:hAnsi="Aptos"/>
+                <w:rFonts w:ascii="Inter" w:hAnsi="Inter"/>
                 <w:b/>
                 <w:i w:val="0"/>
                 <w:caps w:val="0"/>
-                <w:color w:val="FFFFFF"/>
+                <w:color w:val="F9F6F1"/>
                 <w:sz w:val="38"/>
               </w:rPr>
               <w:t>6.2</w:t>
@@ -938,11 +938,11 @@
             </w:pPr>
             <w:r>
               <w:rPr>
-                <w:rFonts w:ascii="Aptos" w:hAnsi="Aptos"/>
+                <w:rFonts w:ascii="Inter" w:hAnsi="Inter"/>
                 <w:b/>
                 <w:i w:val="0"/>
                 <w:caps/>
-                <w:color w:val="FFFFFF"/>
+                <w:color w:val="F9F6F1"/>
                 <w:sz w:val="15"/>
               </w:rPr>
               <w:t>OVERALL</w:t>
@@ -952,7 +952,7 @@
         <w:tc>
           <w:tcPr>
             <w:tcW w:type="dxa" w:w="1872"/>
-            <w:shd w:fill="F5F7F6"/>
+            <w:shd w:fill="F2EDE5"/>
             <w:tcMar>
               <w:top w:w="150" w:type="dxa"/>
               <w:start w:w="130" w:type="dxa"/>
@@ -960,10 +960,10 @@
               <w:end w:w="130" w:type="dxa"/>
             </w:tcMar>
             <w:tcBorders>
-              <w:top w:val="single" w:sz="6" w:color="CBD5D1"/>
-              <w:left w:val="single" w:sz="6" w:color="CBD5D1"/>
-              <w:bottom w:val="single" w:sz="6" w:color="CBD5D1"/>
-              <w:right w:val="single" w:sz="6" w:color="CBD5D1"/>
+              <w:top w:val="single" w:sz="6" w:color="DDD5C8"/>
+              <w:left w:val="single" w:sz="6" w:color="DDD5C8"/>
+              <w:bottom w:val="single" w:sz="6" w:color="DDD5C8"/>
+              <w:right w:val="single" w:sz="6" w:color="DDD5C8"/>
             </w:tcBorders>
             <w:vAlign w:val="center"/>
           </w:tcPr>
@@ -975,11 +975,11 @@
             </w:pPr>
             <w:r>
               <w:rPr>
-                <w:rFonts w:ascii="Aptos" w:hAnsi="Aptos"/>
+                <w:rFonts w:ascii="Inter" w:hAnsi="Inter"/>
                 <w:b/>
                 <w:i w:val="0"/>
                 <w:caps w:val="0"/>
-                <w:color w:val="08483D"/>
+                <w:color w:val="1C1410"/>
                 <w:sz w:val="38"/>
               </w:rPr>
               <w:t>5</w:t>
@@ -993,11 +993,11 @@
             </w:pPr>
             <w:r>
               <w:rPr>
-                <w:rFonts w:ascii="Aptos" w:hAnsi="Aptos"/>
+                <w:rFonts w:ascii="Inter" w:hAnsi="Inter"/>
                 <w:b/>
                 <w:i w:val="0"/>
                 <w:caps/>
-                <w:color w:val="5F6C68"/>
+                <w:color w:val="6B5E52"/>
                 <w:sz w:val="15"/>
               </w:rPr>
               <w:t>LEAD RESPONSE</w:t>
@@ -1007,7 +1007,7 @@
         <w:tc>
           <w:tcPr>
             <w:tcW w:type="dxa" w:w="1872"/>
-            <w:shd w:fill="F5F7F6"/>
+            <w:shd w:fill="F2EDE5"/>
             <w:tcMar>
               <w:top w:w="150" w:type="dxa"/>
               <w:start w:w="130" w:type="dxa"/>
@@ -1015,10 +1015,10 @@
               <w:end w:w="130" w:type="dxa"/>
             </w:tcMar>
             <w:tcBorders>
-              <w:top w:val="single" w:sz="6" w:color="CBD5D1"/>
-              <w:left w:val="single" w:sz="6" w:color="CBD5D1"/>
-              <w:bottom w:val="single" w:sz="6" w:color="CBD5D1"/>
-              <w:right w:val="single" w:sz="6" w:color="CBD5D1"/>
+              <w:top w:val="single" w:sz="6" w:color="DDD5C8"/>
+              <w:left w:val="single" w:sz="6" w:color="DDD5C8"/>
+              <w:bottom w:val="single" w:sz="6" w:color="DDD5C8"/>
+              <w:right w:val="single" w:sz="6" w:color="DDD5C8"/>
             </w:tcBorders>
             <w:vAlign w:val="center"/>
           </w:tcPr>
@@ -1030,11 +1030,11 @@
             </w:pPr>
             <w:r>
               <w:rPr>
-                <w:rFonts w:ascii="Aptos" w:hAnsi="Aptos"/>
+                <w:rFonts w:ascii="Inter" w:hAnsi="Inter"/>
                 <w:b/>
                 <w:i w:val="0"/>
                 <w:caps w:val="0"/>
-                <w:color w:val="08483D"/>
+                <w:color w:val="1C1410"/>
                 <w:sz w:val="38"/>
               </w:rPr>
               <w:t>4</w:t>
@@ -1048,11 +1048,11 @@
             </w:pPr>
             <w:r>
               <w:rPr>
-                <w:rFonts w:ascii="Aptos" w:hAnsi="Aptos"/>
+                <w:rFonts w:ascii="Inter" w:hAnsi="Inter"/>
                 <w:b/>
                 <w:i w:val="0"/>
                 <w:caps/>
-                <w:color w:val="5F6C68"/>
+                <w:color w:val="6B5E52"/>
                 <w:sz w:val="15"/>
               </w:rPr>
               <w:t>FOLLOW-UP</w:t>
@@ -1062,7 +1062,7 @@
         <w:tc>
           <w:tcPr>
             <w:tcW w:type="dxa" w:w="1872"/>
-            <w:shd w:fill="F5F7F6"/>
+            <w:shd w:fill="F2EDE5"/>
             <w:tcMar>
               <w:top w:w="150" w:type="dxa"/>
               <w:start w:w="130" w:type="dxa"/>
@@ -1070,10 +1070,10 @@
               <w:end w:w="130" w:type="dxa"/>
             </w:tcMar>
             <w:tcBorders>
-              <w:top w:val="single" w:sz="6" w:color="CBD5D1"/>
-              <w:left w:val="single" w:sz="6" w:color="CBD5D1"/>
-              <w:bottom w:val="single" w:sz="6" w:color="CBD5D1"/>
-              <w:right w:val="single" w:sz="6" w:color="CBD5D1"/>
+              <w:top w:val="single" w:sz="6" w:color="DDD5C8"/>
+              <w:left w:val="single" w:sz="6" w:color="DDD5C8"/>
+              <w:bottom w:val="single" w:sz="6" w:color="DDD5C8"/>
+              <w:right w:val="single" w:sz="6" w:color="DDD5C8"/>
             </w:tcBorders>
             <w:vAlign w:val="center"/>
           </w:tcPr>
@@ -1085,11 +1085,11 @@
             </w:pPr>
             <w:r>
               <w:rPr>
-                <w:rFonts w:ascii="Aptos" w:hAnsi="Aptos"/>
+                <w:rFonts w:ascii="Inter" w:hAnsi="Inter"/>
                 <w:b/>
                 <w:i w:val="0"/>
                 <w:caps w:val="0"/>
-                <w:color w:val="08483D"/>
+                <w:color w:val="1C1410"/>
                 <w:sz w:val="38"/>
               </w:rPr>
               <w:t>7</w:t>
@@ -1103,11 +1103,11 @@
             </w:pPr>
             <w:r>
               <w:rPr>
-                <w:rFonts w:ascii="Aptos" w:hAnsi="Aptos"/>
+                <w:rFonts w:ascii="Inter" w:hAnsi="Inter"/>
                 <w:b/>
                 <w:i w:val="0"/>
                 <w:caps/>
-                <w:color w:val="5F6C68"/>
+                <w:color w:val="6B5E52"/>
                 <w:sz w:val="15"/>
               </w:rPr>
               <w:t>PROCESS CLARITY</w:t>
@@ -1117,7 +1117,7 @@
         <w:tc>
           <w:tcPr>
             <w:tcW w:type="dxa" w:w="1872"/>
-            <w:shd w:fill="F5F7F6"/>
+            <w:shd w:fill="F2EDE5"/>
             <w:tcMar>
               <w:top w:w="150" w:type="dxa"/>
               <w:start w:w="130" w:type="dxa"/>
@@ -1125,10 +1125,10 @@
               <w:end w:w="130" w:type="dxa"/>
             </w:tcMar>
             <w:tcBorders>
-              <w:top w:val="single" w:sz="6" w:color="CBD5D1"/>
-              <w:left w:val="single" w:sz="6" w:color="CBD5D1"/>
-              <w:bottom w:val="single" w:sz="6" w:color="CBD5D1"/>
-              <w:right w:val="single" w:sz="6" w:color="CBD5D1"/>
+              <w:top w:val="single" w:sz="6" w:color="DDD5C8"/>
+              <w:left w:val="single" w:sz="6" w:color="DDD5C8"/>
+              <w:bottom w:val="single" w:sz="6" w:color="DDD5C8"/>
+              <w:right w:val="single" w:sz="6" w:color="DDD5C8"/>
             </w:tcBorders>
             <w:vAlign w:val="center"/>
           </w:tcPr>
@@ -1140,11 +1140,11 @@
             </w:pPr>
             <w:r>
               <w:rPr>
-                <w:rFonts w:ascii="Aptos" w:hAnsi="Aptos"/>
+                <w:rFonts w:ascii="Inter" w:hAnsi="Inter"/>
                 <w:b/>
                 <w:i w:val="0"/>
                 <w:caps w:val="0"/>
-                <w:color w:val="08483D"/>
+                <w:color w:val="1C1410"/>
                 <w:sz w:val="38"/>
               </w:rPr>
               <w:t>7</w:t>
@@ -1158,11 +1158,11 @@
             </w:pPr>
             <w:r>
               <w:rPr>
-                <w:rFonts w:ascii="Aptos" w:hAnsi="Aptos"/>
+                <w:rFonts w:ascii="Inter" w:hAnsi="Inter"/>
                 <w:b/>
                 <w:i w:val="0"/>
                 <w:caps/>
-                <w:color w:val="5F6C68"/>
+                <w:color w:val="6B5E52"/>
                 <w:sz w:val="15"/>
               </w:rPr>
               <w:t>CUSTOMER EXPERIENCE</w:t>
@@ -1179,11 +1179,11 @@
       </w:pPr>
       <w:r>
         <w:rPr>
-          <w:rFonts w:ascii="Aptos" w:hAnsi="Aptos"/>
+          <w:rFonts w:ascii="Inter" w:hAnsi="Inter"/>
           <w:b/>
           <w:i w:val="0"/>
           <w:caps w:val="0"/>
-          <w:color w:val="0B6655"/>
+          <w:color w:val="7A4F1E"/>
           <w:sz w:val="27"/>
         </w:rPr>
         <w:t>Where the business is already strong</w:t>
@@ -1198,11 +1198,11 @@
       </w:pPr>
       <w:r>
         <w:rPr>
-          <w:rFonts w:ascii="Aptos" w:hAnsi="Aptos"/>
+          <w:rFonts w:ascii="Inter" w:hAnsi="Inter"/>
           <w:b w:val="0"/>
           <w:i w:val="0"/>
           <w:caps w:val="0"/>
-          <w:color w:val="18211F"/>
+          <w:color w:val="1C1410"/>
           <w:sz w:val="20"/>
         </w:rPr>
         <w:t>A clear service offer and strong local reputation create genuine enquiry demand.</w:t>
@@ -1217,11 +1217,11 @@
       </w:pPr>
       <w:r>
         <w:rPr>
-          <w:rFonts w:ascii="Aptos" w:hAnsi="Aptos"/>
+          <w:rFonts w:ascii="Inter" w:hAnsi="Inter"/>
           <w:b w:val="0"/>
           <w:i w:val="0"/>
           <w:caps w:val="0"/>
-          <w:color w:val="18211F"/>
+          <w:color w:val="1C1410"/>
           <w:sz w:val="20"/>
         </w:rPr>
         <w:t>The team uses established job-management and accounting tools rather than relying entirely on paper.</w:t>
@@ -1236,11 +1236,11 @@
       </w:pPr>
       <w:r>
         <w:rPr>
-          <w:rFonts w:ascii="Aptos" w:hAnsi="Aptos"/>
+          <w:rFonts w:ascii="Inter" w:hAnsi="Inter"/>
           <w:b w:val="0"/>
           <w:i w:val="0"/>
           <w:caps w:val="0"/>
-          <w:color w:val="18211F"/>
+          <w:color w:val="1C1410"/>
           <w:sz w:val="20"/>
         </w:rPr>
         <w:t>Customers receive competent service once a job is booked and allocated.</w:t>
@@ -1254,11 +1254,11 @@
       </w:pPr>
       <w:r>
         <w:rPr>
-          <w:rFonts w:ascii="Aptos" w:hAnsi="Aptos"/>
+          <w:rFonts w:ascii="Inter" w:hAnsi="Inter"/>
           <w:b/>
           <w:i w:val="0"/>
           <w:caps w:val="0"/>
-          <w:color w:val="0B6655"/>
+          <w:color w:val="7A4F1E"/>
           <w:sz w:val="27"/>
         </w:rPr>
         <w:t>Where revenue is most exposed</w:t>
@@ -1273,11 +1273,11 @@
       </w:pPr>
       <w:r>
         <w:rPr>
-          <w:rFonts w:ascii="Aptos" w:hAnsi="Aptos"/>
+          <w:rFonts w:ascii="Inter" w:hAnsi="Inter"/>
           <w:b w:val="0"/>
           <w:i w:val="0"/>
           <w:caps w:val="0"/>
-          <w:color w:val="18211F"/>
+          <w:color w:val="1C1410"/>
           <w:sz w:val="20"/>
         </w:rPr>
         <w:t>After-hours and busy-period calls rely on manual callbacks, with no immediate acknowledgement to the customer.</w:t>
@@ -1292,11 +1292,11 @@
       </w:pPr>
       <w:r>
         <w:rPr>
-          <w:rFonts w:ascii="Aptos" w:hAnsi="Aptos"/>
+          <w:rFonts w:ascii="Inter" w:hAnsi="Inter"/>
           <w:b w:val="0"/>
           <w:i w:val="0"/>
           <w:caps w:val="0"/>
-          <w:color w:val="18211F"/>
+          <w:color w:val="1C1410"/>
           <w:sz w:val="20"/>
         </w:rPr>
         <w:t>Quote follow-up varies by staff member and is not measured as a conversion stage.</w:t>
@@ -1311,11 +1311,11 @@
       </w:pPr>
       <w:r>
         <w:rPr>
-          <w:rFonts w:ascii="Aptos" w:hAnsi="Aptos"/>
+          <w:rFonts w:ascii="Inter" w:hAnsi="Inter"/>
           <w:b w:val="0"/>
           <w:i w:val="0"/>
           <w:caps w:val="0"/>
-          <w:color w:val="18211F"/>
+          <w:color w:val="1C1410"/>
           <w:sz w:val="20"/>
         </w:rPr>
         <w:t>Review requests and future-work prompts happen inconsistently after completed jobs.</w:t>
@@ -1335,7 +1335,7 @@
         <w:tc>
           <w:tcPr>
             <w:tcW w:type="dxa" w:w="9360"/>
-            <w:shd w:fill="F7EEDF"/>
+            <w:shd w:fill="FDF4E7"/>
             <w:tcMar>
               <w:top w:w="200" w:type="dxa"/>
               <w:start w:w="220" w:type="dxa"/>
@@ -1343,7 +1343,7 @@
               <w:end w:w="220" w:type="dxa"/>
             </w:tcMar>
             <w:tcBorders>
-              <w:left w:val="single" w:sz="24" w:color="A46411"/>
+              <w:left w:val="single" w:sz="24" w:color="C47B2E"/>
             </w:tcBorders>
           </w:tcPr>
           <w:p>
@@ -1353,11 +1353,11 @@
             </w:pPr>
             <w:r>
               <w:rPr>
-                <w:rFonts w:ascii="Aptos" w:hAnsi="Aptos"/>
+                <w:rFonts w:ascii="Inter" w:hAnsi="Inter"/>
                 <w:b/>
                 <w:i w:val="0"/>
                 <w:caps/>
-                <w:color w:val="A46411"/>
+                <w:color w:val="C47B2E"/>
                 <w:sz w:val="16"/>
               </w:rPr>
               <w:t>COMMERCIAL INTERPRETATION</w:t>
@@ -1370,11 +1370,11 @@
             </w:pPr>
             <w:r>
               <w:rPr>
-                <w:rFonts w:ascii="Aptos" w:hAnsi="Aptos"/>
+                <w:rFonts w:ascii="Inter" w:hAnsi="Inter"/>
                 <w:b/>
                 <w:i w:val="0"/>
                 <w:caps w:val="0"/>
-                <w:color w:val="18211F"/>
+                <w:color w:val="1C1410"/>
                 <w:sz w:val="28"/>
               </w:rPr>
               <w:t>The first investment should improve conversion, not generate more traffic.</w:t>
@@ -1387,11 +1387,11 @@
             </w:pPr>
             <w:r>
               <w:rPr>
-                <w:rFonts w:ascii="Aptos" w:hAnsi="Aptos"/>
+                <w:rFonts w:ascii="Inter" w:hAnsi="Inter"/>
                 <w:b w:val="0"/>
                 <w:i w:val="0"/>
                 <w:caps w:val="0"/>
-                <w:color w:val="5F6C68"/>
+                <w:color w:val="6B5E52"/>
                 <w:sz w:val="20"/>
               </w:rPr>
               <w:t>Until missed calls and quotes are followed through consistently, increasing ad spend risks feeding more opportunities into the same leakage points.</w:t>
@@ -1413,11 +1413,11 @@
       </w:pPr>
       <w:r>
         <w:rPr>
-          <w:rFonts w:ascii="Aptos" w:hAnsi="Aptos"/>
+          <w:rFonts w:ascii="Inter" w:hAnsi="Inter"/>
           <w:b/>
           <w:i w:val="0"/>
           <w:caps/>
-          <w:color w:val="0B6655"/>
+          <w:color w:val="7A4F1E"/>
           <w:sz w:val="17"/>
         </w:rPr>
         <w:t>03 | DIAGNOSTIC FINDINGS</w:t>
@@ -1431,11 +1431,11 @@
       </w:pPr>
       <w:r>
         <w:rPr>
-          <w:rFonts w:ascii="Aptos" w:hAnsi="Aptos"/>
+          <w:rFonts w:ascii="Inter" w:hAnsi="Inter"/>
           <w:b/>
           <w:i w:val="0"/>
           <w:caps w:val="0"/>
-          <w:color w:val="08483D"/>
+          <w:color w:val="1C1410"/>
           <w:sz w:val="36"/>
         </w:rPr>
         <w:t>Evidence-backed issues, ordered by commercial impact</w:t>
@@ -1456,7 +1456,7 @@
         <w:tc>
           <w:tcPr>
             <w:tcW w:type="dxa" w:w="1540"/>
-            <w:shd w:fill="9C3630"/>
+            <w:shd w:fill="A43B35"/>
             <w:tcMar>
               <w:top w:w="150" w:type="dxa"/>
               <w:start w:w="160" w:type="dxa"/>
@@ -1464,7 +1464,7 @@
               <w:end w:w="160" w:type="dxa"/>
             </w:tcMar>
             <w:tcBorders>
-              <w:bottom w:val="single" w:sz="6" w:color="CBD5D1"/>
+              <w:bottom w:val="single" w:sz="6" w:color="DDD5C8"/>
             </w:tcBorders>
             <w:vAlign w:val="center"/>
           </w:tcPr>
@@ -1476,11 +1476,11 @@
             </w:pPr>
             <w:r>
               <w:rPr>
-                <w:rFonts w:ascii="Aptos" w:hAnsi="Aptos"/>
+                <w:rFonts w:ascii="Inter" w:hAnsi="Inter"/>
                 <w:b/>
                 <w:i w:val="0"/>
                 <w:caps/>
-                <w:color w:val="FFFFFF"/>
+                <w:color w:val="F9F6F1"/>
                 <w:sz w:val="18"/>
               </w:rPr>
               <w:t>RED</w:t>
@@ -1490,7 +1490,7 @@
         <w:tc>
           <w:tcPr>
             <w:tcW w:type="dxa" w:w="7820"/>
-            <w:shd w:fill="F8E8E6"/>
+            <w:shd w:fill="F9E8E6"/>
             <w:tcMar>
               <w:top w:w="150" w:type="dxa"/>
               <w:start w:w="160" w:type="dxa"/>
@@ -1498,7 +1498,7 @@
               <w:end w:w="160" w:type="dxa"/>
             </w:tcMar>
             <w:tcBorders>
-              <w:bottom w:val="single" w:sz="6" w:color="CBD5D1"/>
+              <w:bottom w:val="single" w:sz="6" w:color="DDD5C8"/>
             </w:tcBorders>
             <w:vAlign w:val="center"/>
           </w:tcPr>
@@ -1509,11 +1509,11 @@
             </w:pPr>
             <w:r>
               <w:rPr>
-                <w:rFonts w:ascii="Aptos" w:hAnsi="Aptos"/>
+                <w:rFonts w:ascii="Inter" w:hAnsi="Inter"/>
                 <w:b/>
                 <w:i w:val="0"/>
                 <w:caps w:val="0"/>
-                <w:color w:val="18211F"/>
+                <w:color w:val="1C1410"/>
                 <w:sz w:val="23"/>
               </w:rPr>
               <w:t>Lead response</w:t>
@@ -1526,22 +1526,22 @@
             </w:pPr>
             <w:r>
               <w:rPr>
-                <w:rFonts w:ascii="Aptos" w:hAnsi="Aptos"/>
+                <w:rFonts w:ascii="Inter" w:hAnsi="Inter"/>
                 <w:b/>
                 <w:i w:val="0"/>
                 <w:caps w:val="0"/>
-                <w:color w:val="18211F"/>
+                <w:color w:val="1C1410"/>
                 <w:sz w:val="19"/>
               </w:rPr>
               <w:t xml:space="preserve">Current state: </w:t>
             </w:r>
             <w:r>
               <w:rPr>
-                <w:rFonts w:ascii="Aptos" w:hAnsi="Aptos"/>
+                <w:rFonts w:ascii="Inter" w:hAnsi="Inter"/>
                 <w:b w:val="0"/>
                 <w:i w:val="0"/>
                 <w:caps w:val="0"/>
-                <w:color w:val="5F6C68"/>
+                <w:color w:val="6B5E52"/>
                 <w:sz w:val="19"/>
               </w:rPr>
               <w:t>After-hours and overflow handling is reactive. The owner or office team returns calls when capacity allows.</w:t>
@@ -1554,22 +1554,22 @@
             </w:pPr>
             <w:r>
               <w:rPr>
-                <w:rFonts w:ascii="Aptos" w:hAnsi="Aptos"/>
+                <w:rFonts w:ascii="Inter" w:hAnsi="Inter"/>
                 <w:b/>
                 <w:i w:val="0"/>
                 <w:caps w:val="0"/>
-                <w:color w:val="18211F"/>
+                <w:color w:val="1C1410"/>
                 <w:sz w:val="19"/>
               </w:rPr>
               <w:t xml:space="preserve">Likely impact: </w:t>
             </w:r>
             <w:r>
               <w:rPr>
-                <w:rFonts w:ascii="Aptos" w:hAnsi="Aptos"/>
+                <w:rFonts w:ascii="Inter" w:hAnsi="Inter"/>
                 <w:b w:val="0"/>
                 <w:i w:val="0"/>
                 <w:caps w:val="0"/>
-                <w:color w:val="5F6C68"/>
+                <w:color w:val="6B5E52"/>
                 <w:sz w:val="19"/>
               </w:rPr>
               <w:t>Urgent customers often call the next electrician quickly. Even a modest number of unrecovered calls can represent significant lost job value.</w:t>
@@ -1582,22 +1582,22 @@
             </w:pPr>
             <w:r>
               <w:rPr>
-                <w:rFonts w:ascii="Aptos" w:hAnsi="Aptos"/>
+                <w:rFonts w:ascii="Inter" w:hAnsi="Inter"/>
                 <w:b/>
                 <w:i w:val="0"/>
                 <w:caps w:val="0"/>
-                <w:color w:val="18211F"/>
+                <w:color w:val="1C1410"/>
                 <w:sz w:val="19"/>
               </w:rPr>
               <w:t xml:space="preserve">Fastest win: </w:t>
             </w:r>
             <w:r>
               <w:rPr>
-                <w:rFonts w:ascii="Aptos" w:hAnsi="Aptos"/>
+                <w:rFonts w:ascii="Inter" w:hAnsi="Inter"/>
                 <w:b w:val="0"/>
                 <w:i w:val="0"/>
                 <w:caps w:val="0"/>
-                <w:color w:val="5F6C68"/>
+                <w:color w:val="6B5E52"/>
                 <w:sz w:val="19"/>
               </w:rPr>
               <w:t>Send an immediate branded text acknowledgement and assign callback ownership.</w:t>
@@ -1626,7 +1626,7 @@
         <w:tc>
           <w:tcPr>
             <w:tcW w:type="dxa" w:w="1540"/>
-            <w:shd w:fill="9C3630"/>
+            <w:shd w:fill="A43B35"/>
             <w:tcMar>
               <w:top w:w="150" w:type="dxa"/>
               <w:start w:w="160" w:type="dxa"/>
@@ -1634,7 +1634,7 @@
               <w:end w:w="160" w:type="dxa"/>
             </w:tcMar>
             <w:tcBorders>
-              <w:bottom w:val="single" w:sz="6" w:color="CBD5D1"/>
+              <w:bottom w:val="single" w:sz="6" w:color="DDD5C8"/>
             </w:tcBorders>
             <w:vAlign w:val="center"/>
           </w:tcPr>
@@ -1646,11 +1646,11 @@
             </w:pPr>
             <w:r>
               <w:rPr>
-                <w:rFonts w:ascii="Aptos" w:hAnsi="Aptos"/>
+                <w:rFonts w:ascii="Inter" w:hAnsi="Inter"/>
                 <w:b/>
                 <w:i w:val="0"/>
                 <w:caps/>
-                <w:color w:val="FFFFFF"/>
+                <w:color w:val="F9F6F1"/>
                 <w:sz w:val="18"/>
               </w:rPr>
               <w:t>RED</w:t>
@@ -1660,7 +1660,7 @@
         <w:tc>
           <w:tcPr>
             <w:tcW w:type="dxa" w:w="7820"/>
-            <w:shd w:fill="F8E8E6"/>
+            <w:shd w:fill="F9E8E6"/>
             <w:tcMar>
               <w:top w:w="150" w:type="dxa"/>
               <w:start w:w="160" w:type="dxa"/>
@@ -1668,7 +1668,7 @@
               <w:end w:w="160" w:type="dxa"/>
             </w:tcMar>
             <w:tcBorders>
-              <w:bottom w:val="single" w:sz="6" w:color="CBD5D1"/>
+              <w:bottom w:val="single" w:sz="6" w:color="DDD5C8"/>
             </w:tcBorders>
             <w:vAlign w:val="center"/>
           </w:tcPr>
@@ -1679,11 +1679,11 @@
             </w:pPr>
             <w:r>
               <w:rPr>
-                <w:rFonts w:ascii="Aptos" w:hAnsi="Aptos"/>
+                <w:rFonts w:ascii="Inter" w:hAnsi="Inter"/>
                 <w:b/>
                 <w:i w:val="0"/>
                 <w:caps w:val="0"/>
-                <w:color w:val="18211F"/>
+                <w:color w:val="1C1410"/>
                 <w:sz w:val="23"/>
               </w:rPr>
               <w:t>Quote follow-up</w:t>
@@ -1696,22 +1696,22 @@
             </w:pPr>
             <w:r>
               <w:rPr>
-                <w:rFonts w:ascii="Aptos" w:hAnsi="Aptos"/>
+                <w:rFonts w:ascii="Inter" w:hAnsi="Inter"/>
                 <w:b/>
                 <w:i w:val="0"/>
                 <w:caps w:val="0"/>
-                <w:color w:val="18211F"/>
+                <w:color w:val="1C1410"/>
                 <w:sz w:val="19"/>
               </w:rPr>
               <w:t xml:space="preserve">Current state: </w:t>
             </w:r>
             <w:r>
               <w:rPr>
-                <w:rFonts w:ascii="Aptos" w:hAnsi="Aptos"/>
+                <w:rFonts w:ascii="Inter" w:hAnsi="Inter"/>
                 <w:b w:val="0"/>
                 <w:i w:val="0"/>
                 <w:caps w:val="0"/>
-                <w:color w:val="5F6C68"/>
+                <w:color w:val="6B5E52"/>
                 <w:sz w:val="19"/>
               </w:rPr>
               <w:t>Quotes are sent, but follow-up timing and ownership are inconsistent. Conversion is not visible in one place.</w:t>
@@ -1724,22 +1724,22 @@
             </w:pPr>
             <w:r>
               <w:rPr>
-                <w:rFonts w:ascii="Aptos" w:hAnsi="Aptos"/>
+                <w:rFonts w:ascii="Inter" w:hAnsi="Inter"/>
                 <w:b/>
                 <w:i w:val="0"/>
                 <w:caps w:val="0"/>
-                <w:color w:val="18211F"/>
+                <w:color w:val="1C1410"/>
                 <w:sz w:val="19"/>
               </w:rPr>
               <w:t xml:space="preserve">Likely impact: </w:t>
             </w:r>
             <w:r>
               <w:rPr>
-                <w:rFonts w:ascii="Aptos" w:hAnsi="Aptos"/>
+                <w:rFonts w:ascii="Inter" w:hAnsi="Inter"/>
                 <w:b w:val="0"/>
                 <w:i w:val="0"/>
                 <w:caps w:val="0"/>
-                <w:color w:val="5F6C68"/>
+                <w:color w:val="6B5E52"/>
                 <w:sz w:val="19"/>
               </w:rPr>
               <w:t>Warm prospects can drift to competitors, while the business cannot distinguish price objections from simple lack of follow-up.</w:t>
@@ -1752,22 +1752,22 @@
             </w:pPr>
             <w:r>
               <w:rPr>
-                <w:rFonts w:ascii="Aptos" w:hAnsi="Aptos"/>
+                <w:rFonts w:ascii="Inter" w:hAnsi="Inter"/>
                 <w:b/>
                 <w:i w:val="0"/>
                 <w:caps w:val="0"/>
-                <w:color w:val="18211F"/>
+                <w:color w:val="1C1410"/>
                 <w:sz w:val="19"/>
               </w:rPr>
               <w:t xml:space="preserve">Fastest win: </w:t>
             </w:r>
             <w:r>
               <w:rPr>
-                <w:rFonts w:ascii="Aptos" w:hAnsi="Aptos"/>
+                <w:rFonts w:ascii="Inter" w:hAnsi="Inter"/>
                 <w:b w:val="0"/>
                 <w:i w:val="0"/>
                 <w:caps w:val="0"/>
-                <w:color w:val="5F6C68"/>
+                <w:color w:val="6B5E52"/>
                 <w:sz w:val="19"/>
               </w:rPr>
               <w:t>Introduce two scheduled follow-ups and a clear won/lost outcome.</w:t>
@@ -1796,7 +1796,7 @@
         <w:tc>
           <w:tcPr>
             <w:tcW w:type="dxa" w:w="1540"/>
-            <w:shd w:fill="A46411"/>
+            <w:shd w:fill="C47B2E"/>
             <w:tcMar>
               <w:top w:w="150" w:type="dxa"/>
               <w:start w:w="160" w:type="dxa"/>
@@ -1804,7 +1804,7 @@
               <w:end w:w="160" w:type="dxa"/>
             </w:tcMar>
             <w:tcBorders>
-              <w:bottom w:val="single" w:sz="6" w:color="CBD5D1"/>
+              <w:bottom w:val="single" w:sz="6" w:color="DDD5C8"/>
             </w:tcBorders>
             <w:vAlign w:val="center"/>
           </w:tcPr>
@@ -1816,11 +1816,11 @@
             </w:pPr>
             <w:r>
               <w:rPr>
-                <w:rFonts w:ascii="Aptos" w:hAnsi="Aptos"/>
+                <w:rFonts w:ascii="Inter" w:hAnsi="Inter"/>
                 <w:b/>
                 <w:i w:val="0"/>
                 <w:caps/>
-                <w:color w:val="FFFFFF"/>
+                <w:color w:val="F9F6F1"/>
                 <w:sz w:val="18"/>
               </w:rPr>
               <w:t>YELLOW</w:t>
@@ -1830,7 +1830,7 @@
         <w:tc>
           <w:tcPr>
             <w:tcW w:type="dxa" w:w="7820"/>
-            <w:shd w:fill="F7EEDF"/>
+            <w:shd w:fill="FDF4E7"/>
             <w:tcMar>
               <w:top w:w="150" w:type="dxa"/>
               <w:start w:w="160" w:type="dxa"/>
@@ -1838,7 +1838,7 @@
               <w:end w:w="160" w:type="dxa"/>
             </w:tcMar>
             <w:tcBorders>
-              <w:bottom w:val="single" w:sz="6" w:color="CBD5D1"/>
+              <w:bottom w:val="single" w:sz="6" w:color="DDD5C8"/>
             </w:tcBorders>
             <w:vAlign w:val="center"/>
           </w:tcPr>
@@ -1849,11 +1849,11 @@
             </w:pPr>
             <w:r>
               <w:rPr>
-                <w:rFonts w:ascii="Aptos" w:hAnsi="Aptos"/>
+                <w:rFonts w:ascii="Inter" w:hAnsi="Inter"/>
                 <w:b/>
                 <w:i w:val="0"/>
                 <w:caps w:val="0"/>
-                <w:color w:val="18211F"/>
+                <w:color w:val="1C1410"/>
                 <w:sz w:val="23"/>
               </w:rPr>
               <w:t>Workflow visibility</w:t>
@@ -1866,22 +1866,22 @@
             </w:pPr>
             <w:r>
               <w:rPr>
-                <w:rFonts w:ascii="Aptos" w:hAnsi="Aptos"/>
+                <w:rFonts w:ascii="Inter" w:hAnsi="Inter"/>
                 <w:b/>
                 <w:i w:val="0"/>
                 <w:caps w:val="0"/>
-                <w:color w:val="18211F"/>
+                <w:color w:val="1C1410"/>
                 <w:sz w:val="19"/>
               </w:rPr>
               <w:t xml:space="preserve">Current state: </w:t>
             </w:r>
             <w:r>
               <w:rPr>
-                <w:rFonts w:ascii="Aptos" w:hAnsi="Aptos"/>
+                <w:rFonts w:ascii="Inter" w:hAnsi="Inter"/>
                 <w:b w:val="0"/>
                 <w:i w:val="0"/>
                 <w:caps w:val="0"/>
-                <w:color w:val="5F6C68"/>
+                <w:color w:val="6B5E52"/>
                 <w:sz w:val="19"/>
               </w:rPr>
               <w:t>Core tools are in place, but staff still rely on memory and manual checking to know what needs attention.</w:t>
@@ -1894,22 +1894,22 @@
             </w:pPr>
             <w:r>
               <w:rPr>
-                <w:rFonts w:ascii="Aptos" w:hAnsi="Aptos"/>
+                <w:rFonts w:ascii="Inter" w:hAnsi="Inter"/>
                 <w:b/>
                 <w:i w:val="0"/>
                 <w:caps w:val="0"/>
-                <w:color w:val="18211F"/>
+                <w:color w:val="1C1410"/>
                 <w:sz w:val="19"/>
               </w:rPr>
               <w:t xml:space="preserve">Likely impact: </w:t>
             </w:r>
             <w:r>
               <w:rPr>
-                <w:rFonts w:ascii="Aptos" w:hAnsi="Aptos"/>
+                <w:rFonts w:ascii="Inter" w:hAnsi="Inter"/>
                 <w:b w:val="0"/>
                 <w:i w:val="0"/>
                 <w:caps w:val="0"/>
-                <w:color w:val="5F6C68"/>
+                <w:color w:val="6B5E52"/>
                 <w:sz w:val="19"/>
               </w:rPr>
               <w:t>The system works while key people are present, but tasks can stall during busy periods or absences.</w:t>
@@ -1922,22 +1922,22 @@
             </w:pPr>
             <w:r>
               <w:rPr>
-                <w:rFonts w:ascii="Aptos" w:hAnsi="Aptos"/>
+                <w:rFonts w:ascii="Inter" w:hAnsi="Inter"/>
                 <w:b/>
                 <w:i w:val="0"/>
                 <w:caps w:val="0"/>
-                <w:color w:val="18211F"/>
+                <w:color w:val="1C1410"/>
                 <w:sz w:val="19"/>
               </w:rPr>
               <w:t xml:space="preserve">Fastest win: </w:t>
             </w:r>
             <w:r>
               <w:rPr>
-                <w:rFonts w:ascii="Aptos" w:hAnsi="Aptos"/>
+                <w:rFonts w:ascii="Inter" w:hAnsi="Inter"/>
                 <w:b w:val="0"/>
                 <w:i w:val="0"/>
                 <w:caps w:val="0"/>
-                <w:color w:val="5F6C68"/>
+                <w:color w:val="6B5E52"/>
                 <w:sz w:val="19"/>
               </w:rPr>
               <w:t>Create one daily view of uncontacted leads, open quotes and jobs awaiting customer action.</w:t>
@@ -1966,7 +1966,7 @@
         <w:tc>
           <w:tcPr>
             <w:tcW w:type="dxa" w:w="1540"/>
-            <w:shd w:fill="A46411"/>
+            <w:shd w:fill="C47B2E"/>
             <w:tcMar>
               <w:top w:w="150" w:type="dxa"/>
               <w:start w:w="160" w:type="dxa"/>
@@ -1974,7 +1974,7 @@
               <w:end w:w="160" w:type="dxa"/>
             </w:tcMar>
             <w:tcBorders>
-              <w:bottom w:val="single" w:sz="6" w:color="CBD5D1"/>
+              <w:bottom w:val="single" w:sz="6" w:color="DDD5C8"/>
             </w:tcBorders>
             <w:vAlign w:val="center"/>
           </w:tcPr>
@@ -1986,11 +1986,11 @@
             </w:pPr>
             <w:r>
               <w:rPr>
-                <w:rFonts w:ascii="Aptos" w:hAnsi="Aptos"/>
+                <w:rFonts w:ascii="Inter" w:hAnsi="Inter"/>
                 <w:b/>
                 <w:i w:val="0"/>
                 <w:caps/>
-                <w:color w:val="FFFFFF"/>
+                <w:color w:val="F9F6F1"/>
                 <w:sz w:val="18"/>
               </w:rPr>
               <w:t>YELLOW</w:t>
@@ -2000,7 +2000,7 @@
         <w:tc>
           <w:tcPr>
             <w:tcW w:type="dxa" w:w="7820"/>
-            <w:shd w:fill="F7EEDF"/>
+            <w:shd w:fill="FDF4E7"/>
             <w:tcMar>
               <w:top w:w="150" w:type="dxa"/>
               <w:start w:w="160" w:type="dxa"/>
@@ -2008,7 +2008,7 @@
               <w:end w:w="160" w:type="dxa"/>
             </w:tcMar>
             <w:tcBorders>
-              <w:bottom w:val="single" w:sz="6" w:color="CBD5D1"/>
+              <w:bottom w:val="single" w:sz="6" w:color="DDD5C8"/>
             </w:tcBorders>
             <w:vAlign w:val="center"/>
           </w:tcPr>
@@ -2019,11 +2019,11 @@
             </w:pPr>
             <w:r>
               <w:rPr>
-                <w:rFonts w:ascii="Aptos" w:hAnsi="Aptos"/>
+                <w:rFonts w:ascii="Inter" w:hAnsi="Inter"/>
                 <w:b/>
                 <w:i w:val="0"/>
                 <w:caps w:val="0"/>
-                <w:color w:val="18211F"/>
+                <w:color w:val="1C1410"/>
                 <w:sz w:val="23"/>
               </w:rPr>
               <w:t>Reviews and repeat work</w:t>
@@ -2036,22 +2036,22 @@
             </w:pPr>
             <w:r>
               <w:rPr>
-                <w:rFonts w:ascii="Aptos" w:hAnsi="Aptos"/>
+                <w:rFonts w:ascii="Inter" w:hAnsi="Inter"/>
                 <w:b/>
                 <w:i w:val="0"/>
                 <w:caps w:val="0"/>
-                <w:color w:val="18211F"/>
+                <w:color w:val="1C1410"/>
                 <w:sz w:val="19"/>
               </w:rPr>
               <w:t xml:space="preserve">Current state: </w:t>
             </w:r>
             <w:r>
               <w:rPr>
-                <w:rFonts w:ascii="Aptos" w:hAnsi="Aptos"/>
+                <w:rFonts w:ascii="Inter" w:hAnsi="Inter"/>
                 <w:b w:val="0"/>
                 <w:i w:val="0"/>
                 <w:caps w:val="0"/>
-                <w:color w:val="5F6C68"/>
+                <w:color w:val="6B5E52"/>
                 <w:sz w:val="19"/>
               </w:rPr>
               <w:t>Happy customers are not consistently prompted for a review or relevant future service.</w:t>
@@ -2064,22 +2064,22 @@
             </w:pPr>
             <w:r>
               <w:rPr>
-                <w:rFonts w:ascii="Aptos" w:hAnsi="Aptos"/>
+                <w:rFonts w:ascii="Inter" w:hAnsi="Inter"/>
                 <w:b/>
                 <w:i w:val="0"/>
                 <w:caps w:val="0"/>
-                <w:color w:val="18211F"/>
+                <w:color w:val="1C1410"/>
                 <w:sz w:val="19"/>
               </w:rPr>
               <w:t xml:space="preserve">Likely impact: </w:t>
             </w:r>
             <w:r>
               <w:rPr>
-                <w:rFonts w:ascii="Aptos" w:hAnsi="Aptos"/>
+                <w:rFonts w:ascii="Inter" w:hAnsi="Inter"/>
                 <w:b w:val="0"/>
                 <w:i w:val="0"/>
                 <w:caps w:val="0"/>
-                <w:color w:val="5F6C68"/>
+                <w:color w:val="6B5E52"/>
                 <w:sz w:val="19"/>
               </w:rPr>
               <w:t>The business misses low-cost reputation growth and repeat-work opportunities after successful jobs.</w:t>
@@ -2092,22 +2092,22 @@
             </w:pPr>
             <w:r>
               <w:rPr>
-                <w:rFonts w:ascii="Aptos" w:hAnsi="Aptos"/>
+                <w:rFonts w:ascii="Inter" w:hAnsi="Inter"/>
                 <w:b/>
                 <w:i w:val="0"/>
                 <w:caps w:val="0"/>
-                <w:color w:val="18211F"/>
+                <w:color w:val="1C1410"/>
                 <w:sz w:val="19"/>
               </w:rPr>
               <w:t xml:space="preserve">Fastest win: </w:t>
             </w:r>
             <w:r>
               <w:rPr>
-                <w:rFonts w:ascii="Aptos" w:hAnsi="Aptos"/>
+                <w:rFonts w:ascii="Inter" w:hAnsi="Inter"/>
                 <w:b w:val="0"/>
                 <w:i w:val="0"/>
                 <w:caps w:val="0"/>
-                <w:color w:val="5F6C68"/>
+                <w:color w:val="6B5E52"/>
                 <w:sz w:val="19"/>
               </w:rPr>
               <w:t>Trigger a review request after job completion and add one relevant next-step prompt.</w:t>
@@ -2134,11 +2134,11 @@
       </w:pPr>
       <w:r>
         <w:rPr>
-          <w:rFonts w:ascii="Aptos" w:hAnsi="Aptos"/>
+          <w:rFonts w:ascii="Inter" w:hAnsi="Inter"/>
           <w:b/>
           <w:i w:val="0"/>
           <w:caps/>
-          <w:color w:val="0B6655"/>
+          <w:color w:val="7A4F1E"/>
           <w:sz w:val="17"/>
         </w:rPr>
         <w:t>04 | 30-DAY ACTION PLAN</w:t>
@@ -2152,11 +2152,11 @@
       </w:pPr>
       <w:r>
         <w:rPr>
-          <w:rFonts w:ascii="Aptos" w:hAnsi="Aptos"/>
+          <w:rFonts w:ascii="Inter" w:hAnsi="Inter"/>
           <w:b/>
           <w:i w:val="0"/>
           <w:caps w:val="0"/>
-          <w:color w:val="08483D"/>
+          <w:color w:val="1C1410"/>
           <w:sz w:val="36"/>
         </w:rPr>
         <w:t>Fix the fastest revenue leaks before adding complexity</w:t>
@@ -2177,7 +2177,7 @@
         <w:tc>
           <w:tcPr>
             <w:tcW w:type="dxa" w:w="720"/>
-            <w:shd w:fill="0B6655"/>
+            <w:shd w:fill="7A4F1E"/>
             <w:tcMar>
               <w:top w:w="120" w:type="dxa"/>
               <w:start w:w="150" w:type="dxa"/>
@@ -2185,7 +2185,7 @@
               <w:end w:w="150" w:type="dxa"/>
             </w:tcMar>
             <w:tcBorders>
-              <w:bottom w:val="single" w:sz="6" w:color="CBD5D1"/>
+              <w:bottom w:val="single" w:sz="6" w:color="DDD5C8"/>
             </w:tcBorders>
             <w:vAlign w:val="center"/>
           </w:tcPr>
@@ -2197,11 +2197,11 @@
             </w:pPr>
             <w:r>
               <w:rPr>
-                <w:rFonts w:ascii="Aptos" w:hAnsi="Aptos"/>
+                <w:rFonts w:ascii="Inter" w:hAnsi="Inter"/>
                 <w:b/>
                 <w:i w:val="0"/>
                 <w:caps w:val="0"/>
-                <w:color w:val="FFFFFF"/>
+                <w:color w:val="F9F6F1"/>
                 <w:sz w:val="28"/>
               </w:rPr>
               <w:t>1</w:t>
@@ -2211,7 +2211,7 @@
         <w:tc>
           <w:tcPr>
             <w:tcW w:type="dxa" w:w="8640"/>
-            <w:shd w:fill="F5F7F6"/>
+            <w:shd w:fill="F2EDE5"/>
             <w:tcMar>
               <w:top w:w="120" w:type="dxa"/>
               <w:start w:w="150" w:type="dxa"/>
@@ -2219,7 +2219,7 @@
               <w:end w:w="150" w:type="dxa"/>
             </w:tcMar>
             <w:tcBorders>
-              <w:bottom w:val="single" w:sz="6" w:color="CBD5D1"/>
+              <w:bottom w:val="single" w:sz="6" w:color="DDD5C8"/>
             </w:tcBorders>
             <w:vAlign w:val="center"/>
           </w:tcPr>
@@ -2230,11 +2230,11 @@
             </w:pPr>
             <w:r>
               <w:rPr>
-                <w:rFonts w:ascii="Aptos" w:hAnsi="Aptos"/>
+                <w:rFonts w:ascii="Inter" w:hAnsi="Inter"/>
                 <w:b/>
                 <w:i w:val="0"/>
                 <w:caps w:val="0"/>
-                <w:color w:val="18211F"/>
+                <w:color w:val="1C1410"/>
                 <w:sz w:val="21"/>
               </w:rPr>
               <w:t>Days 1–7 | Missed-call recovery</w:t>
@@ -2247,11 +2247,11 @@
             </w:pPr>
             <w:r>
               <w:rPr>
-                <w:rFonts w:ascii="Aptos" w:hAnsi="Aptos"/>
+                <w:rFonts w:ascii="Inter" w:hAnsi="Inter"/>
                 <w:b w:val="0"/>
                 <w:i w:val="0"/>
                 <w:caps w:val="0"/>
-                <w:color w:val="5F6C68"/>
+                <w:color w:val="6B5E52"/>
                 <w:sz w:val="19"/>
               </w:rPr>
               <w:t>Map the current call path, assign callback ownership, and launch an immediate text acknowledgement for unanswered calls. Track response time and recovered bookings.</w:t>
@@ -2280,7 +2280,7 @@
         <w:tc>
           <w:tcPr>
             <w:tcW w:type="dxa" w:w="720"/>
-            <w:shd w:fill="0B6655"/>
+            <w:shd w:fill="7A4F1E"/>
             <w:tcMar>
               <w:top w:w="120" w:type="dxa"/>
               <w:start w:w="150" w:type="dxa"/>
@@ -2288,7 +2288,7 @@
               <w:end w:w="150" w:type="dxa"/>
             </w:tcMar>
             <w:tcBorders>
-              <w:bottom w:val="single" w:sz="6" w:color="CBD5D1"/>
+              <w:bottom w:val="single" w:sz="6" w:color="DDD5C8"/>
             </w:tcBorders>
             <w:vAlign w:val="center"/>
           </w:tcPr>
@@ -2300,11 +2300,11 @@
             </w:pPr>
             <w:r>
               <w:rPr>
-                <w:rFonts w:ascii="Aptos" w:hAnsi="Aptos"/>
+                <w:rFonts w:ascii="Inter" w:hAnsi="Inter"/>
                 <w:b/>
                 <w:i w:val="0"/>
                 <w:caps w:val="0"/>
-                <w:color w:val="FFFFFF"/>
+                <w:color w:val="F9F6F1"/>
                 <w:sz w:val="28"/>
               </w:rPr>
               <w:t>2</w:t>
@@ -2314,7 +2314,7 @@
         <w:tc>
           <w:tcPr>
             <w:tcW w:type="dxa" w:w="8640"/>
-            <w:shd w:fill="F5F7F6"/>
+            <w:shd w:fill="F2EDE5"/>
             <w:tcMar>
               <w:top w:w="120" w:type="dxa"/>
               <w:start w:w="150" w:type="dxa"/>
@@ -2322,7 +2322,7 @@
               <w:end w:w="150" w:type="dxa"/>
             </w:tcMar>
             <w:tcBorders>
-              <w:bottom w:val="single" w:sz="6" w:color="CBD5D1"/>
+              <w:bottom w:val="single" w:sz="6" w:color="DDD5C8"/>
             </w:tcBorders>
             <w:vAlign w:val="center"/>
           </w:tcPr>
@@ -2333,11 +2333,11 @@
             </w:pPr>
             <w:r>
               <w:rPr>
-                <w:rFonts w:ascii="Aptos" w:hAnsi="Aptos"/>
+                <w:rFonts w:ascii="Inter" w:hAnsi="Inter"/>
                 <w:b/>
                 <w:i w:val="0"/>
                 <w:caps w:val="0"/>
-                <w:color w:val="18211F"/>
+                <w:color w:val="1C1410"/>
                 <w:sz w:val="21"/>
               </w:rPr>
               <w:t>Days 8–14 | Quote follow-up</w:t>
@@ -2350,11 +2350,11 @@
             </w:pPr>
             <w:r>
               <w:rPr>
-                <w:rFonts w:ascii="Aptos" w:hAnsi="Aptos"/>
+                <w:rFonts w:ascii="Inter" w:hAnsi="Inter"/>
                 <w:b w:val="0"/>
                 <w:i w:val="0"/>
                 <w:caps w:val="0"/>
-                <w:color w:val="5F6C68"/>
+                <w:color w:val="6B5E52"/>
                 <w:sz w:val="19"/>
               </w:rPr>
               <w:t>Standardise follow-up at two agreed intervals, capture a simple status for every quote, and make open quotes visible to the responsible person.</w:t>
@@ -2383,7 +2383,7 @@
         <w:tc>
           <w:tcPr>
             <w:tcW w:type="dxa" w:w="720"/>
-            <w:shd w:fill="0B6655"/>
+            <w:shd w:fill="7A4F1E"/>
             <w:tcMar>
               <w:top w:w="120" w:type="dxa"/>
               <w:start w:w="150" w:type="dxa"/>
@@ -2391,7 +2391,7 @@
               <w:end w:w="150" w:type="dxa"/>
             </w:tcMar>
             <w:tcBorders>
-              <w:bottom w:val="single" w:sz="6" w:color="CBD5D1"/>
+              <w:bottom w:val="single" w:sz="6" w:color="DDD5C8"/>
             </w:tcBorders>
             <w:vAlign w:val="center"/>
           </w:tcPr>
@@ -2403,11 +2403,11 @@
             </w:pPr>
             <w:r>
               <w:rPr>
-                <w:rFonts w:ascii="Aptos" w:hAnsi="Aptos"/>
+                <w:rFonts w:ascii="Inter" w:hAnsi="Inter"/>
                 <w:b/>
                 <w:i w:val="0"/>
                 <w:caps w:val="0"/>
-                <w:color w:val="FFFFFF"/>
+                <w:color w:val="F9F6F1"/>
                 <w:sz w:val="28"/>
               </w:rPr>
               <w:t>3</w:t>
@@ -2417,7 +2417,7 @@
         <w:tc>
           <w:tcPr>
             <w:tcW w:type="dxa" w:w="8640"/>
-            <w:shd w:fill="F5F7F6"/>
+            <w:shd w:fill="F2EDE5"/>
             <w:tcMar>
               <w:top w:w="120" w:type="dxa"/>
               <w:start w:w="150" w:type="dxa"/>
@@ -2425,7 +2425,7 @@
               <w:end w:w="150" w:type="dxa"/>
             </w:tcMar>
             <w:tcBorders>
-              <w:bottom w:val="single" w:sz="6" w:color="CBD5D1"/>
+              <w:bottom w:val="single" w:sz="6" w:color="DDD5C8"/>
             </w:tcBorders>
             <w:vAlign w:val="center"/>
           </w:tcPr>
@@ -2436,11 +2436,11 @@
             </w:pPr>
             <w:r>
               <w:rPr>
-                <w:rFonts w:ascii="Aptos" w:hAnsi="Aptos"/>
+                <w:rFonts w:ascii="Inter" w:hAnsi="Inter"/>
                 <w:b/>
                 <w:i w:val="0"/>
                 <w:caps w:val="0"/>
-                <w:color w:val="18211F"/>
+                <w:color w:val="1C1410"/>
                 <w:sz w:val="21"/>
               </w:rPr>
               <w:t>Days 15–21 | Review capture</w:t>
@@ -2453,11 +2453,11 @@
             </w:pPr>
             <w:r>
               <w:rPr>
-                <w:rFonts w:ascii="Aptos" w:hAnsi="Aptos"/>
+                <w:rFonts w:ascii="Inter" w:hAnsi="Inter"/>
                 <w:b w:val="0"/>
                 <w:i w:val="0"/>
                 <w:caps w:val="0"/>
-                <w:color w:val="5F6C68"/>
+                <w:color w:val="6B5E52"/>
                 <w:sz w:val="19"/>
               </w:rPr>
               <w:t>Send a short review request after completed jobs, with a direct link and one reminder when appropriate.</w:t>
@@ -2486,7 +2486,7 @@
         <w:tc>
           <w:tcPr>
             <w:tcW w:type="dxa" w:w="720"/>
-            <w:shd w:fill="0B6655"/>
+            <w:shd w:fill="7A4F1E"/>
             <w:tcMar>
               <w:top w:w="120" w:type="dxa"/>
               <w:start w:w="150" w:type="dxa"/>
@@ -2494,7 +2494,7 @@
               <w:end w:w="150" w:type="dxa"/>
             </w:tcMar>
             <w:tcBorders>
-              <w:bottom w:val="single" w:sz="6" w:color="CBD5D1"/>
+              <w:bottom w:val="single" w:sz="6" w:color="DDD5C8"/>
             </w:tcBorders>
             <w:vAlign w:val="center"/>
           </w:tcPr>
@@ -2506,11 +2506,11 @@
             </w:pPr>
             <w:r>
               <w:rPr>
-                <w:rFonts w:ascii="Aptos" w:hAnsi="Aptos"/>
+                <w:rFonts w:ascii="Inter" w:hAnsi="Inter"/>
                 <w:b/>
                 <w:i w:val="0"/>
                 <w:caps w:val="0"/>
-                <w:color w:val="FFFFFF"/>
+                <w:color w:val="F9F6F1"/>
                 <w:sz w:val="28"/>
               </w:rPr>
               <w:t>4</w:t>
@@ -2520,7 +2520,7 @@
         <w:tc>
           <w:tcPr>
             <w:tcW w:type="dxa" w:w="8640"/>
-            <w:shd w:fill="F5F7F6"/>
+            <w:shd w:fill="F2EDE5"/>
             <w:tcMar>
               <w:top w:w="120" w:type="dxa"/>
               <w:start w:w="150" w:type="dxa"/>
@@ -2528,7 +2528,7 @@
               <w:end w:w="150" w:type="dxa"/>
             </w:tcMar>
             <w:tcBorders>
-              <w:bottom w:val="single" w:sz="6" w:color="CBD5D1"/>
+              <w:bottom w:val="single" w:sz="6" w:color="DDD5C8"/>
             </w:tcBorders>
             <w:vAlign w:val="center"/>
           </w:tcPr>
@@ -2539,11 +2539,11 @@
             </w:pPr>
             <w:r>
               <w:rPr>
-                <w:rFonts w:ascii="Aptos" w:hAnsi="Aptos"/>
+                <w:rFonts w:ascii="Inter" w:hAnsi="Inter"/>
                 <w:b/>
                 <w:i w:val="0"/>
                 <w:caps w:val="0"/>
-                <w:color w:val="18211F"/>
+                <w:color w:val="1C1410"/>
                 <w:sz w:val="21"/>
               </w:rPr>
               <w:t>Days 22–30 | Operating visibility</w:t>
@@ -2556,11 +2556,11 @@
             </w:pPr>
             <w:r>
               <w:rPr>
-                <w:rFonts w:ascii="Aptos" w:hAnsi="Aptos"/>
+                <w:rFonts w:ascii="Inter" w:hAnsi="Inter"/>
                 <w:b w:val="0"/>
                 <w:i w:val="0"/>
                 <w:caps w:val="0"/>
-                <w:color w:val="5F6C68"/>
+                <w:color w:val="6B5E52"/>
                 <w:sz w:val="19"/>
               </w:rPr>
               <w:t>Review the first month of missed calls, quote outcomes and review requests. Keep what works, remove friction, and decide whether deeper automation is justified.</w:t>
@@ -2582,11 +2582,11 @@
       </w:pPr>
       <w:r>
         <w:rPr>
-          <w:rFonts w:ascii="Aptos" w:hAnsi="Aptos"/>
+          <w:rFonts w:ascii="Inter" w:hAnsi="Inter"/>
           <w:b/>
           <w:i w:val="0"/>
           <w:caps w:val="0"/>
-          <w:color w:val="0B6655"/>
+          <w:color w:val="7A4F1E"/>
           <w:sz w:val="27"/>
         </w:rPr>
         <w:t>Measures to track</w:t>
@@ -2610,7 +2610,7 @@
         <w:tc>
           <w:tcPr>
             <w:tcW w:type="dxa" w:w="4680"/>
-            <w:shd w:fill="08483D"/>
+            <w:shd w:fill="1C1410"/>
             <w:tcMar>
               <w:top w:w="120" w:type="dxa"/>
               <w:start w:w="140" w:type="dxa"/>
@@ -2618,7 +2618,7 @@
               <w:end w:w="140" w:type="dxa"/>
             </w:tcMar>
             <w:tcBorders>
-              <w:bottom w:val="single" w:sz="6" w:color="CBD5D1"/>
+              <w:bottom w:val="single" w:sz="6" w:color="DDD5C8"/>
             </w:tcBorders>
           </w:tcPr>
           <w:p>
@@ -2628,11 +2628,11 @@
             </w:pPr>
             <w:r>
               <w:rPr>
-                <w:rFonts w:ascii="Aptos" w:hAnsi="Aptos"/>
+                <w:rFonts w:ascii="Inter" w:hAnsi="Inter"/>
                 <w:b/>
                 <w:i w:val="0"/>
                 <w:caps w:val="0"/>
-                <w:color w:val="FFFFFF"/>
+                <w:color w:val="F9F6F1"/>
                 <w:sz w:val="18"/>
               </w:rPr>
               <w:t>Measure</w:t>
@@ -2642,7 +2642,7 @@
         <w:tc>
           <w:tcPr>
             <w:tcW w:type="dxa" w:w="4680"/>
-            <w:shd w:fill="08483D"/>
+            <w:shd w:fill="1C1410"/>
             <w:tcMar>
               <w:top w:w="120" w:type="dxa"/>
               <w:start w:w="140" w:type="dxa"/>
@@ -2650,7 +2650,7 @@
               <w:end w:w="140" w:type="dxa"/>
             </w:tcMar>
             <w:tcBorders>
-              <w:bottom w:val="single" w:sz="6" w:color="CBD5D1"/>
+              <w:bottom w:val="single" w:sz="6" w:color="DDD5C8"/>
             </w:tcBorders>
           </w:tcPr>
           <w:p>
@@ -2660,11 +2660,11 @@
             </w:pPr>
             <w:r>
               <w:rPr>
-                <w:rFonts w:ascii="Aptos" w:hAnsi="Aptos"/>
+                <w:rFonts w:ascii="Inter" w:hAnsi="Inter"/>
                 <w:b/>
                 <w:i w:val="0"/>
                 <w:caps w:val="0"/>
-                <w:color w:val="FFFFFF"/>
+                <w:color w:val="F9F6F1"/>
                 <w:sz w:val="18"/>
               </w:rPr>
               <w:t>Initial standard</w:t>
@@ -2676,7 +2676,7 @@
         <w:tc>
           <w:tcPr>
             <w:tcW w:type="dxa" w:w="4680"/>
-            <w:shd w:fill="F5F7F6"/>
+            <w:shd w:fill="F2EDE5"/>
             <w:tcMar>
               <w:top w:w="120" w:type="dxa"/>
               <w:start w:w="140" w:type="dxa"/>
@@ -2684,7 +2684,7 @@
               <w:end w:w="140" w:type="dxa"/>
             </w:tcMar>
             <w:tcBorders>
-              <w:bottom w:val="single" w:sz="5" w:color="CBD5D1"/>
+              <w:bottom w:val="single" w:sz="5" w:color="DDD5C8"/>
             </w:tcBorders>
           </w:tcPr>
           <w:p>
@@ -2694,11 +2694,11 @@
             </w:pPr>
             <w:r>
               <w:rPr>
-                <w:rFonts w:ascii="Aptos" w:hAnsi="Aptos"/>
+                <w:rFonts w:ascii="Inter" w:hAnsi="Inter"/>
                 <w:b/>
                 <w:i w:val="0"/>
                 <w:caps w:val="0"/>
-                <w:color w:val="18211F"/>
+                <w:color w:val="1C1410"/>
                 <w:sz w:val="18"/>
               </w:rPr>
               <w:t>Missed calls acknowledged</w:t>
@@ -2708,7 +2708,7 @@
         <w:tc>
           <w:tcPr>
             <w:tcW w:type="dxa" w:w="4680"/>
-            <w:shd w:fill="F5F7F6"/>
+            <w:shd w:fill="F2EDE5"/>
             <w:tcMar>
               <w:top w:w="120" w:type="dxa"/>
               <w:start w:w="140" w:type="dxa"/>
@@ -2716,7 +2716,7 @@
               <w:end w:w="140" w:type="dxa"/>
             </w:tcMar>
             <w:tcBorders>
-              <w:bottom w:val="single" w:sz="5" w:color="CBD5D1"/>
+              <w:bottom w:val="single" w:sz="5" w:color="DDD5C8"/>
             </w:tcBorders>
           </w:tcPr>
           <w:p>
@@ -2726,11 +2726,11 @@
             </w:pPr>
             <w:r>
               <w:rPr>
-                <w:rFonts w:ascii="Aptos" w:hAnsi="Aptos"/>
+                <w:rFonts w:ascii="Inter" w:hAnsi="Inter"/>
                 <w:b w:val="0"/>
                 <w:i w:val="0"/>
                 <w:caps w:val="0"/>
-                <w:color w:val="5F6C68"/>
+                <w:color w:val="6B5E52"/>
                 <w:sz w:val="18"/>
               </w:rPr>
               <w:t>Target: within 1 minute</w:t>
@@ -2742,7 +2742,7 @@
         <w:tc>
           <w:tcPr>
             <w:tcW w:type="dxa" w:w="4680"/>
-            <w:shd w:fill="FFFFFF"/>
+            <w:shd w:fill="F9F6F1"/>
             <w:tcMar>
               <w:top w:w="120" w:type="dxa"/>
               <w:start w:w="140" w:type="dxa"/>
@@ -2750,7 +2750,7 @@
               <w:end w:w="140" w:type="dxa"/>
             </w:tcMar>
             <w:tcBorders>
-              <w:bottom w:val="single" w:sz="5" w:color="CBD5D1"/>
+              <w:bottom w:val="single" w:sz="5" w:color="DDD5C8"/>
             </w:tcBorders>
           </w:tcPr>
           <w:p>
@@ -2760,11 +2760,11 @@
             </w:pPr>
             <w:r>
               <w:rPr>
-                <w:rFonts w:ascii="Aptos" w:hAnsi="Aptos"/>
+                <w:rFonts w:ascii="Inter" w:hAnsi="Inter"/>
                 <w:b/>
                 <w:i w:val="0"/>
                 <w:caps w:val="0"/>
-                <w:color w:val="18211F"/>
+                <w:color w:val="1C1410"/>
                 <w:sz w:val="18"/>
               </w:rPr>
               <w:t>Callback speed</w:t>
@@ -2774,7 +2774,7 @@
         <w:tc>
           <w:tcPr>
             <w:tcW w:type="dxa" w:w="4680"/>
-            <w:shd w:fill="FFFFFF"/>
+            <w:shd w:fill="F9F6F1"/>
             <w:tcMar>
               <w:top w:w="120" w:type="dxa"/>
               <w:start w:w="140" w:type="dxa"/>
@@ -2782,7 +2782,7 @@
               <w:end w:w="140" w:type="dxa"/>
             </w:tcMar>
             <w:tcBorders>
-              <w:bottom w:val="single" w:sz="5" w:color="CBD5D1"/>
+              <w:bottom w:val="single" w:sz="5" w:color="DDD5C8"/>
             </w:tcBorders>
           </w:tcPr>
           <w:p>
@@ -2792,11 +2792,11 @@
             </w:pPr>
             <w:r>
               <w:rPr>
-                <w:rFonts w:ascii="Aptos" w:hAnsi="Aptos"/>
+                <w:rFonts w:ascii="Inter" w:hAnsi="Inter"/>
                 <w:b w:val="0"/>
                 <w:i w:val="0"/>
                 <w:caps w:val="0"/>
-                <w:color w:val="5F6C68"/>
+                <w:color w:val="6B5E52"/>
                 <w:sz w:val="18"/>
               </w:rPr>
               <w:t>Target: within 15 minutes during business hours</w:t>
@@ -2808,7 +2808,7 @@
         <w:tc>
           <w:tcPr>
             <w:tcW w:type="dxa" w:w="4680"/>
-            <w:shd w:fill="F5F7F6"/>
+            <w:shd w:fill="F2EDE5"/>
             <w:tcMar>
               <w:top w:w="120" w:type="dxa"/>
               <w:start w:w="140" w:type="dxa"/>
@@ -2816,7 +2816,7 @@
               <w:end w:w="140" w:type="dxa"/>
             </w:tcMar>
             <w:tcBorders>
-              <w:bottom w:val="single" w:sz="5" w:color="CBD5D1"/>
+              <w:bottom w:val="single" w:sz="5" w:color="DDD5C8"/>
             </w:tcBorders>
           </w:tcPr>
           <w:p>
@@ -2826,11 +2826,11 @@
             </w:pPr>
             <w:r>
               <w:rPr>
-                <w:rFonts w:ascii="Aptos" w:hAnsi="Aptos"/>
+                <w:rFonts w:ascii="Inter" w:hAnsi="Inter"/>
                 <w:b/>
                 <w:i w:val="0"/>
                 <w:caps w:val="0"/>
-                <w:color w:val="18211F"/>
+                <w:color w:val="1C1410"/>
                 <w:sz w:val="18"/>
               </w:rPr>
               <w:t>Quotes followed up</w:t>
@@ -2840,7 +2840,7 @@
         <w:tc>
           <w:tcPr>
             <w:tcW w:type="dxa" w:w="4680"/>
-            <w:shd w:fill="F5F7F6"/>
+            <w:shd w:fill="F2EDE5"/>
             <w:tcMar>
               <w:top w:w="120" w:type="dxa"/>
               <w:start w:w="140" w:type="dxa"/>
@@ -2848,7 +2848,7 @@
               <w:end w:w="140" w:type="dxa"/>
             </w:tcMar>
             <w:tcBorders>
-              <w:bottom w:val="single" w:sz="5" w:color="CBD5D1"/>
+              <w:bottom w:val="single" w:sz="5" w:color="DDD5C8"/>
             </w:tcBorders>
           </w:tcPr>
           <w:p>
@@ -2858,11 +2858,11 @@
             </w:pPr>
             <w:r>
               <w:rPr>
-                <w:rFonts w:ascii="Aptos" w:hAnsi="Aptos"/>
+                <w:rFonts w:ascii="Inter" w:hAnsi="Inter"/>
                 <w:b w:val="0"/>
                 <w:i w:val="0"/>
                 <w:caps w:val="0"/>
-                <w:color w:val="5F6C68"/>
+                <w:color w:val="6B5E52"/>
                 <w:sz w:val="18"/>
               </w:rPr>
               <w:t>Target: 100% receive the agreed sequence</w:t>
@@ -2874,7 +2874,7 @@
         <w:tc>
           <w:tcPr>
             <w:tcW w:type="dxa" w:w="4680"/>
-            <w:shd w:fill="FFFFFF"/>
+            <w:shd w:fill="F9F6F1"/>
             <w:tcMar>
               <w:top w:w="120" w:type="dxa"/>
               <w:start w:w="140" w:type="dxa"/>
@@ -2882,7 +2882,7 @@
               <w:end w:w="140" w:type="dxa"/>
             </w:tcMar>
             <w:tcBorders>
-              <w:bottom w:val="single" w:sz="5" w:color="CBD5D1"/>
+              <w:bottom w:val="single" w:sz="5" w:color="DDD5C8"/>
             </w:tcBorders>
           </w:tcPr>
           <w:p>
@@ -2892,11 +2892,11 @@
             </w:pPr>
             <w:r>
               <w:rPr>
-                <w:rFonts w:ascii="Aptos" w:hAnsi="Aptos"/>
+                <w:rFonts w:ascii="Inter" w:hAnsi="Inter"/>
                 <w:b/>
                 <w:i w:val="0"/>
                 <w:caps w:val="0"/>
-                <w:color w:val="18211F"/>
+                <w:color w:val="1C1410"/>
                 <w:sz w:val="18"/>
               </w:rPr>
               <w:t>Quote outcomes recorded</w:t>
@@ -2906,7 +2906,7 @@
         <w:tc>
           <w:tcPr>
             <w:tcW w:type="dxa" w:w="4680"/>
-            <w:shd w:fill="FFFFFF"/>
+            <w:shd w:fill="F9F6F1"/>
             <w:tcMar>
               <w:top w:w="120" w:type="dxa"/>
               <w:start w:w="140" w:type="dxa"/>
@@ -2914,7 +2914,7 @@
               <w:end w:w="140" w:type="dxa"/>
             </w:tcMar>
             <w:tcBorders>
-              <w:bottom w:val="single" w:sz="5" w:color="CBD5D1"/>
+              <w:bottom w:val="single" w:sz="5" w:color="DDD5C8"/>
             </w:tcBorders>
           </w:tcPr>
           <w:p>
@@ -2924,11 +2924,11 @@
             </w:pPr>
             <w:r>
               <w:rPr>
-                <w:rFonts w:ascii="Aptos" w:hAnsi="Aptos"/>
+                <w:rFonts w:ascii="Inter" w:hAnsi="Inter"/>
                 <w:b w:val="0"/>
                 <w:i w:val="0"/>
                 <w:caps w:val="0"/>
-                <w:color w:val="5F6C68"/>
+                <w:color w:val="6B5E52"/>
                 <w:sz w:val="18"/>
               </w:rPr>
               <w:t>Target: won, lost or pending</w:t>
@@ -2940,7 +2940,7 @@
         <w:tc>
           <w:tcPr>
             <w:tcW w:type="dxa" w:w="4680"/>
-            <w:shd w:fill="F5F7F6"/>
+            <w:shd w:fill="F2EDE5"/>
             <w:tcMar>
               <w:top w:w="120" w:type="dxa"/>
               <w:start w:w="140" w:type="dxa"/>
@@ -2948,7 +2948,7 @@
               <w:end w:w="140" w:type="dxa"/>
             </w:tcMar>
             <w:tcBorders>
-              <w:bottom w:val="single" w:sz="5" w:color="CBD5D1"/>
+              <w:bottom w:val="single" w:sz="5" w:color="DDD5C8"/>
             </w:tcBorders>
           </w:tcPr>
           <w:p>
@@ -2958,11 +2958,11 @@
             </w:pPr>
             <w:r>
               <w:rPr>
-                <w:rFonts w:ascii="Aptos" w:hAnsi="Aptos"/>
+                <w:rFonts w:ascii="Inter" w:hAnsi="Inter"/>
                 <w:b/>
                 <w:i w:val="0"/>
                 <w:caps w:val="0"/>
-                <w:color w:val="18211F"/>
+                <w:color w:val="1C1410"/>
                 <w:sz w:val="18"/>
               </w:rPr>
               <w:t>Review requests sent</w:t>
@@ -2972,7 +2972,7 @@
         <w:tc>
           <w:tcPr>
             <w:tcW w:type="dxa" w:w="4680"/>
-            <w:shd w:fill="F5F7F6"/>
+            <w:shd w:fill="F2EDE5"/>
             <w:tcMar>
               <w:top w:w="120" w:type="dxa"/>
               <w:start w:w="140" w:type="dxa"/>
@@ -2980,7 +2980,7 @@
               <w:end w:w="140" w:type="dxa"/>
             </w:tcMar>
             <w:tcBorders>
-              <w:bottom w:val="single" w:sz="5" w:color="CBD5D1"/>
+              <w:bottom w:val="single" w:sz="5" w:color="DDD5C8"/>
             </w:tcBorders>
           </w:tcPr>
           <w:p>
@@ -2990,11 +2990,11 @@
             </w:pPr>
             <w:r>
               <w:rPr>
-                <w:rFonts w:ascii="Aptos" w:hAnsi="Aptos"/>
+                <w:rFonts w:ascii="Inter" w:hAnsi="Inter"/>
                 <w:b w:val="0"/>
                 <w:i w:val="0"/>
                 <w:caps w:val="0"/>
-                <w:color w:val="5F6C68"/>
+                <w:color w:val="6B5E52"/>
                 <w:sz w:val="18"/>
               </w:rPr>
               <w:t>Target: every eligible completed job</w:t>
@@ -3016,11 +3016,11 @@
       </w:pPr>
       <w:r>
         <w:rPr>
-          <w:rFonts w:ascii="Aptos" w:hAnsi="Aptos"/>
+          <w:rFonts w:ascii="Inter" w:hAnsi="Inter"/>
           <w:b/>
           <w:i w:val="0"/>
           <w:caps/>
-          <w:color w:val="0B6655"/>
+          <w:color w:val="7A4F1E"/>
           <w:sz w:val="17"/>
         </w:rPr>
         <w:t>05 | RECOMMENDED NEXT STEP</w:t>
@@ -3034,11 +3034,11 @@
       </w:pPr>
       <w:r>
         <w:rPr>
-          <w:rFonts w:ascii="Aptos" w:hAnsi="Aptos"/>
+          <w:rFonts w:ascii="Inter" w:hAnsi="Inter"/>
           <w:b/>
           <w:i w:val="0"/>
           <w:caps w:val="0"/>
-          <w:color w:val="08483D"/>
+          <w:color w:val="1C1410"/>
           <w:sz w:val="36"/>
         </w:rPr>
         <w:t>Implement one contained commercial workflow and measure the result</w:t>
@@ -3052,11 +3052,11 @@
       </w:pPr>
       <w:r>
         <w:rPr>
-          <w:rFonts w:ascii="Aptos" w:hAnsi="Aptos"/>
+          <w:rFonts w:ascii="Inter" w:hAnsi="Inter"/>
           <w:b w:val="0"/>
           <w:i w:val="0"/>
           <w:caps w:val="0"/>
-          <w:color w:val="18211F"/>
+          <w:color w:val="1C1410"/>
           <w:sz w:val="21"/>
         </w:rPr>
         <w:t>The recommended first engagement is a focused follow-up sprint: missed-call recovery, quote follow-up and review capture. It should improve the handling of existing demand without requiring a full CRM replacement or a broad transformation program.</w:t>
@@ -3076,7 +3076,7 @@
         <w:tc>
           <w:tcPr>
             <w:tcW w:type="dxa" w:w="9360"/>
-            <w:shd w:fill="E8F2EF"/>
+            <w:shd w:fill="FDF4E7"/>
             <w:tcMar>
               <w:top w:w="200" w:type="dxa"/>
               <w:start w:w="220" w:type="dxa"/>
@@ -3084,7 +3084,7 @@
               <w:end w:w="220" w:type="dxa"/>
             </w:tcMar>
             <w:tcBorders>
-              <w:left w:val="single" w:sz="24" w:color="0B6655"/>
+              <w:left w:val="single" w:sz="24" w:color="7A4F1E"/>
             </w:tcBorders>
           </w:tcPr>
           <w:p>
@@ -3094,11 +3094,11 @@
             </w:pPr>
             <w:r>
               <w:rPr>
-                <w:rFonts w:ascii="Aptos" w:hAnsi="Aptos"/>
+                <w:rFonts w:ascii="Inter" w:hAnsi="Inter"/>
                 <w:b/>
                 <w:i w:val="0"/>
                 <w:caps/>
-                <w:color w:val="0B6655"/>
+                <w:color w:val="7A4F1E"/>
                 <w:sz w:val="16"/>
               </w:rPr>
               <w:t>IMPLEMENTATION PRINCIPLE</w:t>
@@ -3111,11 +3111,11 @@
             </w:pPr>
             <w:r>
               <w:rPr>
-                <w:rFonts w:ascii="Aptos" w:hAnsi="Aptos"/>
+                <w:rFonts w:ascii="Inter" w:hAnsi="Inter"/>
                 <w:b/>
                 <w:i w:val="0"/>
                 <w:caps w:val="0"/>
-                <w:color w:val="18211F"/>
+                <w:color w:val="1C1410"/>
                 <w:sz w:val="28"/>
               </w:rPr>
               <w:t>Automate the hand-off, not the relationship.</w:t>
@@ -3128,11 +3128,11 @@
             </w:pPr>
             <w:r>
               <w:rPr>
-                <w:rFonts w:ascii="Aptos" w:hAnsi="Aptos"/>
+                <w:rFonts w:ascii="Inter" w:hAnsi="Inter"/>
                 <w:b w:val="0"/>
                 <w:i w:val="0"/>
                 <w:caps w:val="0"/>
-                <w:color w:val="5F6C68"/>
+                <w:color w:val="6B5E52"/>
                 <w:sz w:val="20"/>
               </w:rPr>
               <w:t>Customers should still experience a capable local electrical business. Automation should make acknowledgement, reminders and visibility more reliable while people remain responsible for judgement and customer conversations.</w:t>
@@ -3149,11 +3149,11 @@
       </w:pPr>
       <w:r>
         <w:rPr>
-          <w:rFonts w:ascii="Aptos" w:hAnsi="Aptos"/>
+          <w:rFonts w:ascii="Inter" w:hAnsi="Inter"/>
           <w:b/>
           <w:i w:val="0"/>
           <w:caps w:val="0"/>
-          <w:color w:val="0B6655"/>
+          <w:color w:val="7A4F1E"/>
           <w:sz w:val="27"/>
         </w:rPr>
         <w:t>How this audit was prepared</w:t>
@@ -3167,11 +3167,11 @@
       </w:pPr>
       <w:r>
         <w:rPr>
-          <w:rFonts w:ascii="Aptos" w:hAnsi="Aptos"/>
+          <w:rFonts w:ascii="Inter" w:hAnsi="Inter"/>
           <w:b w:val="0"/>
           <w:i w:val="0"/>
           <w:caps w:val="0"/>
-          <w:color w:val="18211F"/>
+          <w:color w:val="1C1410"/>
           <w:sz w:val="21"/>
         </w:rPr>
         <w:t>This report is based on the discovery assessment provided by the business. Findings are limited to the evidence captured during that assessment and are prioritised by likely commercial impact, urgency, implementation effort and speed to visible improvement.</w:t>
@@ -3185,11 +3185,11 @@
       </w:pPr>
       <w:r>
         <w:rPr>
-          <w:rFonts w:ascii="Aptos" w:hAnsi="Aptos"/>
+          <w:rFonts w:ascii="Inter" w:hAnsi="Inter"/>
           <w:b/>
           <w:i w:val="0"/>
           <w:caps w:val="0"/>
-          <w:color w:val="0B6655"/>
+          <w:color w:val="7A4F1E"/>
           <w:sz w:val="27"/>
         </w:rPr>
         <w:t>Important note</w:t>
@@ -3203,11 +3203,11 @@
       </w:pPr>
       <w:r>
         <w:rPr>
-          <w:rFonts w:ascii="Aptos" w:hAnsi="Aptos"/>
+          <w:rFonts w:ascii="Inter" w:hAnsi="Inter"/>
           <w:b w:val="0"/>
           <w:i/>
           <w:caps w:val="0"/>
-          <w:color w:val="5F6C68"/>
+          <w:color w:val="6B5E52"/>
           <w:sz w:val="21"/>
         </w:rPr>
         <w:t>The score is a decision aid, not a financial forecast. Any implementation should be confirmed against the business’s actual call volumes, quote data, software configuration and operating constraints.</w:t>
@@ -3218,7 +3218,7 @@
         <w:keepNext w:val="0"/>
         <w:spacing w:before="0" w:after="240" w:line="240" w:lineRule="auto"/>
         <w:pBdr>
-          <w:bottom w:val="single" w:sz="6" w:space="1" w:color="CBD5D1"/>
+          <w:bottom w:val="single" w:sz="6" w:space="1" w:color="DDD5C8"/>
         </w:pBdr>
       </w:pPr>
     </w:p>
@@ -3230,11 +3230,11 @@
       </w:pPr>
       <w:r>
         <w:rPr>
-          <w:rFonts w:ascii="Aptos" w:hAnsi="Aptos"/>
+          <w:rFonts w:ascii="Inter" w:hAnsi="Inter"/>
           <w:b/>
           <w:i w:val="0"/>
           <w:caps w:val="0"/>
-          <w:color w:val="08483D"/>
+          <w:color w:val="1C1410"/>
           <w:sz w:val="26"/>
         </w:rPr>
         <w:t>AI Business Audit</w:t>
@@ -3248,11 +3248,11 @@
       </w:pPr>
       <w:r>
         <w:rPr>
-          <w:rFonts w:ascii="Aptos" w:hAnsi="Aptos"/>
+          <w:rFonts w:ascii="Inter" w:hAnsi="Inter"/>
           <w:b w:val="0"/>
           <w:i w:val="0"/>
           <w:caps w:val="0"/>
-          <w:color w:val="5F6C68"/>
+          <w:color w:val="6B5E52"/>
           <w:sz w:val="20"/>
         </w:rPr>
         <w:t>Find the revenue leaks. Fix the highest-impact workflow first.</w:t>
@@ -3266,11 +3266,11 @@
       </w:pPr>
       <w:r>
         <w:rPr>
-          <w:rFonts w:ascii="Aptos" w:hAnsi="Aptos"/>
+          <w:rFonts w:ascii="Inter" w:hAnsi="Inter"/>
           <w:b w:val="0"/>
           <w:i/>
           <w:caps w:val="0"/>
-          <w:color w:val="5F6C68"/>
+          <w:color w:val="6B5E52"/>
           <w:sz w:val="18"/>
         </w:rPr>
         <w:t>Prepared for discussion with Hugh.</w:t>
@@ -3317,7 +3317,7 @@
             <w:end w:w="0" w:type="dxa"/>
           </w:tcMar>
           <w:tcBorders>
-            <w:top w:val="single" w:sz="5" w:color="CBD5D1"/>
+            <w:top w:val="single" w:sz="5" w:color="DDD5C8"/>
           </w:tcBorders>
         </w:tcPr>
         <w:p>
@@ -3327,11 +3327,11 @@
           </w:pPr>
           <w:r>
             <w:rPr>
-              <w:rFonts w:ascii="Aptos" w:hAnsi="Aptos"/>
+              <w:rFonts w:ascii="Inter" w:hAnsi="Inter"/>
               <w:b w:val="0"/>
               <w:i w:val="0"/>
               <w:caps w:val="0"/>
-              <w:color w:val="5F6C68"/>
+              <w:color w:val="6B5E52"/>
               <w:sz w:val="15"/>
             </w:rPr>
             <w:t>Confidential | Prepared for BrightSpark Electrical</w:t>
@@ -3348,7 +3348,7 @@
             <w:end w:w="0" w:type="dxa"/>
           </w:tcMar>
           <w:tcBorders>
-            <w:top w:val="single" w:sz="5" w:color="CBD5D1"/>
+            <w:top w:val="single" w:sz="5" w:color="DDD5C8"/>
           </w:tcBorders>
         </w:tcPr>
         <w:p>
@@ -3359,11 +3359,11 @@
           </w:pPr>
           <w:r>
             <w:rPr>
-              <w:rFonts w:ascii="Aptos" w:hAnsi="Aptos"/>
+              <w:rFonts w:ascii="Inter" w:hAnsi="Inter"/>
               <w:b w:val="0"/>
               <w:i w:val="0"/>
               <w:caps w:val="0"/>
-              <w:color w:val="5F6C68"/>
+              <w:color w:val="6B5E52"/>
               <w:sz w:val="15"/>
             </w:rPr>
             <w:t>Design prototype | June 2026</w:t>
@@ -3386,11 +3386,11 @@
     </w:pPr>
     <w:r>
       <w:rPr>
-        <w:rFonts w:ascii="Aptos" w:hAnsi="Aptos"/>
+        <w:rFonts w:ascii="Inter" w:hAnsi="Inter"/>
         <w:b/>
         <w:i w:val="0"/>
         <w:caps/>
-        <w:color w:val="0B6655"/>
+        <w:color w:val="7A4F1E"/>
         <w:sz w:val="16"/>
       </w:rPr>
       <w:t>AI BUSINESS AUDIT</w:t>
@@ -3766,8 +3766,8 @@
       <w:spacing w:after="160" w:line="293" w:lineRule="auto"/>
     </w:pPr>
     <w:rPr>
-      <w:rFonts w:ascii="Aptos" w:hAnsi="Aptos"/>
-      <w:color w:val="18211F"/>
+      <w:rFonts w:ascii="Inter" w:hAnsi="Inter"/>
+      <w:color w:val="1C1410"/>
       <w:sz w:val="21"/>
     </w:rPr>
   </w:style>
@@ -3830,10 +3830,10 @@
       <w:outlineLvl w:val="0"/>
     </w:pPr>
     <w:rPr>
-      <w:rFonts w:asciiTheme="majorHAnsi" w:eastAsiaTheme="majorEastAsia" w:hAnsiTheme="majorHAnsi" w:cstheme="majorBidi" w:ascii="Aptos" w:hAnsi="Aptos"/>
+      <w:rFonts w:asciiTheme="majorHAnsi" w:eastAsiaTheme="majorEastAsia" w:hAnsiTheme="majorHAnsi" w:cstheme="majorBidi" w:ascii="Inter" w:hAnsi="Inter"/>
       <w:b/>
       <w:bCs/>
-      <w:color w:val="08483D"/>
+      <w:color w:val="1C1410"/>
       <w:sz w:val="36"/>
       <w:szCs w:val="28"/>
     </w:rPr>
@@ -3854,11 +3854,11 @@
       <w:outlineLvl w:val="1"/>
     </w:pPr>
     <w:rPr>
-      <w:rFonts w:asciiTheme="majorHAnsi" w:eastAsiaTheme="majorEastAsia" w:hAnsiTheme="majorHAnsi" w:cstheme="majorBidi" w:ascii="Aptos" w:hAnsi="Aptos"/>
+      <w:rFonts w:asciiTheme="majorHAnsi" w:eastAsiaTheme="majorEastAsia" w:hAnsiTheme="majorHAnsi" w:cstheme="majorBidi" w:ascii="Inter" w:hAnsi="Inter"/>
       <w:b/>
       <w:bCs/>
-      <w:color w:val="0B6655"/>
-      <w:sz w:val="27"/>
+      <w:color w:val="7A4F1E"/>
+      <w:sz w:val="30"/>
       <w:szCs w:val="26"/>
     </w:rPr>
   </w:style>
@@ -3878,11 +3878,11 @@
       <w:outlineLvl w:val="2"/>
     </w:pPr>
     <w:rPr>
-      <w:rFonts w:asciiTheme="majorHAnsi" w:eastAsiaTheme="majorEastAsia" w:hAnsiTheme="majorHAnsi" w:cstheme="majorBidi" w:ascii="Aptos" w:hAnsi="Aptos"/>
+      <w:rFonts w:asciiTheme="majorHAnsi" w:eastAsiaTheme="majorEastAsia" w:hAnsiTheme="majorHAnsi" w:cstheme="majorBidi" w:ascii="Inter" w:hAnsi="Inter"/>
       <w:b/>
       <w:bCs/>
-      <w:color w:val="18211F"/>
-      <w:sz w:val="23"/>
+      <w:color w:val="1C1410"/>
+      <w:sz w:val="24"/>
     </w:rPr>
   </w:style>
   <w:style w:type="paragraph" w:styleId="Heading4">
@@ -4303,7 +4303,7 @@
       <w:contextualSpacing/>
     </w:pPr>
     <w:rPr>
-      <w:rFonts w:ascii="Aptos" w:hAnsi="Aptos"/>
+      <w:rFonts w:ascii="Inter" w:hAnsi="Inter"/>
       <w:sz w:val="20"/>
     </w:rPr>
   </w:style>

</xml_diff>